<commit_message>
Table 2: lead with main IRR; tie k/I2/Q p to the sensitivity pool only
Reorder so the primary column is the main-analysis IRR (one representative
per registry family), followed by the sensitivity pooled IRR, then No. of
estimates / Model / I2 / Q p — which are explicitly properties of the
all-included sensitivity pool, not of the single-representative main
analysis. Clarifies that k counts overlapping (non-independent) registry
estimates, so the high I2 / small Q p is a non-independence artifact.

Co-Authored-By: Claude Opus 4.8 <noreply@anthropic.com>
Claude-Session: https://claude.ai/code/session_01CuLT4FKRBtsU22Vwfjj2qn
</commit_message>
<xml_diff>
--- a/meta_agents/search_v2/outputs/Main_Text_Tables_Figures.docx
+++ b/meta_agents/search_v2/outputs/Main_Text_Tables_Figures.docx
@@ -5780,7 +5780,7 @@
           <w:sz w:val="18"/>
           <w:szCs w:val="18"/>
         </w:rPr>
-        <w:t xml:space="preserve">Random-effects meta-analysis (Paule-Mandel/REML τ² with Hartung-Knapp-Sidik-Jonkman confidence interval); no fixed-effect model was used. k = number of estimates pooled in the all-included (sensitivity) analysis; I² and Cochran's Q p-value describe that pool. The main analysis uses one estimate per registry family to remove non-independence; the very high I² reflects overlapping registry data rather than genuine between-study heterogeneity (see Supplementary Table 8 and the GRADE framework).</w:t>
+        <w:t xml:space="preserve">Primary result = the main-analysis IRR, a single representative estimate per registry family (no pooling, so no k / I² / heterogeneity test apply to it). The sensitivity analysis pools every overlapping registry estimate for the cell with a random-effects model (Paule-Mandel/REML τ², Hartung-Knapp-Sidik-Jonkman CI); the No. of estimates, I², and Cochran's Q p-value below describe THAT pool. Because those estimates repeatedly include the same nested registries (SEER ⊂ NAACCR ⊂ USCS), they are not independent — hence the very high I² / small Q p is a non-independence artifact, not genuine between-study heterogeneity (Supplementary Table 8; GRADE framework, Table 6). Concordance of the two columns indicates the direction is robust.</w:t>
       </w:r>
     </w:p>
     <w:tbl>
@@ -5796,13 +5796,13 @@
         </w:tblBorders>
       </w:tblPr>
       <w:tblGrid>
-        <w:gridCol w:w="3654"/>
-        <w:gridCol w:w="752"/>
-        <w:gridCol w:w="2042"/>
-        <w:gridCol w:w="2901"/>
-        <w:gridCol w:w="860"/>
-        <w:gridCol w:w="1075"/>
-        <w:gridCol w:w="3116"/>
+        <w:gridCol w:w="3423"/>
+        <w:gridCol w:w="2951"/>
+        <w:gridCol w:w="2951"/>
+        <w:gridCol w:w="1416"/>
+        <w:gridCol w:w="1770"/>
+        <w:gridCol w:w="826"/>
+        <w:gridCol w:w="1062"/>
       </w:tblGrid>
       <w:tr>
         <w:trPr>
@@ -5810,7 +5810,7 @@
         </w:trPr>
         <w:tc>
           <w:tcPr>
-            <w:tcW w:type="dxa" w:w="3654"/>
+            <w:tcW w:type="dxa" w:w="3423"/>
             <w:shd w:fill="E7EEF6" w:color="auto" w:val="clear"/>
             <w:tcMar>
               <w:top w:type="dxa" w:w="25"/>
@@ -5834,7 +5834,7 @@
         </w:tc>
         <w:tc>
           <w:tcPr>
-            <w:tcW w:type="dxa" w:w="752"/>
+            <w:tcW w:type="dxa" w:w="2951"/>
             <w:shd w:fill="E7EEF6" w:color="auto" w:val="clear"/>
             <w:tcMar>
               <w:top w:type="dxa" w:w="25"/>
@@ -5852,13 +5852,14 @@
                 <w:sz w:val="15"/>
                 <w:szCs w:val="15"/>
               </w:rPr>
-              <w:t xml:space="preserve">k</w:t>
-            </w:r>
-          </w:p>
-        </w:tc>
-        <w:tc>
-          <w:tcPr>
-            <w:tcW w:type="dxa" w:w="2042"/>
+              <w:t xml:space="preserve">Main IRR (95% CI)
+[primary, one-per-family]</w:t>
+            </w:r>
+          </w:p>
+        </w:tc>
+        <w:tc>
+          <w:tcPr>
+            <w:tcW w:type="dxa" w:w="2951"/>
             <w:shd w:fill="E7EEF6" w:color="auto" w:val="clear"/>
             <w:tcMar>
               <w:top w:type="dxa" w:w="25"/>
@@ -5876,13 +5877,14 @@
                 <w:sz w:val="15"/>
                 <w:szCs w:val="15"/>
               </w:rPr>
-              <w:t xml:space="preserve">Model</w:t>
-            </w:r>
-          </w:p>
-        </w:tc>
-        <w:tc>
-          <w:tcPr>
-            <w:tcW w:type="dxa" w:w="2901"/>
+              <w:t xml:space="preserve">Sensitivity IRR (95% CI)
+[all overlapping]</w:t>
+            </w:r>
+          </w:p>
+        </w:tc>
+        <w:tc>
+          <w:tcPr>
+            <w:tcW w:type="dxa" w:w="1416"/>
             <w:shd w:fill="E7EEF6" w:color="auto" w:val="clear"/>
             <w:tcMar>
               <w:top w:type="dxa" w:w="25"/>
@@ -5900,13 +5902,13 @@
                 <w:sz w:val="15"/>
                 <w:szCs w:val="15"/>
               </w:rPr>
-              <w:t xml:space="preserve">Pooled IRR (95% CI)</w:t>
-            </w:r>
-          </w:p>
-        </w:tc>
-        <w:tc>
-          <w:tcPr>
-            <w:tcW w:type="dxa" w:w="860"/>
+              <w:t xml:space="preserve">No. of estimates</w:t>
+            </w:r>
+          </w:p>
+        </w:tc>
+        <w:tc>
+          <w:tcPr>
+            <w:tcW w:type="dxa" w:w="1770"/>
             <w:shd w:fill="E7EEF6" w:color="auto" w:val="clear"/>
             <w:tcMar>
               <w:top w:type="dxa" w:w="25"/>
@@ -5924,13 +5926,13 @@
                 <w:sz w:val="15"/>
                 <w:szCs w:val="15"/>
               </w:rPr>
-              <w:t xml:space="preserve">I²</w:t>
-            </w:r>
-          </w:p>
-        </w:tc>
-        <w:tc>
-          <w:tcPr>
-            <w:tcW w:type="dxa" w:w="1075"/>
+              <w:t xml:space="preserve">Model</w:t>
+            </w:r>
+          </w:p>
+        </w:tc>
+        <w:tc>
+          <w:tcPr>
+            <w:tcW w:type="dxa" w:w="826"/>
             <w:shd w:fill="E7EEF6" w:color="auto" w:val="clear"/>
             <w:tcMar>
               <w:top w:type="dxa" w:w="25"/>
@@ -5948,13 +5950,13 @@
                 <w:sz w:val="15"/>
                 <w:szCs w:val="15"/>
               </w:rPr>
-              <w:t xml:space="preserve">Q p</w:t>
-            </w:r>
-          </w:p>
-        </w:tc>
-        <w:tc>
-          <w:tcPr>
-            <w:tcW w:type="dxa" w:w="3116"/>
+              <w:t xml:space="preserve">I²</w:t>
+            </w:r>
+          </w:p>
+        </w:tc>
+        <w:tc>
+          <w:tcPr>
+            <w:tcW w:type="dxa" w:w="1062"/>
             <w:shd w:fill="E7EEF6" w:color="auto" w:val="clear"/>
             <w:tcMar>
               <w:top w:type="dxa" w:w="25"/>
@@ -5972,7 +5974,7 @@
                 <w:sz w:val="15"/>
                 <w:szCs w:val="15"/>
               </w:rPr>
-              <w:t xml:space="preserve">Main IRR (one-per-family)</w:t>
+              <w:t xml:space="preserve">Q p</w:t>
             </w:r>
           </w:p>
         </w:tc>
@@ -5980,7 +5982,7 @@
       <w:tr>
         <w:tc>
           <w:tcPr>
-            <w:tcW w:type="dxa" w:w="3654"/>
+            <w:tcW w:type="dxa" w:w="3423"/>
             <w:tcMar>
               <w:top w:type="dxa" w:w="25"/>
               <w:left w:type="dxa" w:w="70"/>
@@ -6003,7 +6005,53 @@
         </w:tc>
         <w:tc>
           <w:tcPr>
-            <w:tcW w:type="dxa" w:w="752"/>
+            <w:tcW w:type="dxa" w:w="2951"/>
+            <w:tcMar>
+              <w:top w:type="dxa" w:w="25"/>
+              <w:left w:type="dxa" w:w="70"/>
+              <w:bottom w:type="dxa" w:w="25"/>
+              <w:right w:type="dxa" w:w="70"/>
+            </w:tcMar>
+          </w:tcPr>
+          <w:p>
+            <w:r>
+              <w:rPr>
+                <w:rFonts w:ascii="Malgun Gothic" w:cs="Malgun Gothic" w:eastAsia="Malgun Gothic" w:hAnsi="Malgun Gothic"/>
+                <w:b w:val="false"/>
+                <w:bCs w:val="false"/>
+                <w:sz w:val="15"/>
+                <w:szCs w:val="15"/>
+              </w:rPr>
+              <w:t xml:space="preserve">0.933 (0.92-0.946)</w:t>
+            </w:r>
+          </w:p>
+        </w:tc>
+        <w:tc>
+          <w:tcPr>
+            <w:tcW w:type="dxa" w:w="2951"/>
+            <w:tcMar>
+              <w:top w:type="dxa" w:w="25"/>
+              <w:left w:type="dxa" w:w="70"/>
+              <w:bottom w:type="dxa" w:w="25"/>
+              <w:right w:type="dxa" w:w="70"/>
+            </w:tcMar>
+          </w:tcPr>
+          <w:p>
+            <w:r>
+              <w:rPr>
+                <w:rFonts w:ascii="Malgun Gothic" w:cs="Malgun Gothic" w:eastAsia="Malgun Gothic" w:hAnsi="Malgun Gothic"/>
+                <w:b w:val="false"/>
+                <w:bCs w:val="false"/>
+                <w:sz w:val="15"/>
+                <w:szCs w:val="15"/>
+              </w:rPr>
+              <w:t xml:space="preserve">0.951 (0.936-0.965)</w:t>
+            </w:r>
+          </w:p>
+        </w:tc>
+        <w:tc>
+          <w:tcPr>
+            <w:tcW w:type="dxa" w:w="1416"/>
             <w:tcMar>
               <w:top w:type="dxa" w:w="25"/>
               <w:left w:type="dxa" w:w="70"/>
@@ -6026,7 +6074,7 @@
         </w:tc>
         <w:tc>
           <w:tcPr>
-            <w:tcW w:type="dxa" w:w="2042"/>
+            <w:tcW w:type="dxa" w:w="1770"/>
             <w:tcMar>
               <w:top w:type="dxa" w:w="25"/>
               <w:left w:type="dxa" w:w="70"/>
@@ -6049,30 +6097,7 @@
         </w:tc>
         <w:tc>
           <w:tcPr>
-            <w:tcW w:type="dxa" w:w="2901"/>
-            <w:tcMar>
-              <w:top w:type="dxa" w:w="25"/>
-              <w:left w:type="dxa" w:w="70"/>
-              <w:bottom w:type="dxa" w:w="25"/>
-              <w:right w:type="dxa" w:w="70"/>
-            </w:tcMar>
-          </w:tcPr>
-          <w:p>
-            <w:r>
-              <w:rPr>
-                <w:rFonts w:ascii="Malgun Gothic" w:cs="Malgun Gothic" w:eastAsia="Malgun Gothic" w:hAnsi="Malgun Gothic"/>
-                <w:b w:val="false"/>
-                <w:bCs w:val="false"/>
-                <w:sz w:val="15"/>
-                <w:szCs w:val="15"/>
-              </w:rPr>
-              <w:t xml:space="preserve">0.951 (0.936-0.965)</w:t>
-            </w:r>
-          </w:p>
-        </w:tc>
-        <w:tc>
-          <w:tcPr>
-            <w:tcW w:type="dxa" w:w="860"/>
+            <w:tcW w:type="dxa" w:w="826"/>
             <w:tcMar>
               <w:top w:type="dxa" w:w="25"/>
               <w:left w:type="dxa" w:w="70"/>
@@ -6095,7 +6120,7 @@
         </w:tc>
         <w:tc>
           <w:tcPr>
-            <w:tcW w:type="dxa" w:w="1075"/>
+            <w:tcW w:type="dxa" w:w="1062"/>
             <w:tcMar>
               <w:top w:type="dxa" w:w="25"/>
               <w:left w:type="dxa" w:w="70"/>
@@ -6113,29 +6138,6 @@
                 <w:szCs w:val="15"/>
               </w:rPr>
               <w:t xml:space="preserve">&lt;0.001</w:t>
-            </w:r>
-          </w:p>
-        </w:tc>
-        <w:tc>
-          <w:tcPr>
-            <w:tcW w:type="dxa" w:w="3116"/>
-            <w:tcMar>
-              <w:top w:type="dxa" w:w="25"/>
-              <w:left w:type="dxa" w:w="70"/>
-              <w:bottom w:type="dxa" w:w="25"/>
-              <w:right w:type="dxa" w:w="70"/>
-            </w:tcMar>
-          </w:tcPr>
-          <w:p>
-            <w:r>
-              <w:rPr>
-                <w:rFonts w:ascii="Malgun Gothic" w:cs="Malgun Gothic" w:eastAsia="Malgun Gothic" w:hAnsi="Malgun Gothic"/>
-                <w:b w:val="false"/>
-                <w:bCs w:val="false"/>
-                <w:sz w:val="15"/>
-                <w:szCs w:val="15"/>
-              </w:rPr>
-              <w:t xml:space="preserve">0.933 (0.92-0.946)</w:t>
             </w:r>
           </w:p>
         </w:tc>
@@ -6143,7 +6145,7 @@
       <w:tr>
         <w:tc>
           <w:tcPr>
-            <w:tcW w:type="dxa" w:w="3654"/>
+            <w:tcW w:type="dxa" w:w="3423"/>
             <w:tcMar>
               <w:top w:type="dxa" w:w="25"/>
               <w:left w:type="dxa" w:w="70"/>
@@ -6166,7 +6168,53 @@
         </w:tc>
         <w:tc>
           <w:tcPr>
-            <w:tcW w:type="dxa" w:w="752"/>
+            <w:tcW w:type="dxa" w:w="2951"/>
+            <w:tcMar>
+              <w:top w:type="dxa" w:w="25"/>
+              <w:left w:type="dxa" w:w="70"/>
+              <w:bottom w:type="dxa" w:w="25"/>
+              <w:right w:type="dxa" w:w="70"/>
+            </w:tcMar>
+          </w:tcPr>
+          <w:p>
+            <w:r>
+              <w:rPr>
+                <w:rFonts w:ascii="Malgun Gothic" w:cs="Malgun Gothic" w:eastAsia="Malgun Gothic" w:hAnsi="Malgun Gothic"/>
+                <w:b w:val="false"/>
+                <w:bCs w:val="false"/>
+                <w:sz w:val="15"/>
+                <w:szCs w:val="15"/>
+              </w:rPr>
+              <w:t xml:space="preserve">0.718 (0.706-0.73)</w:t>
+            </w:r>
+          </w:p>
+        </w:tc>
+        <w:tc>
+          <w:tcPr>
+            <w:tcW w:type="dxa" w:w="2951"/>
+            <w:tcMar>
+              <w:top w:type="dxa" w:w="25"/>
+              <w:left w:type="dxa" w:w="70"/>
+              <w:bottom w:type="dxa" w:w="25"/>
+              <w:right w:type="dxa" w:w="70"/>
+            </w:tcMar>
+          </w:tcPr>
+          <w:p>
+            <w:r>
+              <w:rPr>
+                <w:rFonts w:ascii="Malgun Gothic" w:cs="Malgun Gothic" w:eastAsia="Malgun Gothic" w:hAnsi="Malgun Gothic"/>
+                <w:b w:val="false"/>
+                <w:bCs w:val="false"/>
+                <w:sz w:val="15"/>
+                <w:szCs w:val="15"/>
+              </w:rPr>
+              <w:t xml:space="preserve">0.719 (0.675-0.765)</w:t>
+            </w:r>
+          </w:p>
+        </w:tc>
+        <w:tc>
+          <w:tcPr>
+            <w:tcW w:type="dxa" w:w="1416"/>
             <w:tcMar>
               <w:top w:type="dxa" w:w="25"/>
               <w:left w:type="dxa" w:w="70"/>
@@ -6189,7 +6237,7 @@
         </w:tc>
         <w:tc>
           <w:tcPr>
-            <w:tcW w:type="dxa" w:w="2042"/>
+            <w:tcW w:type="dxa" w:w="1770"/>
             <w:tcMar>
               <w:top w:type="dxa" w:w="25"/>
               <w:left w:type="dxa" w:w="70"/>
@@ -6212,30 +6260,7 @@
         </w:tc>
         <w:tc>
           <w:tcPr>
-            <w:tcW w:type="dxa" w:w="2901"/>
-            <w:tcMar>
-              <w:top w:type="dxa" w:w="25"/>
-              <w:left w:type="dxa" w:w="70"/>
-              <w:bottom w:type="dxa" w:w="25"/>
-              <w:right w:type="dxa" w:w="70"/>
-            </w:tcMar>
-          </w:tcPr>
-          <w:p>
-            <w:r>
-              <w:rPr>
-                <w:rFonts w:ascii="Malgun Gothic" w:cs="Malgun Gothic" w:eastAsia="Malgun Gothic" w:hAnsi="Malgun Gothic"/>
-                <w:b w:val="false"/>
-                <w:bCs w:val="false"/>
-                <w:sz w:val="15"/>
-                <w:szCs w:val="15"/>
-              </w:rPr>
-              <w:t xml:space="preserve">0.719 (0.675-0.765)</w:t>
-            </w:r>
-          </w:p>
-        </w:tc>
-        <w:tc>
-          <w:tcPr>
-            <w:tcW w:type="dxa" w:w="860"/>
+            <w:tcW w:type="dxa" w:w="826"/>
             <w:tcMar>
               <w:top w:type="dxa" w:w="25"/>
               <w:left w:type="dxa" w:w="70"/>
@@ -6258,7 +6283,7 @@
         </w:tc>
         <w:tc>
           <w:tcPr>
-            <w:tcW w:type="dxa" w:w="1075"/>
+            <w:tcW w:type="dxa" w:w="1062"/>
             <w:tcMar>
               <w:top w:type="dxa" w:w="25"/>
               <w:left w:type="dxa" w:w="70"/>
@@ -6276,29 +6301,6 @@
                 <w:szCs w:val="15"/>
               </w:rPr>
               <w:t xml:space="preserve">&lt;0.001</w:t>
-            </w:r>
-          </w:p>
-        </w:tc>
-        <w:tc>
-          <w:tcPr>
-            <w:tcW w:type="dxa" w:w="3116"/>
-            <w:tcMar>
-              <w:top w:type="dxa" w:w="25"/>
-              <w:left w:type="dxa" w:w="70"/>
-              <w:bottom w:type="dxa" w:w="25"/>
-              <w:right w:type="dxa" w:w="70"/>
-            </w:tcMar>
-          </w:tcPr>
-          <w:p>
-            <w:r>
-              <w:rPr>
-                <w:rFonts w:ascii="Malgun Gothic" w:cs="Malgun Gothic" w:eastAsia="Malgun Gothic" w:hAnsi="Malgun Gothic"/>
-                <w:b w:val="false"/>
-                <w:bCs w:val="false"/>
-                <w:sz w:val="15"/>
-                <w:szCs w:val="15"/>
-              </w:rPr>
-              <w:t xml:space="preserve">0.718 (0.706-0.73)</w:t>
             </w:r>
           </w:p>
         </w:tc>
@@ -6306,7 +6308,7 @@
       <w:tr>
         <w:tc>
           <w:tcPr>
-            <w:tcW w:type="dxa" w:w="3654"/>
+            <w:tcW w:type="dxa" w:w="3423"/>
             <w:tcMar>
               <w:top w:type="dxa" w:w="25"/>
               <w:left w:type="dxa" w:w="70"/>
@@ -6329,7 +6331,53 @@
         </w:tc>
         <w:tc>
           <w:tcPr>
-            <w:tcW w:type="dxa" w:w="752"/>
+            <w:tcW w:type="dxa" w:w="2951"/>
+            <w:tcMar>
+              <w:top w:type="dxa" w:w="25"/>
+              <w:left w:type="dxa" w:w="70"/>
+              <w:bottom w:type="dxa" w:w="25"/>
+              <w:right w:type="dxa" w:w="70"/>
+            </w:tcMar>
+          </w:tcPr>
+          <w:p>
+            <w:r>
+              <w:rPr>
+                <w:rFonts w:ascii="Malgun Gothic" w:cs="Malgun Gothic" w:eastAsia="Malgun Gothic" w:hAnsi="Malgun Gothic"/>
+                <w:b w:val="false"/>
+                <w:bCs w:val="false"/>
+                <w:sz w:val="15"/>
+                <w:szCs w:val="15"/>
+              </w:rPr>
+              <w:t xml:space="preserve">0.769 (0.751-0.787)</w:t>
+            </w:r>
+          </w:p>
+        </w:tc>
+        <w:tc>
+          <w:tcPr>
+            <w:tcW w:type="dxa" w:w="2951"/>
+            <w:tcMar>
+              <w:top w:type="dxa" w:w="25"/>
+              <w:left w:type="dxa" w:w="70"/>
+              <w:bottom w:type="dxa" w:w="25"/>
+              <w:right w:type="dxa" w:w="70"/>
+            </w:tcMar>
+          </w:tcPr>
+          <w:p>
+            <w:r>
+              <w:rPr>
+                <w:rFonts w:ascii="Malgun Gothic" w:cs="Malgun Gothic" w:eastAsia="Malgun Gothic" w:hAnsi="Malgun Gothic"/>
+                <w:b w:val="false"/>
+                <w:bCs w:val="false"/>
+                <w:sz w:val="15"/>
+                <w:szCs w:val="15"/>
+              </w:rPr>
+              <w:t xml:space="preserve">0.798 (0.724-0.878)</w:t>
+            </w:r>
+          </w:p>
+        </w:tc>
+        <w:tc>
+          <w:tcPr>
+            <w:tcW w:type="dxa" w:w="1416"/>
             <w:tcMar>
               <w:top w:type="dxa" w:w="25"/>
               <w:left w:type="dxa" w:w="70"/>
@@ -6352,7 +6400,7 @@
         </w:tc>
         <w:tc>
           <w:tcPr>
-            <w:tcW w:type="dxa" w:w="2042"/>
+            <w:tcW w:type="dxa" w:w="1770"/>
             <w:tcMar>
               <w:top w:type="dxa" w:w="25"/>
               <w:left w:type="dxa" w:w="70"/>
@@ -6375,30 +6423,7 @@
         </w:tc>
         <w:tc>
           <w:tcPr>
-            <w:tcW w:type="dxa" w:w="2901"/>
-            <w:tcMar>
-              <w:top w:type="dxa" w:w="25"/>
-              <w:left w:type="dxa" w:w="70"/>
-              <w:bottom w:type="dxa" w:w="25"/>
-              <w:right w:type="dxa" w:w="70"/>
-            </w:tcMar>
-          </w:tcPr>
-          <w:p>
-            <w:r>
-              <w:rPr>
-                <w:rFonts w:ascii="Malgun Gothic" w:cs="Malgun Gothic" w:eastAsia="Malgun Gothic" w:hAnsi="Malgun Gothic"/>
-                <w:b w:val="false"/>
-                <w:bCs w:val="false"/>
-                <w:sz w:val="15"/>
-                <w:szCs w:val="15"/>
-              </w:rPr>
-              <w:t xml:space="preserve">0.798 (0.724-0.878)</w:t>
-            </w:r>
-          </w:p>
-        </w:tc>
-        <w:tc>
-          <w:tcPr>
-            <w:tcW w:type="dxa" w:w="860"/>
+            <w:tcW w:type="dxa" w:w="826"/>
             <w:tcMar>
               <w:top w:type="dxa" w:w="25"/>
               <w:left w:type="dxa" w:w="70"/>
@@ -6421,7 +6446,7 @@
         </w:tc>
         <w:tc>
           <w:tcPr>
-            <w:tcW w:type="dxa" w:w="1075"/>
+            <w:tcW w:type="dxa" w:w="1062"/>
             <w:tcMar>
               <w:top w:type="dxa" w:w="25"/>
               <w:left w:type="dxa" w:w="70"/>
@@ -6439,29 +6464,6 @@
                 <w:szCs w:val="15"/>
               </w:rPr>
               <w:t xml:space="preserve">&lt;0.001</w:t>
-            </w:r>
-          </w:p>
-        </w:tc>
-        <w:tc>
-          <w:tcPr>
-            <w:tcW w:type="dxa" w:w="3116"/>
-            <w:tcMar>
-              <w:top w:type="dxa" w:w="25"/>
-              <w:left w:type="dxa" w:w="70"/>
-              <w:bottom w:type="dxa" w:w="25"/>
-              <w:right w:type="dxa" w:w="70"/>
-            </w:tcMar>
-          </w:tcPr>
-          <w:p>
-            <w:r>
-              <w:rPr>
-                <w:rFonts w:ascii="Malgun Gothic" w:cs="Malgun Gothic" w:eastAsia="Malgun Gothic" w:hAnsi="Malgun Gothic"/>
-                <w:b w:val="false"/>
-                <w:bCs w:val="false"/>
-                <w:sz w:val="15"/>
-                <w:szCs w:val="15"/>
-              </w:rPr>
-              <w:t xml:space="preserve">0.769 (0.751-0.787)</w:t>
             </w:r>
           </w:p>
         </w:tc>
@@ -6469,7 +6471,7 @@
       <w:tr>
         <w:tc>
           <w:tcPr>
-            <w:tcW w:type="dxa" w:w="3654"/>
+            <w:tcW w:type="dxa" w:w="3423"/>
             <w:tcMar>
               <w:top w:type="dxa" w:w="25"/>
               <w:left w:type="dxa" w:w="70"/>
@@ -6492,7 +6494,53 @@
         </w:tc>
         <w:tc>
           <w:tcPr>
-            <w:tcW w:type="dxa" w:w="752"/>
+            <w:tcW w:type="dxa" w:w="2951"/>
+            <w:tcMar>
+              <w:top w:type="dxa" w:w="25"/>
+              <w:left w:type="dxa" w:w="70"/>
+              <w:bottom w:type="dxa" w:w="25"/>
+              <w:right w:type="dxa" w:w="70"/>
+            </w:tcMar>
+          </w:tcPr>
+          <w:p>
+            <w:r>
+              <w:rPr>
+                <w:rFonts w:ascii="Malgun Gothic" w:cs="Malgun Gothic" w:eastAsia="Malgun Gothic" w:hAnsi="Malgun Gothic"/>
+                <w:b w:val="false"/>
+                <w:bCs w:val="false"/>
+                <w:sz w:val="15"/>
+                <w:szCs w:val="15"/>
+              </w:rPr>
+              <w:t xml:space="preserve">0.56 (0.55-0.57)</w:t>
+            </w:r>
+          </w:p>
+        </w:tc>
+        <w:tc>
+          <w:tcPr>
+            <w:tcW w:type="dxa" w:w="2951"/>
+            <w:tcMar>
+              <w:top w:type="dxa" w:w="25"/>
+              <w:left w:type="dxa" w:w="70"/>
+              <w:bottom w:type="dxa" w:w="25"/>
+              <w:right w:type="dxa" w:w="70"/>
+            </w:tcMar>
+          </w:tcPr>
+          <w:p>
+            <w:r>
+              <w:rPr>
+                <w:rFonts w:ascii="Malgun Gothic" w:cs="Malgun Gothic" w:eastAsia="Malgun Gothic" w:hAnsi="Malgun Gothic"/>
+                <w:b w:val="false"/>
+                <w:bCs w:val="false"/>
+                <w:sz w:val="15"/>
+                <w:szCs w:val="15"/>
+              </w:rPr>
+              <w:t xml:space="preserve">0.695 (0.603-0.802)</w:t>
+            </w:r>
+          </w:p>
+        </w:tc>
+        <w:tc>
+          <w:tcPr>
+            <w:tcW w:type="dxa" w:w="1416"/>
             <w:tcMar>
               <w:top w:type="dxa" w:w="25"/>
               <w:left w:type="dxa" w:w="70"/>
@@ -6515,7 +6563,7 @@
         </w:tc>
         <w:tc>
           <w:tcPr>
-            <w:tcW w:type="dxa" w:w="2042"/>
+            <w:tcW w:type="dxa" w:w="1770"/>
             <w:tcMar>
               <w:top w:type="dxa" w:w="25"/>
               <w:left w:type="dxa" w:w="70"/>
@@ -6538,30 +6586,7 @@
         </w:tc>
         <w:tc>
           <w:tcPr>
-            <w:tcW w:type="dxa" w:w="2901"/>
-            <w:tcMar>
-              <w:top w:type="dxa" w:w="25"/>
-              <w:left w:type="dxa" w:w="70"/>
-              <w:bottom w:type="dxa" w:w="25"/>
-              <w:right w:type="dxa" w:w="70"/>
-            </w:tcMar>
-          </w:tcPr>
-          <w:p>
-            <w:r>
-              <w:rPr>
-                <w:rFonts w:ascii="Malgun Gothic" w:cs="Malgun Gothic" w:eastAsia="Malgun Gothic" w:hAnsi="Malgun Gothic"/>
-                <w:b w:val="false"/>
-                <w:bCs w:val="false"/>
-                <w:sz w:val="15"/>
-                <w:szCs w:val="15"/>
-              </w:rPr>
-              <w:t xml:space="preserve">0.695 (0.603-0.802)</w:t>
-            </w:r>
-          </w:p>
-        </w:tc>
-        <w:tc>
-          <w:tcPr>
-            <w:tcW w:type="dxa" w:w="860"/>
+            <w:tcW w:type="dxa" w:w="826"/>
             <w:tcMar>
               <w:top w:type="dxa" w:w="25"/>
               <w:left w:type="dxa" w:w="70"/>
@@ -6584,7 +6609,7 @@
         </w:tc>
         <w:tc>
           <w:tcPr>
-            <w:tcW w:type="dxa" w:w="1075"/>
+            <w:tcW w:type="dxa" w:w="1062"/>
             <w:tcMar>
               <w:top w:type="dxa" w:w="25"/>
               <w:left w:type="dxa" w:w="70"/>
@@ -6602,29 +6627,6 @@
                 <w:szCs w:val="15"/>
               </w:rPr>
               <w:t xml:space="preserve">&lt;0.001</w:t>
-            </w:r>
-          </w:p>
-        </w:tc>
-        <w:tc>
-          <w:tcPr>
-            <w:tcW w:type="dxa" w:w="3116"/>
-            <w:tcMar>
-              <w:top w:type="dxa" w:w="25"/>
-              <w:left w:type="dxa" w:w="70"/>
-              <w:bottom w:type="dxa" w:w="25"/>
-              <w:right w:type="dxa" w:w="70"/>
-            </w:tcMar>
-          </w:tcPr>
-          <w:p>
-            <w:r>
-              <w:rPr>
-                <w:rFonts w:ascii="Malgun Gothic" w:cs="Malgun Gothic" w:eastAsia="Malgun Gothic" w:hAnsi="Malgun Gothic"/>
-                <w:b w:val="false"/>
-                <w:bCs w:val="false"/>
-                <w:sz w:val="15"/>
-                <w:szCs w:val="15"/>
-              </w:rPr>
-              <w:t xml:space="preserve">0.56 (0.55-0.57)</w:t>
             </w:r>
           </w:p>
         </w:tc>
@@ -6632,7 +6634,7 @@
       <w:tr>
         <w:tc>
           <w:tcPr>
-            <w:tcW w:type="dxa" w:w="3654"/>
+            <w:tcW w:type="dxa" w:w="3423"/>
             <w:tcMar>
               <w:top w:type="dxa" w:w="25"/>
               <w:left w:type="dxa" w:w="70"/>
@@ -6655,7 +6657,53 @@
         </w:tc>
         <w:tc>
           <w:tcPr>
-            <w:tcW w:type="dxa" w:w="752"/>
+            <w:tcW w:type="dxa" w:w="2951"/>
+            <w:tcMar>
+              <w:top w:type="dxa" w:w="25"/>
+              <w:left w:type="dxa" w:w="70"/>
+              <w:bottom w:type="dxa" w:w="25"/>
+              <w:right w:type="dxa" w:w="70"/>
+            </w:tcMar>
+          </w:tcPr>
+          <w:p>
+            <w:r>
+              <w:rPr>
+                <w:rFonts w:ascii="Malgun Gothic" w:cs="Malgun Gothic" w:eastAsia="Malgun Gothic" w:hAnsi="Malgun Gothic"/>
+                <w:b w:val="false"/>
+                <w:bCs w:val="false"/>
+                <w:sz w:val="15"/>
+                <w:szCs w:val="15"/>
+              </w:rPr>
+              <w:t xml:space="preserve">1.95 (1.925-1.975)</w:t>
+            </w:r>
+          </w:p>
+        </w:tc>
+        <w:tc>
+          <w:tcPr>
+            <w:tcW w:type="dxa" w:w="2951"/>
+            <w:tcMar>
+              <w:top w:type="dxa" w:w="25"/>
+              <w:left w:type="dxa" w:w="70"/>
+              <w:bottom w:type="dxa" w:w="25"/>
+              <w:right w:type="dxa" w:w="70"/>
+            </w:tcMar>
+          </w:tcPr>
+          <w:p>
+            <w:r>
+              <w:rPr>
+                <w:rFonts w:ascii="Malgun Gothic" w:cs="Malgun Gothic" w:eastAsia="Malgun Gothic" w:hAnsi="Malgun Gothic"/>
+                <w:b w:val="false"/>
+                <w:bCs w:val="false"/>
+                <w:sz w:val="15"/>
+                <w:szCs w:val="15"/>
+              </w:rPr>
+              <w:t xml:space="preserve">1.968 (1.815-2.134)</w:t>
+            </w:r>
+          </w:p>
+        </w:tc>
+        <w:tc>
+          <w:tcPr>
+            <w:tcW w:type="dxa" w:w="1416"/>
             <w:tcMar>
               <w:top w:type="dxa" w:w="25"/>
               <w:left w:type="dxa" w:w="70"/>
@@ -6678,7 +6726,7 @@
         </w:tc>
         <w:tc>
           <w:tcPr>
-            <w:tcW w:type="dxa" w:w="2042"/>
+            <w:tcW w:type="dxa" w:w="1770"/>
             <w:tcMar>
               <w:top w:type="dxa" w:w="25"/>
               <w:left w:type="dxa" w:w="70"/>
@@ -6701,30 +6749,7 @@
         </w:tc>
         <w:tc>
           <w:tcPr>
-            <w:tcW w:type="dxa" w:w="2901"/>
-            <w:tcMar>
-              <w:top w:type="dxa" w:w="25"/>
-              <w:left w:type="dxa" w:w="70"/>
-              <w:bottom w:type="dxa" w:w="25"/>
-              <w:right w:type="dxa" w:w="70"/>
-            </w:tcMar>
-          </w:tcPr>
-          <w:p>
-            <w:r>
-              <w:rPr>
-                <w:rFonts w:ascii="Malgun Gothic" w:cs="Malgun Gothic" w:eastAsia="Malgun Gothic" w:hAnsi="Malgun Gothic"/>
-                <w:b w:val="false"/>
-                <w:bCs w:val="false"/>
-                <w:sz w:val="15"/>
-                <w:szCs w:val="15"/>
-              </w:rPr>
-              <w:t xml:space="preserve">1.968 (1.815-2.134)</w:t>
-            </w:r>
-          </w:p>
-        </w:tc>
-        <w:tc>
-          <w:tcPr>
-            <w:tcW w:type="dxa" w:w="860"/>
+            <w:tcW w:type="dxa" w:w="826"/>
             <w:tcMar>
               <w:top w:type="dxa" w:w="25"/>
               <w:left w:type="dxa" w:w="70"/>
@@ -6747,7 +6772,7 @@
         </w:tc>
         <w:tc>
           <w:tcPr>
-            <w:tcW w:type="dxa" w:w="1075"/>
+            <w:tcW w:type="dxa" w:w="1062"/>
             <w:tcMar>
               <w:top w:type="dxa" w:w="25"/>
               <w:left w:type="dxa" w:w="70"/>
@@ -6765,29 +6790,6 @@
                 <w:szCs w:val="15"/>
               </w:rPr>
               <w:t xml:space="preserve">&lt;0.001</w:t>
-            </w:r>
-          </w:p>
-        </w:tc>
-        <w:tc>
-          <w:tcPr>
-            <w:tcW w:type="dxa" w:w="3116"/>
-            <w:tcMar>
-              <w:top w:type="dxa" w:w="25"/>
-              <w:left w:type="dxa" w:w="70"/>
-              <w:bottom w:type="dxa" w:w="25"/>
-              <w:right w:type="dxa" w:w="70"/>
-            </w:tcMar>
-          </w:tcPr>
-          <w:p>
-            <w:r>
-              <w:rPr>
-                <w:rFonts w:ascii="Malgun Gothic" w:cs="Malgun Gothic" w:eastAsia="Malgun Gothic" w:hAnsi="Malgun Gothic"/>
-                <w:b w:val="false"/>
-                <w:bCs w:val="false"/>
-                <w:sz w:val="15"/>
-                <w:szCs w:val="15"/>
-              </w:rPr>
-              <w:t xml:space="preserve">1.95 (1.925-1.975)</w:t>
             </w:r>
           </w:p>
         </w:tc>
@@ -6810,7 +6812,7 @@
           <w:sz w:val="18"/>
           <w:szCs w:val="18"/>
         </w:rPr>
-        <w:t xml:space="preserve">AIAN main analysis uses the Indian Health Service–linked (undercount-corrected) representative; the higher unlinked SEER value (0.71) appears only in the sensitivity pool. Pooled and main IRRs agree closely for all other groups.</w:t>
+        <w:t xml:space="preserve">AIAN main analysis uses the Indian Health Service–linked (undercount-corrected) representative; the higher unlinked SEER value (0.71) enters only the sensitivity pool. Main and sensitivity estimates agree closely in direction for all groups. No. of estimates / I² / Q p are properties of the sensitivity pool only.</w:t>
       </w:r>
     </w:p>
     <w:p>

</xml_diff>

<commit_message>
Drop main-text Table 2; keep meta-analysis stats in Supplementary only
The main analysis uses one representative per registry family (not a
pool), so k / I2 / Cochran's Q p apply only to the all-included
sensitivity pool. Reporting a pooled 'meta-analysis results' table in the
main text would misrepresent the non-pooling headline and duplicate
Table 1's aggregate rows. Main text now = Table 1 (main IRRs) + Figures
1-3; the sensitivity pool with k/I2/Q p stays in Supplementary Table 8
and the pooled forests (S Figures 1-3). Classification doc updated.

Co-Authored-By: Claude Opus 4.8 <noreply@anthropic.com>
Claude-Session: https://claude.ai/code/session_01CuLT4FKRBtsU22Vwfjj2qn
</commit_message>
<xml_diff>
--- a/meta_agents/search_v2/outputs/Main_Text_Tables_Figures.docx
+++ b/meta_agents/search_v2/outputs/Main_Text_Tables_Figures.docx
@@ -5746,1074 +5746,6 @@
       <w:pPr>
         <w:spacing w:after="80"/>
       </w:pPr>
-    </w:p>
-    <w:p>
-      <w:r>
-        <w:br w:type="page"/>
-      </w:r>
-    </w:p>
-    <w:p>
-      <w:pPr>
-        <w:pStyle w:val="Heading1"/>
-        <w:spacing w:after="100" w:before="200"/>
-      </w:pPr>
-      <w:r>
-        <w:rPr>
-          <w:rFonts w:ascii="Malgun Gothic" w:cs="Malgun Gothic" w:eastAsia="Malgun Gothic" w:hAnsi="Malgun Gothic"/>
-          <w:b/>
-          <w:bCs/>
-          <w:sz w:val="24"/>
-          <w:szCs w:val="24"/>
-        </w:rPr>
-        <w:t xml:space="preserve">Table 2. Aggregate meta-analysis of invasive breast cancer incidence by racial and ethnic group</w:t>
-      </w:r>
-    </w:p>
-    <w:p>
-      <w:pPr>
-        <w:spacing w:after="80"/>
-      </w:pPr>
-      <w:r>
-        <w:rPr>
-          <w:rFonts w:ascii="Malgun Gothic" w:cs="Malgun Gothic" w:eastAsia="Malgun Gothic" w:hAnsi="Malgun Gothic"/>
-          <w:i/>
-          <w:iCs/>
-          <w:sz w:val="18"/>
-          <w:szCs w:val="18"/>
-        </w:rPr>
-        <w:t xml:space="preserve">Primary result = the main-analysis IRR, a single representative estimate per registry family (no pooling, so no k / I² / heterogeneity test apply to it). The sensitivity analysis pools every overlapping registry estimate for the cell with a random-effects model (Paule-Mandel/REML τ², Hartung-Knapp-Sidik-Jonkman CI); the No. of estimates, I², and Cochran's Q p-value below describe THAT pool. Because those estimates repeatedly include the same nested registries (SEER ⊂ NAACCR ⊂ USCS), they are not independent — hence the very high I² / small Q p is a non-independence artifact, not genuine between-study heterogeneity (Supplementary Table 8; GRADE framework, Table 6). Concordance of the two columns indicates the direction is robust.</w:t>
-      </w:r>
-    </w:p>
-    <w:tbl>
-      <w:tblPr>
-        <w:tblW w:type="dxa" w:w="14400"/>
-        <w:tblBorders>
-          <w:top w:val="single" w:color="BBBBBB" w:sz="3"/>
-          <w:left w:val="single" w:color="BBBBBB" w:sz="3"/>
-          <w:bottom w:val="single" w:color="BBBBBB" w:sz="3"/>
-          <w:right w:val="single" w:color="BBBBBB" w:sz="3"/>
-          <w:insideH w:val="single" w:color="BBBBBB" w:sz="3"/>
-          <w:insideV w:val="single" w:color="BBBBBB" w:sz="3"/>
-        </w:tblBorders>
-      </w:tblPr>
-      <w:tblGrid>
-        <w:gridCol w:w="3423"/>
-        <w:gridCol w:w="2951"/>
-        <w:gridCol w:w="2951"/>
-        <w:gridCol w:w="1416"/>
-        <w:gridCol w:w="1770"/>
-        <w:gridCol w:w="826"/>
-        <w:gridCol w:w="1062"/>
-      </w:tblGrid>
-      <w:tr>
-        <w:trPr>
-          <w:tblHeader/>
-        </w:trPr>
-        <w:tc>
-          <w:tcPr>
-            <w:tcW w:type="dxa" w:w="3423"/>
-            <w:shd w:fill="E7EEF6" w:color="auto" w:val="clear"/>
-            <w:tcMar>
-              <w:top w:type="dxa" w:w="25"/>
-              <w:left w:type="dxa" w:w="70"/>
-              <w:bottom w:type="dxa" w:w="25"/>
-              <w:right w:type="dxa" w:w="70"/>
-            </w:tcMar>
-          </w:tcPr>
-          <w:p>
-            <w:r>
-              <w:rPr>
-                <w:rFonts w:ascii="Malgun Gothic" w:cs="Malgun Gothic" w:eastAsia="Malgun Gothic" w:hAnsi="Malgun Gothic"/>
-                <w:b/>
-                <w:bCs/>
-                <w:sz w:val="15"/>
-                <w:szCs w:val="15"/>
-              </w:rPr>
-              <w:t xml:space="preserve">Comparison (vs NHW)</w:t>
-            </w:r>
-          </w:p>
-        </w:tc>
-        <w:tc>
-          <w:tcPr>
-            <w:tcW w:type="dxa" w:w="2951"/>
-            <w:shd w:fill="E7EEF6" w:color="auto" w:val="clear"/>
-            <w:tcMar>
-              <w:top w:type="dxa" w:w="25"/>
-              <w:left w:type="dxa" w:w="70"/>
-              <w:bottom w:type="dxa" w:w="25"/>
-              <w:right w:type="dxa" w:w="70"/>
-            </w:tcMar>
-          </w:tcPr>
-          <w:p>
-            <w:r>
-              <w:rPr>
-                <w:rFonts w:ascii="Malgun Gothic" w:cs="Malgun Gothic" w:eastAsia="Malgun Gothic" w:hAnsi="Malgun Gothic"/>
-                <w:b/>
-                <w:bCs/>
-                <w:sz w:val="15"/>
-                <w:szCs w:val="15"/>
-              </w:rPr>
-              <w:t xml:space="preserve">Main IRR (95% CI)
-[primary, one-per-family]</w:t>
-            </w:r>
-          </w:p>
-        </w:tc>
-        <w:tc>
-          <w:tcPr>
-            <w:tcW w:type="dxa" w:w="2951"/>
-            <w:shd w:fill="E7EEF6" w:color="auto" w:val="clear"/>
-            <w:tcMar>
-              <w:top w:type="dxa" w:w="25"/>
-              <w:left w:type="dxa" w:w="70"/>
-              <w:bottom w:type="dxa" w:w="25"/>
-              <w:right w:type="dxa" w:w="70"/>
-            </w:tcMar>
-          </w:tcPr>
-          <w:p>
-            <w:r>
-              <w:rPr>
-                <w:rFonts w:ascii="Malgun Gothic" w:cs="Malgun Gothic" w:eastAsia="Malgun Gothic" w:hAnsi="Malgun Gothic"/>
-                <w:b/>
-                <w:bCs/>
-                <w:sz w:val="15"/>
-                <w:szCs w:val="15"/>
-              </w:rPr>
-              <w:t xml:space="preserve">Sensitivity IRR (95% CI)
-[all overlapping]</w:t>
-            </w:r>
-          </w:p>
-        </w:tc>
-        <w:tc>
-          <w:tcPr>
-            <w:tcW w:type="dxa" w:w="1416"/>
-            <w:shd w:fill="E7EEF6" w:color="auto" w:val="clear"/>
-            <w:tcMar>
-              <w:top w:type="dxa" w:w="25"/>
-              <w:left w:type="dxa" w:w="70"/>
-              <w:bottom w:type="dxa" w:w="25"/>
-              <w:right w:type="dxa" w:w="70"/>
-            </w:tcMar>
-          </w:tcPr>
-          <w:p>
-            <w:r>
-              <w:rPr>
-                <w:rFonts w:ascii="Malgun Gothic" w:cs="Malgun Gothic" w:eastAsia="Malgun Gothic" w:hAnsi="Malgun Gothic"/>
-                <w:b/>
-                <w:bCs/>
-                <w:sz w:val="15"/>
-                <w:szCs w:val="15"/>
-              </w:rPr>
-              <w:t xml:space="preserve">No. of estimates</w:t>
-            </w:r>
-          </w:p>
-        </w:tc>
-        <w:tc>
-          <w:tcPr>
-            <w:tcW w:type="dxa" w:w="1770"/>
-            <w:shd w:fill="E7EEF6" w:color="auto" w:val="clear"/>
-            <w:tcMar>
-              <w:top w:type="dxa" w:w="25"/>
-              <w:left w:type="dxa" w:w="70"/>
-              <w:bottom w:type="dxa" w:w="25"/>
-              <w:right w:type="dxa" w:w="70"/>
-            </w:tcMar>
-          </w:tcPr>
-          <w:p>
-            <w:r>
-              <w:rPr>
-                <w:rFonts w:ascii="Malgun Gothic" w:cs="Malgun Gothic" w:eastAsia="Malgun Gothic" w:hAnsi="Malgun Gothic"/>
-                <w:b/>
-                <w:bCs/>
-                <w:sz w:val="15"/>
-                <w:szCs w:val="15"/>
-              </w:rPr>
-              <w:t xml:space="preserve">Model</w:t>
-            </w:r>
-          </w:p>
-        </w:tc>
-        <w:tc>
-          <w:tcPr>
-            <w:tcW w:type="dxa" w:w="826"/>
-            <w:shd w:fill="E7EEF6" w:color="auto" w:val="clear"/>
-            <w:tcMar>
-              <w:top w:type="dxa" w:w="25"/>
-              <w:left w:type="dxa" w:w="70"/>
-              <w:bottom w:type="dxa" w:w="25"/>
-              <w:right w:type="dxa" w:w="70"/>
-            </w:tcMar>
-          </w:tcPr>
-          <w:p>
-            <w:r>
-              <w:rPr>
-                <w:rFonts w:ascii="Malgun Gothic" w:cs="Malgun Gothic" w:eastAsia="Malgun Gothic" w:hAnsi="Malgun Gothic"/>
-                <w:b/>
-                <w:bCs/>
-                <w:sz w:val="15"/>
-                <w:szCs w:val="15"/>
-              </w:rPr>
-              <w:t xml:space="preserve">I²</w:t>
-            </w:r>
-          </w:p>
-        </w:tc>
-        <w:tc>
-          <w:tcPr>
-            <w:tcW w:type="dxa" w:w="1062"/>
-            <w:shd w:fill="E7EEF6" w:color="auto" w:val="clear"/>
-            <w:tcMar>
-              <w:top w:type="dxa" w:w="25"/>
-              <w:left w:type="dxa" w:w="70"/>
-              <w:bottom w:type="dxa" w:w="25"/>
-              <w:right w:type="dxa" w:w="70"/>
-            </w:tcMar>
-          </w:tcPr>
-          <w:p>
-            <w:r>
-              <w:rPr>
-                <w:rFonts w:ascii="Malgun Gothic" w:cs="Malgun Gothic" w:eastAsia="Malgun Gothic" w:hAnsi="Malgun Gothic"/>
-                <w:b/>
-                <w:bCs/>
-                <w:sz w:val="15"/>
-                <w:szCs w:val="15"/>
-              </w:rPr>
-              <w:t xml:space="preserve">Q p</w:t>
-            </w:r>
-          </w:p>
-        </w:tc>
-      </w:tr>
-      <w:tr>
-        <w:tc>
-          <w:tcPr>
-            <w:tcW w:type="dxa" w:w="3423"/>
-            <w:tcMar>
-              <w:top w:type="dxa" w:w="25"/>
-              <w:left w:type="dxa" w:w="70"/>
-              <w:bottom w:type="dxa" w:w="25"/>
-              <w:right w:type="dxa" w:w="70"/>
-            </w:tcMar>
-          </w:tcPr>
-          <w:p>
-            <w:r>
-              <w:rPr>
-                <w:rFonts w:ascii="Malgun Gothic" w:cs="Malgun Gothic" w:eastAsia="Malgun Gothic" w:hAnsi="Malgun Gothic"/>
-                <w:b w:val="false"/>
-                <w:bCs w:val="false"/>
-                <w:sz w:val="15"/>
-                <w:szCs w:val="15"/>
-              </w:rPr>
-              <w:t xml:space="preserve">Overall invasive breast cancer — Black</w:t>
-            </w:r>
-          </w:p>
-        </w:tc>
-        <w:tc>
-          <w:tcPr>
-            <w:tcW w:type="dxa" w:w="2951"/>
-            <w:tcMar>
-              <w:top w:type="dxa" w:w="25"/>
-              <w:left w:type="dxa" w:w="70"/>
-              <w:bottom w:type="dxa" w:w="25"/>
-              <w:right w:type="dxa" w:w="70"/>
-            </w:tcMar>
-          </w:tcPr>
-          <w:p>
-            <w:r>
-              <w:rPr>
-                <w:rFonts w:ascii="Malgun Gothic" w:cs="Malgun Gothic" w:eastAsia="Malgun Gothic" w:hAnsi="Malgun Gothic"/>
-                <w:b w:val="false"/>
-                <w:bCs w:val="false"/>
-                <w:sz w:val="15"/>
-                <w:szCs w:val="15"/>
-              </w:rPr>
-              <w:t xml:space="preserve">0.933 (0.92-0.946)</w:t>
-            </w:r>
-          </w:p>
-        </w:tc>
-        <w:tc>
-          <w:tcPr>
-            <w:tcW w:type="dxa" w:w="2951"/>
-            <w:tcMar>
-              <w:top w:type="dxa" w:w="25"/>
-              <w:left w:type="dxa" w:w="70"/>
-              <w:bottom w:type="dxa" w:w="25"/>
-              <w:right w:type="dxa" w:w="70"/>
-            </w:tcMar>
-          </w:tcPr>
-          <w:p>
-            <w:r>
-              <w:rPr>
-                <w:rFonts w:ascii="Malgun Gothic" w:cs="Malgun Gothic" w:eastAsia="Malgun Gothic" w:hAnsi="Malgun Gothic"/>
-                <w:b w:val="false"/>
-                <w:bCs w:val="false"/>
-                <w:sz w:val="15"/>
-                <w:szCs w:val="15"/>
-              </w:rPr>
-              <w:t xml:space="preserve">0.951 (0.936-0.965)</w:t>
-            </w:r>
-          </w:p>
-        </w:tc>
-        <w:tc>
-          <w:tcPr>
-            <w:tcW w:type="dxa" w:w="1416"/>
-            <w:tcMar>
-              <w:top w:type="dxa" w:w="25"/>
-              <w:left w:type="dxa" w:w="70"/>
-              <w:bottom w:type="dxa" w:w="25"/>
-              <w:right w:type="dxa" w:w="70"/>
-            </w:tcMar>
-          </w:tcPr>
-          <w:p>
-            <w:r>
-              <w:rPr>
-                <w:rFonts w:ascii="Malgun Gothic" w:cs="Malgun Gothic" w:eastAsia="Malgun Gothic" w:hAnsi="Malgun Gothic"/>
-                <w:b w:val="false"/>
-                <w:bCs w:val="false"/>
-                <w:sz w:val="15"/>
-                <w:szCs w:val="15"/>
-              </w:rPr>
-              <w:t xml:space="preserve">9</w:t>
-            </w:r>
-          </w:p>
-        </w:tc>
-        <w:tc>
-          <w:tcPr>
-            <w:tcW w:type="dxa" w:w="1770"/>
-            <w:tcMar>
-              <w:top w:type="dxa" w:w="25"/>
-              <w:left w:type="dxa" w:w="70"/>
-              <w:bottom w:type="dxa" w:w="25"/>
-              <w:right w:type="dxa" w:w="70"/>
-            </w:tcMar>
-          </w:tcPr>
-          <w:p>
-            <w:r>
-              <w:rPr>
-                <w:rFonts w:ascii="Malgun Gothic" w:cs="Malgun Gothic" w:eastAsia="Malgun Gothic" w:hAnsi="Malgun Gothic"/>
-                <w:b w:val="false"/>
-                <w:bCs w:val="false"/>
-                <w:sz w:val="15"/>
-                <w:szCs w:val="15"/>
-              </w:rPr>
-              <w:t xml:space="preserve">Random-effects</w:t>
-            </w:r>
-          </w:p>
-        </w:tc>
-        <w:tc>
-          <w:tcPr>
-            <w:tcW w:type="dxa" w:w="826"/>
-            <w:tcMar>
-              <w:top w:type="dxa" w:w="25"/>
-              <w:left w:type="dxa" w:w="70"/>
-              <w:bottom w:type="dxa" w:w="25"/>
-              <w:right w:type="dxa" w:w="70"/>
-            </w:tcMar>
-          </w:tcPr>
-          <w:p>
-            <w:r>
-              <w:rPr>
-                <w:rFonts w:ascii="Malgun Gothic" w:cs="Malgun Gothic" w:eastAsia="Malgun Gothic" w:hAnsi="Malgun Gothic"/>
-                <w:b w:val="false"/>
-                <w:bCs w:val="false"/>
-                <w:sz w:val="15"/>
-                <w:szCs w:val="15"/>
-              </w:rPr>
-              <w:t xml:space="preserve">96%</w:t>
-            </w:r>
-          </w:p>
-        </w:tc>
-        <w:tc>
-          <w:tcPr>
-            <w:tcW w:type="dxa" w:w="1062"/>
-            <w:tcMar>
-              <w:top w:type="dxa" w:w="25"/>
-              <w:left w:type="dxa" w:w="70"/>
-              <w:bottom w:type="dxa" w:w="25"/>
-              <w:right w:type="dxa" w:w="70"/>
-            </w:tcMar>
-          </w:tcPr>
-          <w:p>
-            <w:r>
-              <w:rPr>
-                <w:rFonts w:ascii="Malgun Gothic" w:cs="Malgun Gothic" w:eastAsia="Malgun Gothic" w:hAnsi="Malgun Gothic"/>
-                <w:b w:val="false"/>
-                <w:bCs w:val="false"/>
-                <w:sz w:val="15"/>
-                <w:szCs w:val="15"/>
-              </w:rPr>
-              <w:t xml:space="preserve">&lt;0.001</w:t>
-            </w:r>
-          </w:p>
-        </w:tc>
-      </w:tr>
-      <w:tr>
-        <w:tc>
-          <w:tcPr>
-            <w:tcW w:type="dxa" w:w="3423"/>
-            <w:tcMar>
-              <w:top w:type="dxa" w:w="25"/>
-              <w:left w:type="dxa" w:w="70"/>
-              <w:bottom w:type="dxa" w:w="25"/>
-              <w:right w:type="dxa" w:w="70"/>
-            </w:tcMar>
-          </w:tcPr>
-          <w:p>
-            <w:r>
-              <w:rPr>
-                <w:rFonts w:ascii="Malgun Gothic" w:cs="Malgun Gothic" w:eastAsia="Malgun Gothic" w:hAnsi="Malgun Gothic"/>
-                <w:b w:val="false"/>
-                <w:bCs w:val="false"/>
-                <w:sz w:val="15"/>
-                <w:szCs w:val="15"/>
-              </w:rPr>
-              <w:t xml:space="preserve">Overall invasive breast cancer — Hispanic</w:t>
-            </w:r>
-          </w:p>
-        </w:tc>
-        <w:tc>
-          <w:tcPr>
-            <w:tcW w:type="dxa" w:w="2951"/>
-            <w:tcMar>
-              <w:top w:type="dxa" w:w="25"/>
-              <w:left w:type="dxa" w:w="70"/>
-              <w:bottom w:type="dxa" w:w="25"/>
-              <w:right w:type="dxa" w:w="70"/>
-            </w:tcMar>
-          </w:tcPr>
-          <w:p>
-            <w:r>
-              <w:rPr>
-                <w:rFonts w:ascii="Malgun Gothic" w:cs="Malgun Gothic" w:eastAsia="Malgun Gothic" w:hAnsi="Malgun Gothic"/>
-                <w:b w:val="false"/>
-                <w:bCs w:val="false"/>
-                <w:sz w:val="15"/>
-                <w:szCs w:val="15"/>
-              </w:rPr>
-              <w:t xml:space="preserve">0.718 (0.706-0.73)</w:t>
-            </w:r>
-          </w:p>
-        </w:tc>
-        <w:tc>
-          <w:tcPr>
-            <w:tcW w:type="dxa" w:w="2951"/>
-            <w:tcMar>
-              <w:top w:type="dxa" w:w="25"/>
-              <w:left w:type="dxa" w:w="70"/>
-              <w:bottom w:type="dxa" w:w="25"/>
-              <w:right w:type="dxa" w:w="70"/>
-            </w:tcMar>
-          </w:tcPr>
-          <w:p>
-            <w:r>
-              <w:rPr>
-                <w:rFonts w:ascii="Malgun Gothic" w:cs="Malgun Gothic" w:eastAsia="Malgun Gothic" w:hAnsi="Malgun Gothic"/>
-                <w:b w:val="false"/>
-                <w:bCs w:val="false"/>
-                <w:sz w:val="15"/>
-                <w:szCs w:val="15"/>
-              </w:rPr>
-              <w:t xml:space="preserve">0.719 (0.675-0.765)</w:t>
-            </w:r>
-          </w:p>
-        </w:tc>
-        <w:tc>
-          <w:tcPr>
-            <w:tcW w:type="dxa" w:w="1416"/>
-            <w:tcMar>
-              <w:top w:type="dxa" w:w="25"/>
-              <w:left w:type="dxa" w:w="70"/>
-              <w:bottom w:type="dxa" w:w="25"/>
-              <w:right w:type="dxa" w:w="70"/>
-            </w:tcMar>
-          </w:tcPr>
-          <w:p>
-            <w:r>
-              <w:rPr>
-                <w:rFonts w:ascii="Malgun Gothic" w:cs="Malgun Gothic" w:eastAsia="Malgun Gothic" w:hAnsi="Malgun Gothic"/>
-                <w:b w:val="false"/>
-                <w:bCs w:val="false"/>
-                <w:sz w:val="15"/>
-                <w:szCs w:val="15"/>
-              </w:rPr>
-              <w:t xml:space="preserve">7</w:t>
-            </w:r>
-          </w:p>
-        </w:tc>
-        <w:tc>
-          <w:tcPr>
-            <w:tcW w:type="dxa" w:w="1770"/>
-            <w:tcMar>
-              <w:top w:type="dxa" w:w="25"/>
-              <w:left w:type="dxa" w:w="70"/>
-              <w:bottom w:type="dxa" w:w="25"/>
-              <w:right w:type="dxa" w:w="70"/>
-            </w:tcMar>
-          </w:tcPr>
-          <w:p>
-            <w:r>
-              <w:rPr>
-                <w:rFonts w:ascii="Malgun Gothic" w:cs="Malgun Gothic" w:eastAsia="Malgun Gothic" w:hAnsi="Malgun Gothic"/>
-                <w:b w:val="false"/>
-                <w:bCs w:val="false"/>
-                <w:sz w:val="15"/>
-                <w:szCs w:val="15"/>
-              </w:rPr>
-              <w:t xml:space="preserve">Random-effects</w:t>
-            </w:r>
-          </w:p>
-        </w:tc>
-        <w:tc>
-          <w:tcPr>
-            <w:tcW w:type="dxa" w:w="826"/>
-            <w:tcMar>
-              <w:top w:type="dxa" w:w="25"/>
-              <w:left w:type="dxa" w:w="70"/>
-              <w:bottom w:type="dxa" w:w="25"/>
-              <w:right w:type="dxa" w:w="70"/>
-            </w:tcMar>
-          </w:tcPr>
-          <w:p>
-            <w:r>
-              <w:rPr>
-                <w:rFonts w:ascii="Malgun Gothic" w:cs="Malgun Gothic" w:eastAsia="Malgun Gothic" w:hAnsi="Malgun Gothic"/>
-                <w:b w:val="false"/>
-                <w:bCs w:val="false"/>
-                <w:sz w:val="15"/>
-                <w:szCs w:val="15"/>
-              </w:rPr>
-              <w:t xml:space="preserve">99%</w:t>
-            </w:r>
-          </w:p>
-        </w:tc>
-        <w:tc>
-          <w:tcPr>
-            <w:tcW w:type="dxa" w:w="1062"/>
-            <w:tcMar>
-              <w:top w:type="dxa" w:w="25"/>
-              <w:left w:type="dxa" w:w="70"/>
-              <w:bottom w:type="dxa" w:w="25"/>
-              <w:right w:type="dxa" w:w="70"/>
-            </w:tcMar>
-          </w:tcPr>
-          <w:p>
-            <w:r>
-              <w:rPr>
-                <w:rFonts w:ascii="Malgun Gothic" w:cs="Malgun Gothic" w:eastAsia="Malgun Gothic" w:hAnsi="Malgun Gothic"/>
-                <w:b w:val="false"/>
-                <w:bCs w:val="false"/>
-                <w:sz w:val="15"/>
-                <w:szCs w:val="15"/>
-              </w:rPr>
-              <w:t xml:space="preserve">&lt;0.001</w:t>
-            </w:r>
-          </w:p>
-        </w:tc>
-      </w:tr>
-      <w:tr>
-        <w:tc>
-          <w:tcPr>
-            <w:tcW w:type="dxa" w:w="3423"/>
-            <w:tcMar>
-              <w:top w:type="dxa" w:w="25"/>
-              <w:left w:type="dxa" w:w="70"/>
-              <w:bottom w:type="dxa" w:w="25"/>
-              <w:right w:type="dxa" w:w="70"/>
-            </w:tcMar>
-          </w:tcPr>
-          <w:p>
-            <w:r>
-              <w:rPr>
-                <w:rFonts w:ascii="Malgun Gothic" w:cs="Malgun Gothic" w:eastAsia="Malgun Gothic" w:hAnsi="Malgun Gothic"/>
-                <w:b w:val="false"/>
-                <w:bCs w:val="false"/>
-                <w:sz w:val="15"/>
-                <w:szCs w:val="15"/>
-              </w:rPr>
-              <w:t xml:space="preserve">Overall invasive breast cancer — Asian and Pacific Islander (API)</w:t>
-            </w:r>
-          </w:p>
-        </w:tc>
-        <w:tc>
-          <w:tcPr>
-            <w:tcW w:type="dxa" w:w="2951"/>
-            <w:tcMar>
-              <w:top w:type="dxa" w:w="25"/>
-              <w:left w:type="dxa" w:w="70"/>
-              <w:bottom w:type="dxa" w:w="25"/>
-              <w:right w:type="dxa" w:w="70"/>
-            </w:tcMar>
-          </w:tcPr>
-          <w:p>
-            <w:r>
-              <w:rPr>
-                <w:rFonts w:ascii="Malgun Gothic" w:cs="Malgun Gothic" w:eastAsia="Malgun Gothic" w:hAnsi="Malgun Gothic"/>
-                <w:b w:val="false"/>
-                <w:bCs w:val="false"/>
-                <w:sz w:val="15"/>
-                <w:szCs w:val="15"/>
-              </w:rPr>
-              <w:t xml:space="preserve">0.769 (0.751-0.787)</w:t>
-            </w:r>
-          </w:p>
-        </w:tc>
-        <w:tc>
-          <w:tcPr>
-            <w:tcW w:type="dxa" w:w="2951"/>
-            <w:tcMar>
-              <w:top w:type="dxa" w:w="25"/>
-              <w:left w:type="dxa" w:w="70"/>
-              <w:bottom w:type="dxa" w:w="25"/>
-              <w:right w:type="dxa" w:w="70"/>
-            </w:tcMar>
-          </w:tcPr>
-          <w:p>
-            <w:r>
-              <w:rPr>
-                <w:rFonts w:ascii="Malgun Gothic" w:cs="Malgun Gothic" w:eastAsia="Malgun Gothic" w:hAnsi="Malgun Gothic"/>
-                <w:b w:val="false"/>
-                <w:bCs w:val="false"/>
-                <w:sz w:val="15"/>
-                <w:szCs w:val="15"/>
-              </w:rPr>
-              <w:t xml:space="preserve">0.798 (0.724-0.878)</w:t>
-            </w:r>
-          </w:p>
-        </w:tc>
-        <w:tc>
-          <w:tcPr>
-            <w:tcW w:type="dxa" w:w="1416"/>
-            <w:tcMar>
-              <w:top w:type="dxa" w:w="25"/>
-              <w:left w:type="dxa" w:w="70"/>
-              <w:bottom w:type="dxa" w:w="25"/>
-              <w:right w:type="dxa" w:w="70"/>
-            </w:tcMar>
-          </w:tcPr>
-          <w:p>
-            <w:r>
-              <w:rPr>
-                <w:rFonts w:ascii="Malgun Gothic" w:cs="Malgun Gothic" w:eastAsia="Malgun Gothic" w:hAnsi="Malgun Gothic"/>
-                <w:b w:val="false"/>
-                <w:bCs w:val="false"/>
-                <w:sz w:val="15"/>
-                <w:szCs w:val="15"/>
-              </w:rPr>
-              <w:t xml:space="preserve">6</w:t>
-            </w:r>
-          </w:p>
-        </w:tc>
-        <w:tc>
-          <w:tcPr>
-            <w:tcW w:type="dxa" w:w="1770"/>
-            <w:tcMar>
-              <w:top w:type="dxa" w:w="25"/>
-              <w:left w:type="dxa" w:w="70"/>
-              <w:bottom w:type="dxa" w:w="25"/>
-              <w:right w:type="dxa" w:w="70"/>
-            </w:tcMar>
-          </w:tcPr>
-          <w:p>
-            <w:r>
-              <w:rPr>
-                <w:rFonts w:ascii="Malgun Gothic" w:cs="Malgun Gothic" w:eastAsia="Malgun Gothic" w:hAnsi="Malgun Gothic"/>
-                <w:b w:val="false"/>
-                <w:bCs w:val="false"/>
-                <w:sz w:val="15"/>
-                <w:szCs w:val="15"/>
-              </w:rPr>
-              <w:t xml:space="preserve">Random-effects</w:t>
-            </w:r>
-          </w:p>
-        </w:tc>
-        <w:tc>
-          <w:tcPr>
-            <w:tcW w:type="dxa" w:w="826"/>
-            <w:tcMar>
-              <w:top w:type="dxa" w:w="25"/>
-              <w:left w:type="dxa" w:w="70"/>
-              <w:bottom w:type="dxa" w:w="25"/>
-              <w:right w:type="dxa" w:w="70"/>
-            </w:tcMar>
-          </w:tcPr>
-          <w:p>
-            <w:r>
-              <w:rPr>
-                <w:rFonts w:ascii="Malgun Gothic" w:cs="Malgun Gothic" w:eastAsia="Malgun Gothic" w:hAnsi="Malgun Gothic"/>
-                <w:b w:val="false"/>
-                <w:bCs w:val="false"/>
-                <w:sz w:val="15"/>
-                <w:szCs w:val="15"/>
-              </w:rPr>
-              <w:t xml:space="preserve">100%</w:t>
-            </w:r>
-          </w:p>
-        </w:tc>
-        <w:tc>
-          <w:tcPr>
-            <w:tcW w:type="dxa" w:w="1062"/>
-            <w:tcMar>
-              <w:top w:type="dxa" w:w="25"/>
-              <w:left w:type="dxa" w:w="70"/>
-              <w:bottom w:type="dxa" w:w="25"/>
-              <w:right w:type="dxa" w:w="70"/>
-            </w:tcMar>
-          </w:tcPr>
-          <w:p>
-            <w:r>
-              <w:rPr>
-                <w:rFonts w:ascii="Malgun Gothic" w:cs="Malgun Gothic" w:eastAsia="Malgun Gothic" w:hAnsi="Malgun Gothic"/>
-                <w:b w:val="false"/>
-                <w:bCs w:val="false"/>
-                <w:sz w:val="15"/>
-                <w:szCs w:val="15"/>
-              </w:rPr>
-              <w:t xml:space="preserve">&lt;0.001</w:t>
-            </w:r>
-          </w:p>
-        </w:tc>
-      </w:tr>
-      <w:tr>
-        <w:tc>
-          <w:tcPr>
-            <w:tcW w:type="dxa" w:w="3423"/>
-            <w:tcMar>
-              <w:top w:type="dxa" w:w="25"/>
-              <w:left w:type="dxa" w:w="70"/>
-              <w:bottom w:type="dxa" w:w="25"/>
-              <w:right w:type="dxa" w:w="70"/>
-            </w:tcMar>
-          </w:tcPr>
-          <w:p>
-            <w:r>
-              <w:rPr>
-                <w:rFonts w:ascii="Malgun Gothic" w:cs="Malgun Gothic" w:eastAsia="Malgun Gothic" w:hAnsi="Malgun Gothic"/>
-                <w:b w:val="false"/>
-                <w:bCs w:val="false"/>
-                <w:sz w:val="15"/>
-                <w:szCs w:val="15"/>
-              </w:rPr>
-              <w:t xml:space="preserve">Overall invasive breast cancer — AIAN</w:t>
-            </w:r>
-          </w:p>
-        </w:tc>
-        <w:tc>
-          <w:tcPr>
-            <w:tcW w:type="dxa" w:w="2951"/>
-            <w:tcMar>
-              <w:top w:type="dxa" w:w="25"/>
-              <w:left w:type="dxa" w:w="70"/>
-              <w:bottom w:type="dxa" w:w="25"/>
-              <w:right w:type="dxa" w:w="70"/>
-            </w:tcMar>
-          </w:tcPr>
-          <w:p>
-            <w:r>
-              <w:rPr>
-                <w:rFonts w:ascii="Malgun Gothic" w:cs="Malgun Gothic" w:eastAsia="Malgun Gothic" w:hAnsi="Malgun Gothic"/>
-                <w:b w:val="false"/>
-                <w:bCs w:val="false"/>
-                <w:sz w:val="15"/>
-                <w:szCs w:val="15"/>
-              </w:rPr>
-              <w:t xml:space="preserve">0.56 (0.55-0.57)</w:t>
-            </w:r>
-          </w:p>
-        </w:tc>
-        <w:tc>
-          <w:tcPr>
-            <w:tcW w:type="dxa" w:w="2951"/>
-            <w:tcMar>
-              <w:top w:type="dxa" w:w="25"/>
-              <w:left w:type="dxa" w:w="70"/>
-              <w:bottom w:type="dxa" w:w="25"/>
-              <w:right w:type="dxa" w:w="70"/>
-            </w:tcMar>
-          </w:tcPr>
-          <w:p>
-            <w:r>
-              <w:rPr>
-                <w:rFonts w:ascii="Malgun Gothic" w:cs="Malgun Gothic" w:eastAsia="Malgun Gothic" w:hAnsi="Malgun Gothic"/>
-                <w:b w:val="false"/>
-                <w:bCs w:val="false"/>
-                <w:sz w:val="15"/>
-                <w:szCs w:val="15"/>
-              </w:rPr>
-              <w:t xml:space="preserve">0.695 (0.603-0.802)</w:t>
-            </w:r>
-          </w:p>
-        </w:tc>
-        <w:tc>
-          <w:tcPr>
-            <w:tcW w:type="dxa" w:w="1416"/>
-            <w:tcMar>
-              <w:top w:type="dxa" w:w="25"/>
-              <w:left w:type="dxa" w:w="70"/>
-              <w:bottom w:type="dxa" w:w="25"/>
-              <w:right w:type="dxa" w:w="70"/>
-            </w:tcMar>
-          </w:tcPr>
-          <w:p>
-            <w:r>
-              <w:rPr>
-                <w:rFonts w:ascii="Malgun Gothic" w:cs="Malgun Gothic" w:eastAsia="Malgun Gothic" w:hAnsi="Malgun Gothic"/>
-                <w:b w:val="false"/>
-                <w:bCs w:val="false"/>
-                <w:sz w:val="15"/>
-                <w:szCs w:val="15"/>
-              </w:rPr>
-              <w:t xml:space="preserve">7</w:t>
-            </w:r>
-          </w:p>
-        </w:tc>
-        <w:tc>
-          <w:tcPr>
-            <w:tcW w:type="dxa" w:w="1770"/>
-            <w:tcMar>
-              <w:top w:type="dxa" w:w="25"/>
-              <w:left w:type="dxa" w:w="70"/>
-              <w:bottom w:type="dxa" w:w="25"/>
-              <w:right w:type="dxa" w:w="70"/>
-            </w:tcMar>
-          </w:tcPr>
-          <w:p>
-            <w:r>
-              <w:rPr>
-                <w:rFonts w:ascii="Malgun Gothic" w:cs="Malgun Gothic" w:eastAsia="Malgun Gothic" w:hAnsi="Malgun Gothic"/>
-                <w:b w:val="false"/>
-                <w:bCs w:val="false"/>
-                <w:sz w:val="15"/>
-                <w:szCs w:val="15"/>
-              </w:rPr>
-              <w:t xml:space="preserve">Random-effects</w:t>
-            </w:r>
-          </w:p>
-        </w:tc>
-        <w:tc>
-          <w:tcPr>
-            <w:tcW w:type="dxa" w:w="826"/>
-            <w:tcMar>
-              <w:top w:type="dxa" w:w="25"/>
-              <w:left w:type="dxa" w:w="70"/>
-              <w:bottom w:type="dxa" w:w="25"/>
-              <w:right w:type="dxa" w:w="70"/>
-            </w:tcMar>
-          </w:tcPr>
-          <w:p>
-            <w:r>
-              <w:rPr>
-                <w:rFonts w:ascii="Malgun Gothic" w:cs="Malgun Gothic" w:eastAsia="Malgun Gothic" w:hAnsi="Malgun Gothic"/>
-                <w:b w:val="false"/>
-                <w:bCs w:val="false"/>
-                <w:sz w:val="15"/>
-                <w:szCs w:val="15"/>
-              </w:rPr>
-              <w:t xml:space="preserve">99%</w:t>
-            </w:r>
-          </w:p>
-        </w:tc>
-        <w:tc>
-          <w:tcPr>
-            <w:tcW w:type="dxa" w:w="1062"/>
-            <w:tcMar>
-              <w:top w:type="dxa" w:w="25"/>
-              <w:left w:type="dxa" w:w="70"/>
-              <w:bottom w:type="dxa" w:w="25"/>
-              <w:right w:type="dxa" w:w="70"/>
-            </w:tcMar>
-          </w:tcPr>
-          <w:p>
-            <w:r>
-              <w:rPr>
-                <w:rFonts w:ascii="Malgun Gothic" w:cs="Malgun Gothic" w:eastAsia="Malgun Gothic" w:hAnsi="Malgun Gothic"/>
-                <w:b w:val="false"/>
-                <w:bCs w:val="false"/>
-                <w:sz w:val="15"/>
-                <w:szCs w:val="15"/>
-              </w:rPr>
-              <w:t xml:space="preserve">&lt;0.001</w:t>
-            </w:r>
-          </w:p>
-        </w:tc>
-      </w:tr>
-      <w:tr>
-        <w:tc>
-          <w:tcPr>
-            <w:tcW w:type="dxa" w:w="3423"/>
-            <w:tcMar>
-              <w:top w:type="dxa" w:w="25"/>
-              <w:left w:type="dxa" w:w="70"/>
-              <w:bottom w:type="dxa" w:w="25"/>
-              <w:right w:type="dxa" w:w="70"/>
-            </w:tcMar>
-          </w:tcPr>
-          <w:p>
-            <w:r>
-              <w:rPr>
-                <w:rFonts w:ascii="Malgun Gothic" w:cs="Malgun Gothic" w:eastAsia="Malgun Gothic" w:hAnsi="Malgun Gothic"/>
-                <w:b w:val="false"/>
-                <w:bCs w:val="false"/>
-                <w:sz w:val="15"/>
-                <w:szCs w:val="15"/>
-              </w:rPr>
-              <w:t xml:space="preserve">Triple-negative — Black</w:t>
-            </w:r>
-          </w:p>
-        </w:tc>
-        <w:tc>
-          <w:tcPr>
-            <w:tcW w:type="dxa" w:w="2951"/>
-            <w:tcMar>
-              <w:top w:type="dxa" w:w="25"/>
-              <w:left w:type="dxa" w:w="70"/>
-              <w:bottom w:type="dxa" w:w="25"/>
-              <w:right w:type="dxa" w:w="70"/>
-            </w:tcMar>
-          </w:tcPr>
-          <w:p>
-            <w:r>
-              <w:rPr>
-                <w:rFonts w:ascii="Malgun Gothic" w:cs="Malgun Gothic" w:eastAsia="Malgun Gothic" w:hAnsi="Malgun Gothic"/>
-                <w:b w:val="false"/>
-                <w:bCs w:val="false"/>
-                <w:sz w:val="15"/>
-                <w:szCs w:val="15"/>
-              </w:rPr>
-              <w:t xml:space="preserve">1.95 (1.925-1.975)</w:t>
-            </w:r>
-          </w:p>
-        </w:tc>
-        <w:tc>
-          <w:tcPr>
-            <w:tcW w:type="dxa" w:w="2951"/>
-            <w:tcMar>
-              <w:top w:type="dxa" w:w="25"/>
-              <w:left w:type="dxa" w:w="70"/>
-              <w:bottom w:type="dxa" w:w="25"/>
-              <w:right w:type="dxa" w:w="70"/>
-            </w:tcMar>
-          </w:tcPr>
-          <w:p>
-            <w:r>
-              <w:rPr>
-                <w:rFonts w:ascii="Malgun Gothic" w:cs="Malgun Gothic" w:eastAsia="Malgun Gothic" w:hAnsi="Malgun Gothic"/>
-                <w:b w:val="false"/>
-                <w:bCs w:val="false"/>
-                <w:sz w:val="15"/>
-                <w:szCs w:val="15"/>
-              </w:rPr>
-              <w:t xml:space="preserve">1.968 (1.815-2.134)</w:t>
-            </w:r>
-          </w:p>
-        </w:tc>
-        <w:tc>
-          <w:tcPr>
-            <w:tcW w:type="dxa" w:w="1416"/>
-            <w:tcMar>
-              <w:top w:type="dxa" w:w="25"/>
-              <w:left w:type="dxa" w:w="70"/>
-              <w:bottom w:type="dxa" w:w="25"/>
-              <w:right w:type="dxa" w:w="70"/>
-            </w:tcMar>
-          </w:tcPr>
-          <w:p>
-            <w:r>
-              <w:rPr>
-                <w:rFonts w:ascii="Malgun Gothic" w:cs="Malgun Gothic" w:eastAsia="Malgun Gothic" w:hAnsi="Malgun Gothic"/>
-                <w:b w:val="false"/>
-                <w:bCs w:val="false"/>
-                <w:sz w:val="15"/>
-                <w:szCs w:val="15"/>
-              </w:rPr>
-              <w:t xml:space="preserve">4</w:t>
-            </w:r>
-          </w:p>
-        </w:tc>
-        <w:tc>
-          <w:tcPr>
-            <w:tcW w:type="dxa" w:w="1770"/>
-            <w:tcMar>
-              <w:top w:type="dxa" w:w="25"/>
-              <w:left w:type="dxa" w:w="70"/>
-              <w:bottom w:type="dxa" w:w="25"/>
-              <w:right w:type="dxa" w:w="70"/>
-            </w:tcMar>
-          </w:tcPr>
-          <w:p>
-            <w:r>
-              <w:rPr>
-                <w:rFonts w:ascii="Malgun Gothic" w:cs="Malgun Gothic" w:eastAsia="Malgun Gothic" w:hAnsi="Malgun Gothic"/>
-                <w:b w:val="false"/>
-                <w:bCs w:val="false"/>
-                <w:sz w:val="15"/>
-                <w:szCs w:val="15"/>
-              </w:rPr>
-              <w:t xml:space="preserve">Random-effects</w:t>
-            </w:r>
-          </w:p>
-        </w:tc>
-        <w:tc>
-          <w:tcPr>
-            <w:tcW w:type="dxa" w:w="826"/>
-            <w:tcMar>
-              <w:top w:type="dxa" w:w="25"/>
-              <w:left w:type="dxa" w:w="70"/>
-              <w:bottom w:type="dxa" w:w="25"/>
-              <w:right w:type="dxa" w:w="70"/>
-            </w:tcMar>
-          </w:tcPr>
-          <w:p>
-            <w:r>
-              <w:rPr>
-                <w:rFonts w:ascii="Malgun Gothic" w:cs="Malgun Gothic" w:eastAsia="Malgun Gothic" w:hAnsi="Malgun Gothic"/>
-                <w:b w:val="false"/>
-                <w:bCs w:val="false"/>
-                <w:sz w:val="15"/>
-                <w:szCs w:val="15"/>
-              </w:rPr>
-              <w:t xml:space="preserve">84%</w:t>
-            </w:r>
-          </w:p>
-        </w:tc>
-        <w:tc>
-          <w:tcPr>
-            <w:tcW w:type="dxa" w:w="1062"/>
-            <w:tcMar>
-              <w:top w:type="dxa" w:w="25"/>
-              <w:left w:type="dxa" w:w="70"/>
-              <w:bottom w:type="dxa" w:w="25"/>
-              <w:right w:type="dxa" w:w="70"/>
-            </w:tcMar>
-          </w:tcPr>
-          <w:p>
-            <w:r>
-              <w:rPr>
-                <w:rFonts w:ascii="Malgun Gothic" w:cs="Malgun Gothic" w:eastAsia="Malgun Gothic" w:hAnsi="Malgun Gothic"/>
-                <w:b w:val="false"/>
-                <w:bCs w:val="false"/>
-                <w:sz w:val="15"/>
-                <w:szCs w:val="15"/>
-              </w:rPr>
-              <w:t xml:space="preserve">&lt;0.001</w:t>
-            </w:r>
-          </w:p>
-        </w:tc>
-      </w:tr>
-    </w:tbl>
-    <w:p>
-      <w:pPr>
-        <w:spacing w:after="80"/>
-      </w:pPr>
-    </w:p>
-    <w:p>
-      <w:pPr>
-        <w:spacing w:after="80"/>
-      </w:pPr>
-      <w:r>
-        <w:rPr>
-          <w:rFonts w:ascii="Malgun Gothic" w:cs="Malgun Gothic" w:eastAsia="Malgun Gothic" w:hAnsi="Malgun Gothic"/>
-          <w:i/>
-          <w:iCs/>
-          <w:sz w:val="18"/>
-          <w:szCs w:val="18"/>
-        </w:rPr>
-        <w:t xml:space="preserve">AIAN main analysis uses the Indian Health Service–linked (undercount-corrected) representative; the higher unlinked SEER value (0.71) enters only the sensitivity pool. Main and sensitivity estimates agree closely in direction for all groups. No. of estimates / I² / Q p are properties of the sensitivity pool only.</w:t>
-      </w:r>
     </w:p>
     <w:p>
       <w:r>

</xml_diff>

<commit_message>
Unify terminology: AANHPI aggregate and non-Hispanic Black (NHB)
Standardize the Asian/Pacific Islander aggregate to AANHPI (Asian
American, Native Hawaiian, and Pacific Islander) matching the
disaggregated section and the current scientific umbrella (older sources
term the same population API); keep NHPI for the Pacific-Islander subset.
Label Black as non-Hispanic Black (NHB), parallel to the NHW comparator.
Update labels.py (global) and the forest_pooled hardcoded labels. Add a
terminology footnote to main Table 1 and Supplementary Table 4 noting
that five older non-stratified sources (Anderson 2008, Brinton 2008,
Gleason 2012, Cronin 2012, Richardson 2016) use non-Hispanic-unstratified
Black/White and are never headline representatives (Feedback #7).

Co-Authored-By: Claude Opus 4.8 <noreply@anthropic.com>
Claude-Session: https://claude.ai/code/session_01CuLT4FKRBtsU22Vwfjj2qn
</commit_message>
<xml_diff>
--- a/meta_agents/search_v2/outputs/Main_Text_Tables_Figures.docx
+++ b/meta_agents/search_v2/outputs/Main_Text_Tables_Figures.docx
@@ -60,7 +60,7 @@
           <w:sz w:val="18"/>
           <w:szCs w:val="18"/>
         </w:rPr>
-        <w:t xml:space="preserve">One representative estimate per group (one estimate per registry family). Effect measure is the incidence rate ratio (IRR) unless noted as a standardized incidence ratio (SIR). RoB = Newcastle-Ottawa rating of the representative study; GRADE = certainty of evidence. Full per-estimate detail is in the Supplementary Materials.</w:t>
+        <w:t xml:space="preserve">One representative estimate per group (one estimate per registry family). Effect measure is the incidence rate ratio (IRR) unless noted as a standardized incidence ratio (SIR). Comparisons are versus non-Hispanic White (NHW) women; Black denotes non-Hispanic Black (NHB), and the Asian/Pacific Islander aggregate is labeled AANHPI (Asian American, Native Hawaiian, and Pacific Islander), with the Pacific-Islander subset shown separately as NHPI. RoB = Newcastle-Ottawa rating of the representative study; GRADE = certainty of evidence. Full per-estimate detail is in the Supplementary Materials.</w:t>
       </w:r>
     </w:p>
     <w:tbl>
@@ -630,7 +630,7 @@
                 <w:sz w:val="15"/>
                 <w:szCs w:val="15"/>
               </w:rPr>
-              <w:t xml:space="preserve">Asian and Pacific Islander (API)</w:t>
+              <w:t xml:space="preserve">Asian American, Native Hawaiian, and Pacific Islander (AANHPI)</w:t>
             </w:r>
           </w:p>
         </w:tc>
@@ -793,7 +793,7 @@
                 <w:sz w:val="15"/>
                 <w:szCs w:val="15"/>
               </w:rPr>
-              <w:t xml:space="preserve">Black</w:t>
+              <w:t xml:space="preserve">non-Hispanic Black (NHB)</w:t>
             </w:r>
           </w:p>
         </w:tc>
@@ -5492,7 +5492,7 @@
                 <w:sz w:val="15"/>
                 <w:szCs w:val="15"/>
               </w:rPr>
-              <w:t xml:space="preserve">Asian and Pacific Islander (API)</w:t>
+              <w:t xml:space="preserve">Asian American, Native Hawaiian, and Pacific Islander (AANHPI)</w:t>
             </w:r>
           </w:p>
         </w:tc>
@@ -6307,7 +6307,7 @@
                 <w:sz w:val="15"/>
                 <w:szCs w:val="15"/>
               </w:rPr>
-              <w:t xml:space="preserve">Black</w:t>
+              <w:t xml:space="preserve">non-Hispanic Black (NHB)</w:t>
             </w:r>
           </w:p>
         </w:tc>

</xml_diff>

<commit_message>
Unify AIAN label to American Indian and Alaska Native (AI/AN)
Map the AIAN group (and its region subgroups, e.g. AI/AN (Navajo)) to the
standard umbrella in labels.py and the forest_pooled/Table 1 headers. No
'non-Hispanic' prefix: the headline representative is IHS-linked (tribal/
IHS enrollment), where undercount correction, not Hispanic stratification,
is the salient issue. Main-text analytic labels now carry no bare 'AIAN';
remaining occurrences are informal coverage descriptions in the
characteristics table's Groups-vs-NHW column.

Co-Authored-By: Claude Opus 4.8 <noreply@anthropic.com>
Claude-Session: https://claude.ai/code/session_01CuLT4FKRBtsU22Vwfjj2qn
</commit_message>
<xml_diff>
--- a/meta_agents/search_v2/outputs/Main_Text_Tables_Figures.docx
+++ b/meta_agents/search_v2/outputs/Main_Text_Tables_Figures.docx
@@ -304,7 +304,7 @@
                 <w:sz w:val="15"/>
                 <w:szCs w:val="15"/>
               </w:rPr>
-              <w:t xml:space="preserve">AIAN</w:t>
+              <w:t xml:space="preserve">American Indian and Alaska Native (AI/AN)</w:t>
             </w:r>
           </w:p>
         </w:tc>
@@ -4272,7 +4272,7 @@
                 <w:sz w:val="16"/>
                 <w:szCs w:val="16"/>
               </w:rPr>
-              <w:t xml:space="preserve">American Indian / Alaska Native by region</w:t>
+              <w:t xml:space="preserve">American Indian and Alaska Native (AI/AN) by region</w:t>
             </w:r>
           </w:p>
         </w:tc>
@@ -4297,7 +4297,7 @@
                 <w:sz w:val="15"/>
                 <w:szCs w:val="15"/>
               </w:rPr>
-              <w:t xml:space="preserve">AIAN (Navajo)</w:t>
+              <w:t xml:space="preserve">AI/AN (Navajo)</w:t>
             </w:r>
           </w:p>
         </w:tc>
@@ -4460,7 +4460,7 @@
                 <w:sz w:val="15"/>
                 <w:szCs w:val="15"/>
               </w:rPr>
-              <w:t xml:space="preserve">AIAN</w:t>
+              <w:t xml:space="preserve">American Indian and Alaska Native (AI/AN)</w:t>
             </w:r>
           </w:p>
         </w:tc>
@@ -4623,7 +4623,7 @@
                 <w:sz w:val="15"/>
                 <w:szCs w:val="15"/>
               </w:rPr>
-              <w:t xml:space="preserve">AIAN (Southern Plains, provisional)</w:t>
+              <w:t xml:space="preserve">AI/AN (Southern Plains, provisional)</w:t>
             </w:r>
           </w:p>
         </w:tc>
@@ -4786,7 +4786,7 @@
                 <w:sz w:val="15"/>
                 <w:szCs w:val="15"/>
               </w:rPr>
-              <w:t xml:space="preserve">AIAN (Northern Plains, provisional)</w:t>
+              <w:t xml:space="preserve">AI/AN (Northern Plains, provisional)</w:t>
             </w:r>
           </w:p>
         </w:tc>
@@ -5818,7 +5818,7 @@
                 <w:sz w:val="15"/>
                 <w:szCs w:val="15"/>
               </w:rPr>
-              <w:t xml:space="preserve">AIAN</w:t>
+              <w:t xml:space="preserve">American Indian and Alaska Native (AI/AN)</w:t>
             </w:r>
           </w:p>
         </w:tc>

</xml_diff>

<commit_message>
Verify Melkonian 2021 AI/AN region labels; drop 'provisional' flag
'provisional' flagged that the IHS-region attribution of the Melkonian
2021 breast-cancer estimates was not yet confirmed against the source.
Verified against the PDF: Southern Plains AI/AN 151.0 (n=373) vs NHW 121.0
(n=1488) -> 1.25 [1.11, 1.41]; Northern Plains 158.7 (n=1337) vs 119
(n=11905) -> 1.33 [1.26, 1.41] — region assignment, rates, counts, and CIs
all match. Removed the provisional flag from the group labels; the
regional AI/AN excess (>1) versus the low national aggregate (0.56) is
confirmed, not tentative.

Co-Authored-By: Claude Opus 4.8 <noreply@anthropic.com>
Claude-Session: https://claude.ai/code/session_01CuLT4FKRBtsU22Vwfjj2qn
</commit_message>
<xml_diff>
--- a/meta_agents/search_v2/outputs/Main_Text_Tables_Figures.docx
+++ b/meta_agents/search_v2/outputs/Main_Text_Tables_Figures.docx
@@ -4623,7 +4623,7 @@
                 <w:sz w:val="15"/>
                 <w:szCs w:val="15"/>
               </w:rPr>
-              <w:t xml:space="preserve">AI/AN (Southern Plains, provisional)</w:t>
+              <w:t xml:space="preserve">AI/AN (Southern Plains)</w:t>
             </w:r>
           </w:p>
         </w:tc>
@@ -4786,7 +4786,7 @@
                 <w:sz w:val="15"/>
                 <w:szCs w:val="15"/>
               </w:rPr>
-              <w:t xml:space="preserve">AI/AN (Northern Plains, provisional)</w:t>
+              <w:t xml:space="preserve">AI/AN (Northern Plains)</w:t>
             </w:r>
           </w:p>
         </w:tc>

</xml_diff>

<commit_message>
Drop age-restricted 'young' subgroups from disaggregation; put aggregate rows last
(A) Exclude the age-restricted 'Japanese (young)'/'Filipino (young)'
estimates (Gomez 2017) from the all-age disaggregated synthesis — they
conflate age with ethnicity — via a filter in finalize_representatives, so
they leave Table 1, the forests, GRADE, sensitivity, and the representative
table consistently (rows kept in the ledger for provenance). The young
finding (young Asian American incidence approaching NHW) can be stated
narratively. (B) In Table 1's disaggregated section, sort subgroups by IRR
but place the aggregate summary rows (Asian American, NHPI) at the bottom.

Co-Authored-By: Claude Opus 4.8 <noreply@anthropic.com>
Claude-Session: https://claude.ai/code/session_01CuLT4FKRBtsU22Vwfjj2qn
</commit_message>
<xml_diff>
--- a/meta_agents/search_v2/outputs/Main_Text_Tables_Figures.docx
+++ b/meta_agents/search_v2/outputs/Main_Text_Tables_Figures.docx
@@ -630,7 +630,7 @@
                 <w:sz w:val="15"/>
                 <w:szCs w:val="15"/>
               </w:rPr>
-              <w:t xml:space="preserve">Asian American, Native Hawaiian, and Pacific Islander (AANHPI)</w:t>
+              <w:t xml:space="preserve">non-Hispanic Black (NHB)</w:t>
             </w:r>
           </w:p>
         </w:tc>
@@ -676,7 +676,7 @@
                 <w:sz w:val="15"/>
                 <w:szCs w:val="15"/>
               </w:rPr>
-              <w:t xml:space="preserve">0.769 [0.752, 0.788]</w:t>
+              <w:t xml:space="preserve">0.933 [0.920, 0.946]</w:t>
             </w:r>
           </w:p>
         </w:tc>
@@ -793,7 +793,7 @@
                 <w:sz w:val="15"/>
                 <w:szCs w:val="15"/>
               </w:rPr>
-              <w:t xml:space="preserve">non-Hispanic Black (NHB)</w:t>
+              <w:t xml:space="preserve">Asian American, Native Hawaiian, and Pacific Islander (AANHPI)</w:t>
             </w:r>
           </w:p>
         </w:tc>
@@ -839,7 +839,7 @@
                 <w:sz w:val="15"/>
                 <w:szCs w:val="15"/>
               </w:rPr>
-              <w:t xml:space="preserve">0.933 [0.920, 0.946]</w:t>
+              <w:t xml:space="preserve">0.769 [0.752, 0.788]</w:t>
             </w:r>
           </w:p>
         </w:tc>
@@ -2124,7 +2124,7 @@
                 <w:sz w:val="15"/>
                 <w:szCs w:val="15"/>
               </w:rPr>
-              <w:t xml:space="preserve">Asian American (aggregate)</w:t>
+              <w:t xml:space="preserve">Filipina</w:t>
             </w:r>
           </w:p>
         </w:tc>
@@ -2170,7 +2170,7 @@
                 <w:sz w:val="15"/>
                 <w:szCs w:val="15"/>
               </w:rPr>
-              <w:t xml:space="preserve">0.792 [0.784, 0.800]</w:t>
+              <w:t xml:space="preserve">0.857 [0.839, 0.874]</w:t>
             </w:r>
           </w:p>
         </w:tc>
@@ -2287,7 +2287,7 @@
                 <w:sz w:val="15"/>
                 <w:szCs w:val="15"/>
               </w:rPr>
-              <w:t xml:space="preserve">Filipina</w:t>
+              <w:t xml:space="preserve">Asian Indian/Pakistani</w:t>
             </w:r>
           </w:p>
         </w:tc>
@@ -2333,7 +2333,7 @@
                 <w:sz w:val="15"/>
                 <w:szCs w:val="15"/>
               </w:rPr>
-              <w:t xml:space="preserve">0.857 [0.839, 0.874]</w:t>
+              <w:t xml:space="preserve">0.958 [0.937, 0.979]</w:t>
             </w:r>
           </w:p>
         </w:tc>
@@ -2450,7 +2450,7 @@
                 <w:sz w:val="15"/>
                 <w:szCs w:val="15"/>
               </w:rPr>
-              <w:t xml:space="preserve">Filipino (young)</w:t>
+              <w:t xml:space="preserve">Japanese</w:t>
             </w:r>
           </w:p>
         </w:tc>
@@ -2496,7 +2496,7 @@
                 <w:sz w:val="15"/>
                 <w:szCs w:val="15"/>
               </w:rPr>
-              <w:t xml:space="preserve">0.95 [0.90, 1.01]</w:t>
+              <w:t xml:space="preserve">1.045 [1.009, 1.083]</w:t>
             </w:r>
           </w:p>
         </w:tc>
@@ -2519,7 +2519,7 @@
                 <w:sz w:val="15"/>
                 <w:szCs w:val="15"/>
               </w:rPr>
-              <w:t xml:space="preserve">Gomez 2017 (2009-2013)</w:t>
+              <w:t xml:space="preserve">Gomez 2026 (2018-2022)</w:t>
             </w:r>
           </w:p>
         </w:tc>
@@ -2542,7 +2542,7 @@
                 <w:sz w:val="15"/>
                 <w:szCs w:val="15"/>
               </w:rPr>
-              <w:t xml:space="preserve">California-CCR</w:t>
+              <w:t xml:space="preserve">SEER-national</w:t>
             </w:r>
           </w:p>
         </w:tc>
@@ -2588,7 +2588,7 @@
                 <w:sz w:val="15"/>
                 <w:szCs w:val="15"/>
               </w:rPr>
-              <w:t xml:space="preserve">Very low</w:t>
+              <w:t xml:space="preserve">Low</w:t>
             </w:r>
           </w:p>
         </w:tc>
@@ -2613,7 +2613,7 @@
                 <w:sz w:val="15"/>
                 <w:szCs w:val="15"/>
               </w:rPr>
-              <w:t xml:space="preserve">Asian Indian/Pakistani</w:t>
+              <w:t xml:space="preserve">Native Hawaiian</w:t>
             </w:r>
           </w:p>
         </w:tc>
@@ -2659,7 +2659,7 @@
                 <w:sz w:val="15"/>
                 <w:szCs w:val="15"/>
               </w:rPr>
-              <w:t xml:space="preserve">0.958 [0.937, 0.979]</w:t>
+              <w:t xml:space="preserve">1.211 [1.123, 1.305]</w:t>
             </w:r>
           </w:p>
         </w:tc>
@@ -2682,7 +2682,7 @@
                 <w:sz w:val="15"/>
                 <w:szCs w:val="15"/>
               </w:rPr>
-              <w:t xml:space="preserve">Gomez 2026 (2018-2022)</w:t>
+              <w:t xml:space="preserve">Miller 2008 (1998-2002)</w:t>
             </w:r>
           </w:p>
         </w:tc>
@@ -2705,7 +2705,7 @@
                 <w:sz w:val="15"/>
                 <w:szCs w:val="15"/>
               </w:rPr>
-              <w:t xml:space="preserve">SEER-national</w:t>
+              <w:t xml:space="preserve">NAACCR/CiNA (~93%)</w:t>
             </w:r>
           </w:p>
         </w:tc>
@@ -2776,7 +2776,7 @@
                 <w:sz w:val="15"/>
                 <w:szCs w:val="15"/>
               </w:rPr>
-              <w:t xml:space="preserve">Japanese (young)</w:t>
+              <w:t xml:space="preserve">Asian American (aggregate)</w:t>
             </w:r>
           </w:p>
         </w:tc>
@@ -2822,7 +2822,7 @@
                 <w:sz w:val="15"/>
                 <w:szCs w:val="15"/>
               </w:rPr>
-              <w:t xml:space="preserve">1.02 [0.91, 1.14]</w:t>
+              <w:t xml:space="preserve">0.792 [0.784, 0.800]</w:t>
             </w:r>
           </w:p>
         </w:tc>
@@ -2845,7 +2845,7 @@
                 <w:sz w:val="15"/>
                 <w:szCs w:val="15"/>
               </w:rPr>
-              <w:t xml:space="preserve">Gomez 2017 (2009-2013)</w:t>
+              <w:t xml:space="preserve">Gomez 2026 (2018-2022)</w:t>
             </w:r>
           </w:p>
         </w:tc>
@@ -2868,333 +2868,7 @@
                 <w:sz w:val="15"/>
                 <w:szCs w:val="15"/>
               </w:rPr>
-              <w:t xml:space="preserve">California-CCR</w:t>
-            </w:r>
-          </w:p>
-        </w:tc>
-        <w:tc>
-          <w:tcPr>
-            <w:tcW w:type="dxa" w:w="1236"/>
-            <w:tcMar>
-              <w:top w:type="dxa" w:w="25"/>
-              <w:left w:type="dxa" w:w="70"/>
-              <w:bottom w:type="dxa" w:w="25"/>
-              <w:right w:type="dxa" w:w="70"/>
-            </w:tcMar>
-          </w:tcPr>
-          <w:p>
-            <w:r>
-              <w:rPr>
-                <w:rFonts w:ascii="Malgun Gothic" w:cs="Malgun Gothic" w:eastAsia="Malgun Gothic" w:hAnsi="Malgun Gothic"/>
-                <w:b w:val="false"/>
-                <w:bCs w:val="false"/>
-                <w:sz w:val="15"/>
-                <w:szCs w:val="15"/>
-              </w:rPr>
-              <w:t xml:space="preserve">Good</w:t>
-            </w:r>
-          </w:p>
-        </w:tc>
-        <w:tc>
-          <w:tcPr>
-            <w:tcW w:type="dxa" w:w="1182"/>
-            <w:tcMar>
-              <w:top w:type="dxa" w:w="25"/>
-              <w:left w:type="dxa" w:w="70"/>
-              <w:bottom w:type="dxa" w:w="25"/>
-              <w:right w:type="dxa" w:w="70"/>
-            </w:tcMar>
-          </w:tcPr>
-          <w:p>
-            <w:r>
-              <w:rPr>
-                <w:rFonts w:ascii="Malgun Gothic" w:cs="Malgun Gothic" w:eastAsia="Malgun Gothic" w:hAnsi="Malgun Gothic"/>
-                <w:b w:val="false"/>
-                <w:bCs w:val="false"/>
-                <w:sz w:val="15"/>
-                <w:szCs w:val="15"/>
-              </w:rPr>
-              <w:t xml:space="preserve">Very low</w:t>
-            </w:r>
-          </w:p>
-        </w:tc>
-      </w:tr>
-      <w:tr>
-        <w:tc>
-          <w:tcPr>
-            <w:tcW w:type="dxa" w:w="3116"/>
-            <w:tcMar>
-              <w:top w:type="dxa" w:w="25"/>
-              <w:left w:type="dxa" w:w="70"/>
-              <w:bottom w:type="dxa" w:w="25"/>
-              <w:right w:type="dxa" w:w="70"/>
-            </w:tcMar>
-          </w:tcPr>
-          <w:p>
-            <w:r>
-              <w:rPr>
-                <w:rFonts w:ascii="Malgun Gothic" w:cs="Malgun Gothic" w:eastAsia="Malgun Gothic" w:hAnsi="Malgun Gothic"/>
-                <w:b w:val="false"/>
-                <w:bCs w:val="false"/>
-                <w:sz w:val="15"/>
-                <w:szCs w:val="15"/>
-              </w:rPr>
-              <w:t xml:space="preserve">Japanese</w:t>
-            </w:r>
-          </w:p>
-        </w:tc>
-        <w:tc>
-          <w:tcPr>
-            <w:tcW w:type="dxa" w:w="1021"/>
-            <w:tcMar>
-              <w:top w:type="dxa" w:w="25"/>
-              <w:left w:type="dxa" w:w="70"/>
-              <w:bottom w:type="dxa" w:w="25"/>
-              <w:right w:type="dxa" w:w="70"/>
-            </w:tcMar>
-          </w:tcPr>
-          <w:p>
-            <w:r>
-              <w:rPr>
-                <w:rFonts w:ascii="Malgun Gothic" w:cs="Malgun Gothic" w:eastAsia="Malgun Gothic" w:hAnsi="Malgun Gothic"/>
-                <w:b w:val="false"/>
-                <w:bCs w:val="false"/>
-                <w:sz w:val="15"/>
-                <w:szCs w:val="15"/>
-              </w:rPr>
-              <w:t xml:space="preserve">IRR</w:t>
-            </w:r>
-          </w:p>
-        </w:tc>
-        <w:tc>
-          <w:tcPr>
-            <w:tcW w:type="dxa" w:w="2901"/>
-            <w:tcMar>
-              <w:top w:type="dxa" w:w="25"/>
-              <w:left w:type="dxa" w:w="70"/>
-              <w:bottom w:type="dxa" w:w="25"/>
-              <w:right w:type="dxa" w:w="70"/>
-            </w:tcMar>
-          </w:tcPr>
-          <w:p>
-            <w:r>
-              <w:rPr>
-                <w:rFonts w:ascii="Malgun Gothic" w:cs="Malgun Gothic" w:eastAsia="Malgun Gothic" w:hAnsi="Malgun Gothic"/>
-                <w:b w:val="false"/>
-                <w:bCs w:val="false"/>
-                <w:sz w:val="15"/>
-                <w:szCs w:val="15"/>
-              </w:rPr>
-              <w:t xml:space="preserve">1.045 [1.009, 1.083]</w:t>
-            </w:r>
-          </w:p>
-        </w:tc>
-        <w:tc>
-          <w:tcPr>
-            <w:tcW w:type="dxa" w:w="2687"/>
-            <w:tcMar>
-              <w:top w:type="dxa" w:w="25"/>
-              <w:left w:type="dxa" w:w="70"/>
-              <w:bottom w:type="dxa" w:w="25"/>
-              <w:right w:type="dxa" w:w="70"/>
-            </w:tcMar>
-          </w:tcPr>
-          <w:p>
-            <w:r>
-              <w:rPr>
-                <w:rFonts w:ascii="Malgun Gothic" w:cs="Malgun Gothic" w:eastAsia="Malgun Gothic" w:hAnsi="Malgun Gothic"/>
-                <w:b w:val="false"/>
-                <w:bCs w:val="false"/>
-                <w:sz w:val="15"/>
-                <w:szCs w:val="15"/>
-              </w:rPr>
-              <w:t xml:space="preserve">Gomez 2026 (2018-2022)</w:t>
-            </w:r>
-          </w:p>
-        </w:tc>
-        <w:tc>
-          <w:tcPr>
-            <w:tcW w:type="dxa" w:w="2257"/>
-            <w:tcMar>
-              <w:top w:type="dxa" w:w="25"/>
-              <w:left w:type="dxa" w:w="70"/>
-              <w:bottom w:type="dxa" w:w="25"/>
-              <w:right w:type="dxa" w:w="70"/>
-            </w:tcMar>
-          </w:tcPr>
-          <w:p>
-            <w:r>
-              <w:rPr>
-                <w:rFonts w:ascii="Malgun Gothic" w:cs="Malgun Gothic" w:eastAsia="Malgun Gothic" w:hAnsi="Malgun Gothic"/>
-                <w:b w:val="false"/>
-                <w:bCs w:val="false"/>
-                <w:sz w:val="15"/>
-                <w:szCs w:val="15"/>
-              </w:rPr>
               <w:t xml:space="preserve">SEER-national</w:t>
-            </w:r>
-          </w:p>
-        </w:tc>
-        <w:tc>
-          <w:tcPr>
-            <w:tcW w:type="dxa" w:w="1236"/>
-            <w:tcMar>
-              <w:top w:type="dxa" w:w="25"/>
-              <w:left w:type="dxa" w:w="70"/>
-              <w:bottom w:type="dxa" w:w="25"/>
-              <w:right w:type="dxa" w:w="70"/>
-            </w:tcMar>
-          </w:tcPr>
-          <w:p>
-            <w:r>
-              <w:rPr>
-                <w:rFonts w:ascii="Malgun Gothic" w:cs="Malgun Gothic" w:eastAsia="Malgun Gothic" w:hAnsi="Malgun Gothic"/>
-                <w:b w:val="false"/>
-                <w:bCs w:val="false"/>
-                <w:sz w:val="15"/>
-                <w:szCs w:val="15"/>
-              </w:rPr>
-              <w:t xml:space="preserve">Good</w:t>
-            </w:r>
-          </w:p>
-        </w:tc>
-        <w:tc>
-          <w:tcPr>
-            <w:tcW w:type="dxa" w:w="1182"/>
-            <w:tcMar>
-              <w:top w:type="dxa" w:w="25"/>
-              <w:left w:type="dxa" w:w="70"/>
-              <w:bottom w:type="dxa" w:w="25"/>
-              <w:right w:type="dxa" w:w="70"/>
-            </w:tcMar>
-          </w:tcPr>
-          <w:p>
-            <w:r>
-              <w:rPr>
-                <w:rFonts w:ascii="Malgun Gothic" w:cs="Malgun Gothic" w:eastAsia="Malgun Gothic" w:hAnsi="Malgun Gothic"/>
-                <w:b w:val="false"/>
-                <w:bCs w:val="false"/>
-                <w:sz w:val="15"/>
-                <w:szCs w:val="15"/>
-              </w:rPr>
-              <w:t xml:space="preserve">Low</w:t>
-            </w:r>
-          </w:p>
-        </w:tc>
-      </w:tr>
-      <w:tr>
-        <w:tc>
-          <w:tcPr>
-            <w:tcW w:type="dxa" w:w="3116"/>
-            <w:tcMar>
-              <w:top w:type="dxa" w:w="25"/>
-              <w:left w:type="dxa" w:w="70"/>
-              <w:bottom w:type="dxa" w:w="25"/>
-              <w:right w:type="dxa" w:w="70"/>
-            </w:tcMar>
-          </w:tcPr>
-          <w:p>
-            <w:r>
-              <w:rPr>
-                <w:rFonts w:ascii="Malgun Gothic" w:cs="Malgun Gothic" w:eastAsia="Malgun Gothic" w:hAnsi="Malgun Gothic"/>
-                <w:b w:val="false"/>
-                <w:bCs w:val="false"/>
-                <w:sz w:val="15"/>
-                <w:szCs w:val="15"/>
-              </w:rPr>
-              <w:t xml:space="preserve">Native Hawaiian</w:t>
-            </w:r>
-          </w:p>
-        </w:tc>
-        <w:tc>
-          <w:tcPr>
-            <w:tcW w:type="dxa" w:w="1021"/>
-            <w:tcMar>
-              <w:top w:type="dxa" w:w="25"/>
-              <w:left w:type="dxa" w:w="70"/>
-              <w:bottom w:type="dxa" w:w="25"/>
-              <w:right w:type="dxa" w:w="70"/>
-            </w:tcMar>
-          </w:tcPr>
-          <w:p>
-            <w:r>
-              <w:rPr>
-                <w:rFonts w:ascii="Malgun Gothic" w:cs="Malgun Gothic" w:eastAsia="Malgun Gothic" w:hAnsi="Malgun Gothic"/>
-                <w:b w:val="false"/>
-                <w:bCs w:val="false"/>
-                <w:sz w:val="15"/>
-                <w:szCs w:val="15"/>
-              </w:rPr>
-              <w:t xml:space="preserve">IRR</w:t>
-            </w:r>
-          </w:p>
-        </w:tc>
-        <w:tc>
-          <w:tcPr>
-            <w:tcW w:type="dxa" w:w="2901"/>
-            <w:tcMar>
-              <w:top w:type="dxa" w:w="25"/>
-              <w:left w:type="dxa" w:w="70"/>
-              <w:bottom w:type="dxa" w:w="25"/>
-              <w:right w:type="dxa" w:w="70"/>
-            </w:tcMar>
-          </w:tcPr>
-          <w:p>
-            <w:r>
-              <w:rPr>
-                <w:rFonts w:ascii="Malgun Gothic" w:cs="Malgun Gothic" w:eastAsia="Malgun Gothic" w:hAnsi="Malgun Gothic"/>
-                <w:b w:val="false"/>
-                <w:bCs w:val="false"/>
-                <w:sz w:val="15"/>
-                <w:szCs w:val="15"/>
-              </w:rPr>
-              <w:t xml:space="preserve">1.211 [1.123, 1.305]</w:t>
-            </w:r>
-          </w:p>
-        </w:tc>
-        <w:tc>
-          <w:tcPr>
-            <w:tcW w:type="dxa" w:w="2687"/>
-            <w:tcMar>
-              <w:top w:type="dxa" w:w="25"/>
-              <w:left w:type="dxa" w:w="70"/>
-              <w:bottom w:type="dxa" w:w="25"/>
-              <w:right w:type="dxa" w:w="70"/>
-            </w:tcMar>
-          </w:tcPr>
-          <w:p>
-            <w:r>
-              <w:rPr>
-                <w:rFonts w:ascii="Malgun Gothic" w:cs="Malgun Gothic" w:eastAsia="Malgun Gothic" w:hAnsi="Malgun Gothic"/>
-                <w:b w:val="false"/>
-                <w:bCs w:val="false"/>
-                <w:sz w:val="15"/>
-                <w:szCs w:val="15"/>
-              </w:rPr>
-              <w:t xml:space="preserve">Miller 2008 (1998-2002)</w:t>
-            </w:r>
-          </w:p>
-        </w:tc>
-        <w:tc>
-          <w:tcPr>
-            <w:tcW w:type="dxa" w:w="2257"/>
-            <w:tcMar>
-              <w:top w:type="dxa" w:w="25"/>
-              <w:left w:type="dxa" w:w="70"/>
-              <w:bottom w:type="dxa" w:w="25"/>
-              <w:right w:type="dxa" w:w="70"/>
-            </w:tcMar>
-          </w:tcPr>
-          <w:p>
-            <w:r>
-              <w:rPr>
-                <w:rFonts w:ascii="Malgun Gothic" w:cs="Malgun Gothic" w:eastAsia="Malgun Gothic" w:hAnsi="Malgun Gothic"/>
-                <w:b w:val="false"/>
-                <w:bCs w:val="false"/>
-                <w:sz w:val="15"/>
-                <w:szCs w:val="15"/>
-              </w:rPr>
-              <w:t xml:space="preserve">NAACCR/CiNA (~93%)</w:t>
             </w:r>
           </w:p>
         </w:tc>
@@ -3618,7 +3292,7 @@
                 <w:sz w:val="15"/>
                 <w:szCs w:val="15"/>
               </w:rPr>
-              <w:t xml:space="preserve">Hispanic/Latina (aggregate)</w:t>
+              <w:t xml:space="preserve">New Latino</w:t>
             </w:r>
           </w:p>
         </w:tc>
@@ -3641,7 +3315,7 @@
                 <w:sz w:val="15"/>
                 <w:szCs w:val="15"/>
               </w:rPr>
-              <w:t xml:space="preserve">SIR</w:t>
+              <w:t xml:space="preserve">IRR</w:t>
             </w:r>
           </w:p>
         </w:tc>
@@ -3664,7 +3338,7 @@
                 <w:sz w:val="15"/>
                 <w:szCs w:val="15"/>
               </w:rPr>
-              <w:t xml:space="preserve">0.64 (point est.)</w:t>
+              <w:t xml:space="preserve">0.684 [0.619, 0.756]</w:t>
             </w:r>
           </w:p>
         </w:tc>
@@ -3687,7 +3361,7 @@
                 <w:sz w:val="15"/>
                 <w:szCs w:val="15"/>
               </w:rPr>
-              <w:t xml:space="preserve">Carozza 2006 (1995-2000)</w:t>
+              <w:t xml:space="preserve">Pinheiro 2009 (1999-2001)</w:t>
             </w:r>
           </w:p>
         </w:tc>
@@ -3710,7 +3384,7 @@
                 <w:sz w:val="15"/>
                 <w:szCs w:val="15"/>
               </w:rPr>
-              <w:t xml:space="preserve">NAACCR/CiNA (~93%)</w:t>
+              <w:t xml:space="preserve">State: Florida</w:t>
             </w:r>
           </w:p>
         </w:tc>
@@ -3756,7 +3430,7 @@
                 <w:sz w:val="15"/>
                 <w:szCs w:val="15"/>
               </w:rPr>
-              <w:t xml:space="preserve">Very low</w:t>
+              <w:t xml:space="preserve">Low</w:t>
             </w:r>
           </w:p>
         </w:tc>
@@ -3781,7 +3455,7 @@
                 <w:sz w:val="15"/>
                 <w:szCs w:val="15"/>
               </w:rPr>
-              <w:t xml:space="preserve">New Latino</w:t>
+              <w:t xml:space="preserve">Cuban</w:t>
             </w:r>
           </w:p>
         </w:tc>
@@ -3827,7 +3501,7 @@
                 <w:sz w:val="15"/>
                 <w:szCs w:val="15"/>
               </w:rPr>
-              <w:t xml:space="preserve">0.684 [0.619, 0.756]</w:t>
+              <w:t xml:space="preserve">0.755 [0.677, 0.842]</w:t>
             </w:r>
           </w:p>
         </w:tc>
@@ -3944,7 +3618,7 @@
                 <w:sz w:val="15"/>
                 <w:szCs w:val="15"/>
               </w:rPr>
-              <w:t xml:space="preserve">Cuban</w:t>
+              <w:t xml:space="preserve">Puerto Rican</w:t>
             </w:r>
           </w:p>
         </w:tc>
@@ -3990,7 +3664,7 @@
                 <w:sz w:val="15"/>
                 <w:szCs w:val="15"/>
               </w:rPr>
-              <w:t xml:space="preserve">0.755 [0.677, 0.842]</w:t>
+              <w:t xml:space="preserve">0.817 [0.726, 0.920]</w:t>
             </w:r>
           </w:p>
         </w:tc>
@@ -4107,7 +3781,7 @@
                 <w:sz w:val="15"/>
                 <w:szCs w:val="15"/>
               </w:rPr>
-              <w:t xml:space="preserve">Puerto Rican</w:t>
+              <w:t xml:space="preserve">Hispanic/Latina (aggregate)</w:t>
             </w:r>
           </w:p>
         </w:tc>
@@ -4130,7 +3804,7 @@
                 <w:sz w:val="15"/>
                 <w:szCs w:val="15"/>
               </w:rPr>
-              <w:t xml:space="preserve">IRR</w:t>
+              <w:t xml:space="preserve">SIR</w:t>
             </w:r>
           </w:p>
         </w:tc>
@@ -4153,7 +3827,7 @@
                 <w:sz w:val="15"/>
                 <w:szCs w:val="15"/>
               </w:rPr>
-              <w:t xml:space="preserve">0.817 [0.726, 0.920]</w:t>
+              <w:t xml:space="preserve">0.64 (point est.)</w:t>
             </w:r>
           </w:p>
         </w:tc>
@@ -4176,7 +3850,7 @@
                 <w:sz w:val="15"/>
                 <w:szCs w:val="15"/>
               </w:rPr>
-              <w:t xml:space="preserve">Pinheiro 2009 (1999-2001)</w:t>
+              <w:t xml:space="preserve">Carozza 2006 (1995-2000)</w:t>
             </w:r>
           </w:p>
         </w:tc>
@@ -4199,7 +3873,7 @@
                 <w:sz w:val="15"/>
                 <w:szCs w:val="15"/>
               </w:rPr>
-              <w:t xml:space="preserve">State: Florida</w:t>
+              <w:t xml:space="preserve">NAACCR/CiNA (~93%)</w:t>
             </w:r>
           </w:p>
         </w:tc>
@@ -4245,7 +3919,7 @@
                 <w:sz w:val="15"/>
                 <w:szCs w:val="15"/>
               </w:rPr>
-              <w:t xml:space="preserve">Low</w:t>
+              <w:t xml:space="preserve">Very low</w:t>
             </w:r>
           </w:p>
         </w:tc>
@@ -5492,7 +5166,7 @@
                 <w:sz w:val="15"/>
                 <w:szCs w:val="15"/>
               </w:rPr>
-              <w:t xml:space="preserve">Asian American, Native Hawaiian, and Pacific Islander (AANHPI)</w:t>
+              <w:t xml:space="preserve">Filipino</w:t>
             </w:r>
           </w:p>
         </w:tc>
@@ -5538,7 +5212,7 @@
                 <w:sz w:val="15"/>
                 <w:szCs w:val="15"/>
               </w:rPr>
-              <w:t xml:space="preserve">0.700 [0.680, 0.720]</w:t>
+              <w:t xml:space="preserve">0.84 [0.8, 0.88]</w:t>
             </w:r>
           </w:p>
         </w:tc>
@@ -5561,7 +5235,7 @@
                 <w:sz w:val="15"/>
                 <w:szCs w:val="15"/>
               </w:rPr>
-              <w:t xml:space="preserve">Sung 2023 (2015-2019)</w:t>
+              <w:t xml:space="preserve">Loo 2019 (2000-2016)</w:t>
             </w:r>
           </w:p>
         </w:tc>
@@ -5584,7 +5258,7 @@
                 <w:sz w:val="15"/>
                 <w:szCs w:val="15"/>
               </w:rPr>
-              <w:t xml:space="preserve">USCS(NPCR+SEER ~99%)</w:t>
+              <w:t xml:space="preserve">Hawaii Tumor Registry (SEER)</w:t>
             </w:r>
           </w:p>
         </w:tc>
@@ -5655,7 +5329,7 @@
                 <w:sz w:val="15"/>
                 <w:szCs w:val="15"/>
               </w:rPr>
-              <w:t xml:space="preserve">Filipino</w:t>
+              <w:t xml:space="preserve">American Indian and Alaska Native (AI/AN)</w:t>
             </w:r>
           </w:p>
         </w:tc>
@@ -5701,7 +5375,7 @@
                 <w:sz w:val="15"/>
                 <w:szCs w:val="15"/>
               </w:rPr>
-              <w:t xml:space="preserve">0.84 [0.8, 0.88]</w:t>
+              <w:t xml:space="preserve">0.860 [0.800, 0.930]</w:t>
             </w:r>
           </w:p>
         </w:tc>
@@ -5724,7 +5398,7 @@
                 <w:sz w:val="15"/>
                 <w:szCs w:val="15"/>
               </w:rPr>
-              <w:t xml:space="preserve">Loo 2019 (2000-2016)</w:t>
+              <w:t xml:space="preserve">Sung 2023 (2015-2019)</w:t>
             </w:r>
           </w:p>
         </w:tc>
@@ -5747,7 +5421,7 @@
                 <w:sz w:val="15"/>
                 <w:szCs w:val="15"/>
               </w:rPr>
-              <w:t xml:space="preserve">Hawaii Tumor Registry (SEER)</w:t>
+              <w:t xml:space="preserve">USCS(NPCR+SEER ~99%)</w:t>
             </w:r>
           </w:p>
         </w:tc>
@@ -5818,7 +5492,7 @@
                 <w:sz w:val="15"/>
                 <w:szCs w:val="15"/>
               </w:rPr>
-              <w:t xml:space="preserve">American Indian and Alaska Native (AI/AN)</w:t>
+              <w:t xml:space="preserve">Hispanic</w:t>
             </w:r>
           </w:p>
         </w:tc>
@@ -5864,7 +5538,7 @@
                 <w:sz w:val="15"/>
                 <w:szCs w:val="15"/>
               </w:rPr>
-              <w:t xml:space="preserve">0.860 [0.800, 0.930]</w:t>
+              <w:t xml:space="preserve">0.860 [0.840, 0.880]</w:t>
             </w:r>
           </w:p>
         </w:tc>
@@ -5981,7 +5655,7 @@
                 <w:sz w:val="15"/>
                 <w:szCs w:val="15"/>
               </w:rPr>
-              <w:t xml:space="preserve">Hispanic</w:t>
+              <w:t xml:space="preserve">Native Hawaiian</w:t>
             </w:r>
           </w:p>
         </w:tc>
@@ -6027,7 +5701,7 @@
                 <w:sz w:val="15"/>
                 <w:szCs w:val="15"/>
               </w:rPr>
-              <w:t xml:space="preserve">0.860 [0.840, 0.880]</w:t>
+              <w:t xml:space="preserve">0.86 [0.79, 0.91]</w:t>
             </w:r>
           </w:p>
         </w:tc>
@@ -6050,7 +5724,7 @@
                 <w:sz w:val="15"/>
                 <w:szCs w:val="15"/>
               </w:rPr>
-              <w:t xml:space="preserve">Sung 2023 (2015-2019)</w:t>
+              <w:t xml:space="preserve">Loo 2019 (2000-2016)</w:t>
             </w:r>
           </w:p>
         </w:tc>
@@ -6073,7 +5747,7 @@
                 <w:sz w:val="15"/>
                 <w:szCs w:val="15"/>
               </w:rPr>
-              <w:t xml:space="preserve">USCS(NPCR+SEER ~99%)</w:t>
+              <w:t xml:space="preserve">Hawaii Tumor Registry (SEER)</w:t>
             </w:r>
           </w:p>
         </w:tc>
@@ -6144,7 +5818,7 @@
                 <w:sz w:val="15"/>
                 <w:szCs w:val="15"/>
               </w:rPr>
-              <w:t xml:space="preserve">Native Hawaiian</w:t>
+              <w:t xml:space="preserve">non-Hispanic Black (NHB)</w:t>
             </w:r>
           </w:p>
         </w:tc>
@@ -6190,7 +5864,7 @@
                 <w:sz w:val="15"/>
                 <w:szCs w:val="15"/>
               </w:rPr>
-              <w:t xml:space="preserve">0.86 [0.79, 0.91]</w:t>
+              <w:t xml:space="preserve">1.950 [1.930, 1.980]</w:t>
             </w:r>
           </w:p>
         </w:tc>
@@ -6213,7 +5887,7 @@
                 <w:sz w:val="15"/>
                 <w:szCs w:val="15"/>
               </w:rPr>
-              <w:t xml:space="preserve">Loo 2019 (2000-2016)</w:t>
+              <w:t xml:space="preserve">Sung 2023 (2015-2019)</w:t>
             </w:r>
           </w:p>
         </w:tc>
@@ -6236,7 +5910,7 @@
                 <w:sz w:val="15"/>
                 <w:szCs w:val="15"/>
               </w:rPr>
-              <w:t xml:space="preserve">Hawaii Tumor Registry (SEER)</w:t>
+              <w:t xml:space="preserve">USCS(NPCR+SEER ~99%)</w:t>
             </w:r>
           </w:p>
         </w:tc>
@@ -6307,7 +5981,7 @@
                 <w:sz w:val="15"/>
                 <w:szCs w:val="15"/>
               </w:rPr>
-              <w:t xml:space="preserve">non-Hispanic Black (NHB)</w:t>
+              <w:t xml:space="preserve">Asian American, Native Hawaiian, and Pacific Islander (AANHPI)</w:t>
             </w:r>
           </w:p>
         </w:tc>
@@ -6353,7 +6027,7 @@
                 <w:sz w:val="15"/>
                 <w:szCs w:val="15"/>
               </w:rPr>
-              <w:t xml:space="preserve">1.950 [1.930, 1.980]</w:t>
+              <w:t xml:space="preserve">0.700 [0.680, 0.720]</w:t>
             </w:r>
           </w:p>
         </w:tc>

</xml_diff>

<commit_message>
Table 1: send the AI/AN national row to the bottom of the by-region section
The AI/AN-by-region section still sorted its bare national 'AIAN' estimate
(Melkonian 2019, 0.87) by IRR, leaving it mid-section; treat the bare
'AIAN' row as a section summary so it sits at the bottom under the region
subgroups (Navajo, Southern/Northern Plains), matching the AANHPI section.

Co-Authored-By: Claude Opus 4.8 <noreply@anthropic.com>
Claude-Session: https://claude.ai/code/session_01CuLT4FKRBtsU22Vwfjj2qn
</commit_message>
<xml_diff>
--- a/meta_agents/search_v2/outputs/Main_Text_Tables_Figures.docx
+++ b/meta_agents/search_v2/outputs/Main_Text_Tables_Figures.docx
@@ -304,7 +304,7 @@
                 <w:sz w:val="15"/>
                 <w:szCs w:val="15"/>
               </w:rPr>
-              <w:t xml:space="preserve">American Indian and Alaska Native (AI/AN)</w:t>
+              <w:t xml:space="preserve">Hispanic</w:t>
             </w:r>
           </w:p>
         </w:tc>
@@ -350,7 +350,7 @@
                 <w:sz w:val="15"/>
                 <w:szCs w:val="15"/>
               </w:rPr>
-              <w:t xml:space="preserve">0.560 [0.550, 0.570]</w:t>
+              <w:t xml:space="preserve">0.718 [0.707, 0.731]</w:t>
             </w:r>
           </w:p>
         </w:tc>
@@ -373,7 +373,7 @@
                 <w:sz w:val="15"/>
                 <w:szCs w:val="15"/>
               </w:rPr>
-              <w:t xml:space="preserve">Gopalani 2020 (1999-2015)</w:t>
+              <w:t xml:space="preserve">Ellington 2022 (2018)</w:t>
             </w:r>
           </w:p>
         </w:tc>
@@ -396,7 +396,7 @@
                 <w:sz w:val="15"/>
                 <w:szCs w:val="15"/>
               </w:rPr>
-              <w:t xml:space="preserve">IHS-PRCDA</w:t>
+              <w:t xml:space="preserve">USCS(NPCR+SEER ~99%)</w:t>
             </w:r>
           </w:p>
         </w:tc>
@@ -467,7 +467,7 @@
                 <w:sz w:val="15"/>
                 <w:szCs w:val="15"/>
               </w:rPr>
-              <w:t xml:space="preserve">Hispanic</w:t>
+              <w:t xml:space="preserve">non-Hispanic Black (NHB)</w:t>
             </w:r>
           </w:p>
         </w:tc>
@@ -513,7 +513,7 @@
                 <w:sz w:val="15"/>
                 <w:szCs w:val="15"/>
               </w:rPr>
-              <w:t xml:space="preserve">0.718 [0.707, 0.731]</w:t>
+              <w:t xml:space="preserve">0.933 [0.920, 0.946]</w:t>
             </w:r>
           </w:p>
         </w:tc>
@@ -630,7 +630,7 @@
                 <w:sz w:val="15"/>
                 <w:szCs w:val="15"/>
               </w:rPr>
-              <w:t xml:space="preserve">non-Hispanic Black (NHB)</w:t>
+              <w:t xml:space="preserve">American Indian and Alaska Native (AI/AN)</w:t>
             </w:r>
           </w:p>
         </w:tc>
@@ -676,7 +676,7 @@
                 <w:sz w:val="15"/>
                 <w:szCs w:val="15"/>
               </w:rPr>
-              <w:t xml:space="preserve">0.933 [0.920, 0.946]</w:t>
+              <w:t xml:space="preserve">0.560 [0.550, 0.570]</w:t>
             </w:r>
           </w:p>
         </w:tc>
@@ -699,7 +699,7 @@
                 <w:sz w:val="15"/>
                 <w:szCs w:val="15"/>
               </w:rPr>
-              <w:t xml:space="preserve">Ellington 2022 (2018)</w:t>
+              <w:t xml:space="preserve">Gopalani 2020 (1999-2015)</w:t>
             </w:r>
           </w:p>
         </w:tc>
@@ -722,7 +722,7 @@
                 <w:sz w:val="15"/>
                 <w:szCs w:val="15"/>
               </w:rPr>
-              <w:t xml:space="preserve">USCS(NPCR+SEER ~99%)</w:t>
+              <w:t xml:space="preserve">IHS-PRCDA</w:t>
             </w:r>
           </w:p>
         </w:tc>
@@ -4134,7 +4134,7 @@
                 <w:sz w:val="15"/>
                 <w:szCs w:val="15"/>
               </w:rPr>
-              <w:t xml:space="preserve">American Indian and Alaska Native (AI/AN)</w:t>
+              <w:t xml:space="preserve">AI/AN (Southern Plains)</w:t>
             </w:r>
           </w:p>
         </w:tc>
@@ -4180,7 +4180,7 @@
                 <w:sz w:val="15"/>
                 <w:szCs w:val="15"/>
               </w:rPr>
-              <w:t xml:space="preserve">0.87 (point est.)</w:t>
+              <w:t xml:space="preserve">1.25 [1.11, 1.41]</w:t>
             </w:r>
           </w:p>
         </w:tc>
@@ -4203,7 +4203,7 @@
                 <w:sz w:val="15"/>
                 <w:szCs w:val="15"/>
               </w:rPr>
-              <w:t xml:space="preserve">Melkonian 2019 (2012-2016)</w:t>
+              <w:t xml:space="preserve">Melkonian 2021 (2012-2016)</w:t>
             </w:r>
           </w:p>
         </w:tc>
@@ -4272,7 +4272,7 @@
                 <w:sz w:val="15"/>
                 <w:szCs w:val="15"/>
               </w:rPr>
-              <w:t xml:space="preserve">Very low</w:t>
+              <w:t xml:space="preserve">Low</w:t>
             </w:r>
           </w:p>
         </w:tc>
@@ -4297,7 +4297,7 @@
                 <w:sz w:val="15"/>
                 <w:szCs w:val="15"/>
               </w:rPr>
-              <w:t xml:space="preserve">AI/AN (Southern Plains)</w:t>
+              <w:t xml:space="preserve">AI/AN (Northern Plains)</w:t>
             </w:r>
           </w:p>
         </w:tc>
@@ -4343,7 +4343,7 @@
                 <w:sz w:val="15"/>
                 <w:szCs w:val="15"/>
               </w:rPr>
-              <w:t xml:space="preserve">1.25 [1.11, 1.41]</w:t>
+              <w:t xml:space="preserve">1.33 [1.26, 1.41]</w:t>
             </w:r>
           </w:p>
         </w:tc>
@@ -4460,7 +4460,7 @@
                 <w:sz w:val="15"/>
                 <w:szCs w:val="15"/>
               </w:rPr>
-              <w:t xml:space="preserve">AI/AN (Northern Plains)</w:t>
+              <w:t xml:space="preserve">American Indian and Alaska Native (AI/AN)</w:t>
             </w:r>
           </w:p>
         </w:tc>
@@ -4506,7 +4506,7 @@
                 <w:sz w:val="15"/>
                 <w:szCs w:val="15"/>
               </w:rPr>
-              <w:t xml:space="preserve">1.33 [1.26, 1.41]</w:t>
+              <w:t xml:space="preserve">0.87 (point est.)</w:t>
             </w:r>
           </w:p>
         </w:tc>
@@ -4529,7 +4529,7 @@
                 <w:sz w:val="15"/>
                 <w:szCs w:val="15"/>
               </w:rPr>
-              <w:t xml:space="preserve">Melkonian 2021 (2012-2016)</w:t>
+              <w:t xml:space="preserve">Melkonian 2019 (2012-2016)</w:t>
             </w:r>
           </w:p>
         </w:tc>
@@ -4598,7 +4598,7 @@
                 <w:sz w:val="15"/>
                 <w:szCs w:val="15"/>
               </w:rPr>
-              <w:t xml:space="preserve">Low</w:t>
+              <w:t xml:space="preserve">Very low</w:t>
             </w:r>
           </w:p>
         </w:tc>
@@ -5329,7 +5329,7 @@
                 <w:sz w:val="15"/>
                 <w:szCs w:val="15"/>
               </w:rPr>
-              <w:t xml:space="preserve">American Indian and Alaska Native (AI/AN)</w:t>
+              <w:t xml:space="preserve">Hispanic</w:t>
             </w:r>
           </w:p>
         </w:tc>
@@ -5375,7 +5375,7 @@
                 <w:sz w:val="15"/>
                 <w:szCs w:val="15"/>
               </w:rPr>
-              <w:t xml:space="preserve">0.860 [0.800, 0.930]</w:t>
+              <w:t xml:space="preserve">0.860 [0.840, 0.880]</w:t>
             </w:r>
           </w:p>
         </w:tc>
@@ -5492,7 +5492,7 @@
                 <w:sz w:val="15"/>
                 <w:szCs w:val="15"/>
               </w:rPr>
-              <w:t xml:space="preserve">Hispanic</w:t>
+              <w:t xml:space="preserve">Native Hawaiian</w:t>
             </w:r>
           </w:p>
         </w:tc>
@@ -5538,7 +5538,7 @@
                 <w:sz w:val="15"/>
                 <w:szCs w:val="15"/>
               </w:rPr>
-              <w:t xml:space="preserve">0.860 [0.840, 0.880]</w:t>
+              <w:t xml:space="preserve">0.86 [0.79, 0.91]</w:t>
             </w:r>
           </w:p>
         </w:tc>
@@ -5561,7 +5561,7 @@
                 <w:sz w:val="15"/>
                 <w:szCs w:val="15"/>
               </w:rPr>
-              <w:t xml:space="preserve">Sung 2023 (2015-2019)</w:t>
+              <w:t xml:space="preserve">Loo 2019 (2000-2016)</w:t>
             </w:r>
           </w:p>
         </w:tc>
@@ -5584,7 +5584,7 @@
                 <w:sz w:val="15"/>
                 <w:szCs w:val="15"/>
               </w:rPr>
-              <w:t xml:space="preserve">USCS(NPCR+SEER ~99%)</w:t>
+              <w:t xml:space="preserve">Hawaii Tumor Registry (SEER)</w:t>
             </w:r>
           </w:p>
         </w:tc>
@@ -5655,7 +5655,7 @@
                 <w:sz w:val="15"/>
                 <w:szCs w:val="15"/>
               </w:rPr>
-              <w:t xml:space="preserve">Native Hawaiian</w:t>
+              <w:t xml:space="preserve">non-Hispanic Black (NHB)</w:t>
             </w:r>
           </w:p>
         </w:tc>
@@ -5701,7 +5701,7 @@
                 <w:sz w:val="15"/>
                 <w:szCs w:val="15"/>
               </w:rPr>
-              <w:t xml:space="preserve">0.86 [0.79, 0.91]</w:t>
+              <w:t xml:space="preserve">1.950 [1.930, 1.980]</w:t>
             </w:r>
           </w:p>
         </w:tc>
@@ -5724,7 +5724,7 @@
                 <w:sz w:val="15"/>
                 <w:szCs w:val="15"/>
               </w:rPr>
-              <w:t xml:space="preserve">Loo 2019 (2000-2016)</w:t>
+              <w:t xml:space="preserve">Sung 2023 (2015-2019)</w:t>
             </w:r>
           </w:p>
         </w:tc>
@@ -5747,7 +5747,7 @@
                 <w:sz w:val="15"/>
                 <w:szCs w:val="15"/>
               </w:rPr>
-              <w:t xml:space="preserve">Hawaii Tumor Registry (SEER)</w:t>
+              <w:t xml:space="preserve">USCS(NPCR+SEER ~99%)</w:t>
             </w:r>
           </w:p>
         </w:tc>
@@ -5818,7 +5818,7 @@
                 <w:sz w:val="15"/>
                 <w:szCs w:val="15"/>
               </w:rPr>
-              <w:t xml:space="preserve">non-Hispanic Black (NHB)</w:t>
+              <w:t xml:space="preserve">Asian American, Native Hawaiian, and Pacific Islander (AANHPI)</w:t>
             </w:r>
           </w:p>
         </w:tc>
@@ -5864,7 +5864,7 @@
                 <w:sz w:val="15"/>
                 <w:szCs w:val="15"/>
               </w:rPr>
-              <w:t xml:space="preserve">1.950 [1.930, 1.980]</w:t>
+              <w:t xml:space="preserve">0.700 [0.680, 0.720]</w:t>
             </w:r>
           </w:p>
         </w:tc>
@@ -5981,7 +5981,7 @@
                 <w:sz w:val="15"/>
                 <w:szCs w:val="15"/>
               </w:rPr>
-              <w:t xml:space="preserve">Asian American, Native Hawaiian, and Pacific Islander (AANHPI)</w:t>
+              <w:t xml:space="preserve">American Indian and Alaska Native (AI/AN)</w:t>
             </w:r>
           </w:p>
         </w:tc>
@@ -6027,7 +6027,7 @@
                 <w:sz w:val="15"/>
                 <w:szCs w:val="15"/>
               </w:rPr>
-              <w:t xml:space="preserve">0.700 [0.680, 0.720]</w:t>
+              <w:t xml:space="preserve">0.860 [0.800, 0.930]</w:t>
             </w:r>
           </w:p>
         </w:tc>

</xml_diff>

<commit_message>
Table 1: AI/AN-by-region section shows regions only (drop duplicate national row)
The bare national 'AIAN' estimate (Melkonian 2019, 0.87) shared the
'American Indian and Alaska Native (AI/AN)' label with the Overall
headline row (Gopalani, 0.56) but a different value, inviting confusion in
the same table. Remove it from the by-region section (kept in Supplementary
Table 4); the section now shows only regional subgroups (Navajo, Southern/
Northern Plains) and the national aggregate remains the Overall row.

Co-Authored-By: Claude Opus 4.8 <noreply@anthropic.com>
Claude-Session: https://claude.ai/code/session_01CuLT4FKRBtsU22Vwfjj2qn
</commit_message>
<xml_diff>
--- a/meta_agents/search_v2/outputs/Main_Text_Tables_Figures.docx
+++ b/meta_agents/search_v2/outputs/Main_Text_Tables_Figures.docx
@@ -4436,169 +4436,6 @@
                 <w:szCs w:val="15"/>
               </w:rPr>
               <w:t xml:space="preserve">Low</w:t>
-            </w:r>
-          </w:p>
-        </w:tc>
-      </w:tr>
-      <w:tr>
-        <w:tc>
-          <w:tcPr>
-            <w:tcW w:type="dxa" w:w="3116"/>
-            <w:tcMar>
-              <w:top w:type="dxa" w:w="25"/>
-              <w:left w:type="dxa" w:w="70"/>
-              <w:bottom w:type="dxa" w:w="25"/>
-              <w:right w:type="dxa" w:w="70"/>
-            </w:tcMar>
-          </w:tcPr>
-          <w:p>
-            <w:r>
-              <w:rPr>
-                <w:rFonts w:ascii="Malgun Gothic" w:cs="Malgun Gothic" w:eastAsia="Malgun Gothic" w:hAnsi="Malgun Gothic"/>
-                <w:b w:val="false"/>
-                <w:bCs w:val="false"/>
-                <w:sz w:val="15"/>
-                <w:szCs w:val="15"/>
-              </w:rPr>
-              <w:t xml:space="preserve">American Indian and Alaska Native (AI/AN)</w:t>
-            </w:r>
-          </w:p>
-        </w:tc>
-        <w:tc>
-          <w:tcPr>
-            <w:tcW w:type="dxa" w:w="1021"/>
-            <w:tcMar>
-              <w:top w:type="dxa" w:w="25"/>
-              <w:left w:type="dxa" w:w="70"/>
-              <w:bottom w:type="dxa" w:w="25"/>
-              <w:right w:type="dxa" w:w="70"/>
-            </w:tcMar>
-          </w:tcPr>
-          <w:p>
-            <w:r>
-              <w:rPr>
-                <w:rFonts w:ascii="Malgun Gothic" w:cs="Malgun Gothic" w:eastAsia="Malgun Gothic" w:hAnsi="Malgun Gothic"/>
-                <w:b w:val="false"/>
-                <w:bCs w:val="false"/>
-                <w:sz w:val="15"/>
-                <w:szCs w:val="15"/>
-              </w:rPr>
-              <w:t xml:space="preserve">IRR</w:t>
-            </w:r>
-          </w:p>
-        </w:tc>
-        <w:tc>
-          <w:tcPr>
-            <w:tcW w:type="dxa" w:w="2901"/>
-            <w:tcMar>
-              <w:top w:type="dxa" w:w="25"/>
-              <w:left w:type="dxa" w:w="70"/>
-              <w:bottom w:type="dxa" w:w="25"/>
-              <w:right w:type="dxa" w:w="70"/>
-            </w:tcMar>
-          </w:tcPr>
-          <w:p>
-            <w:r>
-              <w:rPr>
-                <w:rFonts w:ascii="Malgun Gothic" w:cs="Malgun Gothic" w:eastAsia="Malgun Gothic" w:hAnsi="Malgun Gothic"/>
-                <w:b w:val="false"/>
-                <w:bCs w:val="false"/>
-                <w:sz w:val="15"/>
-                <w:szCs w:val="15"/>
-              </w:rPr>
-              <w:t xml:space="preserve">0.87 (point est.)</w:t>
-            </w:r>
-          </w:p>
-        </w:tc>
-        <w:tc>
-          <w:tcPr>
-            <w:tcW w:type="dxa" w:w="2687"/>
-            <w:tcMar>
-              <w:top w:type="dxa" w:w="25"/>
-              <w:left w:type="dxa" w:w="70"/>
-              <w:bottom w:type="dxa" w:w="25"/>
-              <w:right w:type="dxa" w:w="70"/>
-            </w:tcMar>
-          </w:tcPr>
-          <w:p>
-            <w:r>
-              <w:rPr>
-                <w:rFonts w:ascii="Malgun Gothic" w:cs="Malgun Gothic" w:eastAsia="Malgun Gothic" w:hAnsi="Malgun Gothic"/>
-                <w:b w:val="false"/>
-                <w:bCs w:val="false"/>
-                <w:sz w:val="15"/>
-                <w:szCs w:val="15"/>
-              </w:rPr>
-              <w:t xml:space="preserve">Melkonian 2019 (2012-2016)</w:t>
-            </w:r>
-          </w:p>
-        </w:tc>
-        <w:tc>
-          <w:tcPr>
-            <w:tcW w:type="dxa" w:w="2257"/>
-            <w:tcMar>
-              <w:top w:type="dxa" w:w="25"/>
-              <w:left w:type="dxa" w:w="70"/>
-              <w:bottom w:type="dxa" w:w="25"/>
-              <w:right w:type="dxa" w:w="70"/>
-            </w:tcMar>
-          </w:tcPr>
-          <w:p>
-            <w:r>
-              <w:rPr>
-                <w:rFonts w:ascii="Malgun Gothic" w:cs="Malgun Gothic" w:eastAsia="Malgun Gothic" w:hAnsi="Malgun Gothic"/>
-                <w:b w:val="false"/>
-                <w:bCs w:val="false"/>
-                <w:sz w:val="15"/>
-                <w:szCs w:val="15"/>
-              </w:rPr>
-              <w:t xml:space="preserve">IHS-PRCDA</w:t>
-            </w:r>
-          </w:p>
-        </w:tc>
-        <w:tc>
-          <w:tcPr>
-            <w:tcW w:type="dxa" w:w="1236"/>
-            <w:tcMar>
-              <w:top w:type="dxa" w:w="25"/>
-              <w:left w:type="dxa" w:w="70"/>
-              <w:bottom w:type="dxa" w:w="25"/>
-              <w:right w:type="dxa" w:w="70"/>
-            </w:tcMar>
-          </w:tcPr>
-          <w:p>
-            <w:r>
-              <w:rPr>
-                <w:rFonts w:ascii="Malgun Gothic" w:cs="Malgun Gothic" w:eastAsia="Malgun Gothic" w:hAnsi="Malgun Gothic"/>
-                <w:b w:val="false"/>
-                <w:bCs w:val="false"/>
-                <w:sz w:val="15"/>
-                <w:szCs w:val="15"/>
-              </w:rPr>
-              <w:t xml:space="preserve">Good</w:t>
-            </w:r>
-          </w:p>
-        </w:tc>
-        <w:tc>
-          <w:tcPr>
-            <w:tcW w:type="dxa" w:w="1182"/>
-            <w:tcMar>
-              <w:top w:type="dxa" w:w="25"/>
-              <w:left w:type="dxa" w:w="70"/>
-              <w:bottom w:type="dxa" w:w="25"/>
-              <w:right w:type="dxa" w:w="70"/>
-            </w:tcMar>
-          </w:tcPr>
-          <w:p>
-            <w:r>
-              <w:rPr>
-                <w:rFonts w:ascii="Malgun Gothic" w:cs="Malgun Gothic" w:eastAsia="Malgun Gothic" w:hAnsi="Malgun Gothic"/>
-                <w:b w:val="false"/>
-                <w:bCs w:val="false"/>
-                <w:sz w:val="15"/>
-                <w:szCs w:val="15"/>
-              </w:rPr>
-              <w:t xml:space="preserve">Very low</w:t>
             </w:r>
           </w:p>
         </w:tc>

</xml_diff>

<commit_message>
Table 1: split AANHPI into Asian American vs NHPI subgroup sections
The disaggregated section sorted Asian and NHPI subgroups together by IRR,
so the two Pacific Islander groups (Guamanian/Chamorro/Samoan 0.72; Native
Hawaiian 1.21) were scattered among the Asian groups and only Native
Hawaiian read as NHPI. Split into two labeled sections — 'Asian American
subgroups' and 'Native Hawaiian and Pacific Islander (NHPI) subgroups' —
each sorted by IRR with its aggregate last. Makes the composition explicit
and shows the opposite direction of the Asian (mostly <1) vs NHPI (Native
Hawaiian >1) groups.

Co-Authored-By: Claude Opus 4.8 <noreply@anthropic.com>
Claude-Session: https://claude.ai/code/session_01CuLT4FKRBtsU22Vwfjj2qn
</commit_message>
<xml_diff>
--- a/meta_agents/search_v2/outputs/Main_Text_Tables_Figures.docx
+++ b/meta_agents/search_v2/outputs/Main_Text_Tables_Figures.docx
@@ -958,7 +958,7 @@
                 <w:sz w:val="16"/>
                 <w:szCs w:val="16"/>
               </w:rPr>
-              <w:t xml:space="preserve">Asian American / Native Hawaiian / Pacific Islander subgroups</w:t>
+              <w:t xml:space="preserve">Asian American subgroups</w:t>
             </w:r>
           </w:p>
         </w:tc>
@@ -1798,7 +1798,7 @@
                 <w:sz w:val="15"/>
                 <w:szCs w:val="15"/>
               </w:rPr>
-              <w:t xml:space="preserve">Guamanian/Chamorro/Samoan</w:t>
+              <w:t xml:space="preserve">Chinese</w:t>
             </w:r>
           </w:p>
         </w:tc>
@@ -1844,7 +1844,7 @@
                 <w:sz w:val="15"/>
                 <w:szCs w:val="15"/>
               </w:rPr>
-              <w:t xml:space="preserve">0.723 [0.641, 0.817]</w:t>
+              <w:t xml:space="preserve">0.760 [0.745, 0.775]</w:t>
             </w:r>
           </w:p>
         </w:tc>
@@ -1961,7 +1961,7 @@
                 <w:sz w:val="15"/>
                 <w:szCs w:val="15"/>
               </w:rPr>
-              <w:t xml:space="preserve">Chinese</w:t>
+              <w:t xml:space="preserve">Filipina</w:t>
             </w:r>
           </w:p>
         </w:tc>
@@ -2007,7 +2007,7 @@
                 <w:sz w:val="15"/>
                 <w:szCs w:val="15"/>
               </w:rPr>
-              <w:t xml:space="preserve">0.760 [0.745, 0.775]</w:t>
+              <w:t xml:space="preserve">0.857 [0.839, 0.874]</w:t>
             </w:r>
           </w:p>
         </w:tc>
@@ -2124,7 +2124,7 @@
                 <w:sz w:val="15"/>
                 <w:szCs w:val="15"/>
               </w:rPr>
-              <w:t xml:space="preserve">Filipina</w:t>
+              <w:t xml:space="preserve">Asian Indian/Pakistani</w:t>
             </w:r>
           </w:p>
         </w:tc>
@@ -2170,7 +2170,7 @@
                 <w:sz w:val="15"/>
                 <w:szCs w:val="15"/>
               </w:rPr>
-              <w:t xml:space="preserve">0.857 [0.839, 0.874]</w:t>
+              <w:t xml:space="preserve">0.958 [0.937, 0.979]</w:t>
             </w:r>
           </w:p>
         </w:tc>
@@ -2287,7 +2287,7 @@
                 <w:sz w:val="15"/>
                 <w:szCs w:val="15"/>
               </w:rPr>
-              <w:t xml:space="preserve">Asian Indian/Pakistani</w:t>
+              <w:t xml:space="preserve">Japanese</w:t>
             </w:r>
           </w:p>
         </w:tc>
@@ -2333,7 +2333,7 @@
                 <w:sz w:val="15"/>
                 <w:szCs w:val="15"/>
               </w:rPr>
-              <w:t xml:space="preserve">0.958 [0.937, 0.979]</w:t>
+              <w:t xml:space="preserve">1.045 [1.009, 1.083]</w:t>
             </w:r>
           </w:p>
         </w:tc>
@@ -2450,7 +2450,7 @@
                 <w:sz w:val="15"/>
                 <w:szCs w:val="15"/>
               </w:rPr>
-              <w:t xml:space="preserve">Japanese</w:t>
+              <w:t xml:space="preserve">Asian American (aggregate)</w:t>
             </w:r>
           </w:p>
         </w:tc>
@@ -2496,7 +2496,7 @@
                 <w:sz w:val="15"/>
                 <w:szCs w:val="15"/>
               </w:rPr>
-              <w:t xml:space="preserve">1.045 [1.009, 1.083]</w:t>
+              <w:t xml:space="preserve">0.792 [0.784, 0.800]</w:t>
             </w:r>
           </w:p>
         </w:tc>
@@ -2596,162 +2596,26 @@
       <w:tr>
         <w:tc>
           <w:tcPr>
-            <w:tcW w:type="dxa" w:w="3116"/>
-            <w:tcMar>
-              <w:top w:type="dxa" w:w="25"/>
-              <w:left w:type="dxa" w:w="70"/>
-              <w:bottom w:type="dxa" w:w="25"/>
-              <w:right w:type="dxa" w:w="70"/>
-            </w:tcMar>
-          </w:tcPr>
-          <w:p>
-            <w:r>
-              <w:rPr>
-                <w:rFonts w:ascii="Malgun Gothic" w:cs="Malgun Gothic" w:eastAsia="Malgun Gothic" w:hAnsi="Malgun Gothic"/>
-                <w:b w:val="false"/>
-                <w:bCs w:val="false"/>
-                <w:sz w:val="15"/>
-                <w:szCs w:val="15"/>
-              </w:rPr>
-              <w:t xml:space="preserve">Native Hawaiian</w:t>
-            </w:r>
-          </w:p>
-        </w:tc>
-        <w:tc>
-          <w:tcPr>
-            <w:tcW w:type="dxa" w:w="1021"/>
-            <w:tcMar>
-              <w:top w:type="dxa" w:w="25"/>
-              <w:left w:type="dxa" w:w="70"/>
-              <w:bottom w:type="dxa" w:w="25"/>
-              <w:right w:type="dxa" w:w="70"/>
-            </w:tcMar>
-          </w:tcPr>
-          <w:p>
-            <w:r>
-              <w:rPr>
-                <w:rFonts w:ascii="Malgun Gothic" w:cs="Malgun Gothic" w:eastAsia="Malgun Gothic" w:hAnsi="Malgun Gothic"/>
-                <w:b w:val="false"/>
-                <w:bCs w:val="false"/>
-                <w:sz w:val="15"/>
-                <w:szCs w:val="15"/>
-              </w:rPr>
-              <w:t xml:space="preserve">IRR</w:t>
-            </w:r>
-          </w:p>
-        </w:tc>
-        <w:tc>
-          <w:tcPr>
-            <w:tcW w:type="dxa" w:w="2901"/>
-            <w:tcMar>
-              <w:top w:type="dxa" w:w="25"/>
-              <w:left w:type="dxa" w:w="70"/>
-              <w:bottom w:type="dxa" w:w="25"/>
-              <w:right w:type="dxa" w:w="70"/>
-            </w:tcMar>
-          </w:tcPr>
-          <w:p>
-            <w:r>
-              <w:rPr>
-                <w:rFonts w:ascii="Malgun Gothic" w:cs="Malgun Gothic" w:eastAsia="Malgun Gothic" w:hAnsi="Malgun Gothic"/>
-                <w:b w:val="false"/>
-                <w:bCs w:val="false"/>
-                <w:sz w:val="15"/>
-                <w:szCs w:val="15"/>
-              </w:rPr>
-              <w:t xml:space="preserve">1.211 [1.123, 1.305]</w:t>
-            </w:r>
-          </w:p>
-        </w:tc>
-        <w:tc>
-          <w:tcPr>
-            <w:tcW w:type="dxa" w:w="2687"/>
-            <w:tcMar>
-              <w:top w:type="dxa" w:w="25"/>
-              <w:left w:type="dxa" w:w="70"/>
-              <w:bottom w:type="dxa" w:w="25"/>
-              <w:right w:type="dxa" w:w="70"/>
-            </w:tcMar>
-          </w:tcPr>
-          <w:p>
-            <w:r>
-              <w:rPr>
-                <w:rFonts w:ascii="Malgun Gothic" w:cs="Malgun Gothic" w:eastAsia="Malgun Gothic" w:hAnsi="Malgun Gothic"/>
-                <w:b w:val="false"/>
-                <w:bCs w:val="false"/>
-                <w:sz w:val="15"/>
-                <w:szCs w:val="15"/>
-              </w:rPr>
-              <w:t xml:space="preserve">Miller 2008 (1998-2002)</w:t>
-            </w:r>
-          </w:p>
-        </w:tc>
-        <w:tc>
-          <w:tcPr>
-            <w:tcW w:type="dxa" w:w="2257"/>
-            <w:tcMar>
-              <w:top w:type="dxa" w:w="25"/>
-              <w:left w:type="dxa" w:w="70"/>
-              <w:bottom w:type="dxa" w:w="25"/>
-              <w:right w:type="dxa" w:w="70"/>
-            </w:tcMar>
-          </w:tcPr>
-          <w:p>
-            <w:r>
-              <w:rPr>
-                <w:rFonts w:ascii="Malgun Gothic" w:cs="Malgun Gothic" w:eastAsia="Malgun Gothic" w:hAnsi="Malgun Gothic"/>
-                <w:b w:val="false"/>
-                <w:bCs w:val="false"/>
-                <w:sz w:val="15"/>
-                <w:szCs w:val="15"/>
-              </w:rPr>
-              <w:t xml:space="preserve">NAACCR/CiNA (~93%)</w:t>
-            </w:r>
-          </w:p>
-        </w:tc>
-        <w:tc>
-          <w:tcPr>
-            <w:tcW w:type="dxa" w:w="1236"/>
-            <w:tcMar>
-              <w:top w:type="dxa" w:w="25"/>
-              <w:left w:type="dxa" w:w="70"/>
-              <w:bottom w:type="dxa" w:w="25"/>
-              <w:right w:type="dxa" w:w="70"/>
-            </w:tcMar>
-          </w:tcPr>
-          <w:p>
-            <w:r>
-              <w:rPr>
-                <w:rFonts w:ascii="Malgun Gothic" w:cs="Malgun Gothic" w:eastAsia="Malgun Gothic" w:hAnsi="Malgun Gothic"/>
-                <w:b w:val="false"/>
-                <w:bCs w:val="false"/>
-                <w:sz w:val="15"/>
-                <w:szCs w:val="15"/>
-              </w:rPr>
-              <w:t xml:space="preserve">Good</w:t>
-            </w:r>
-          </w:p>
-        </w:tc>
-        <w:tc>
-          <w:tcPr>
-            <w:tcW w:type="dxa" w:w="1182"/>
-            <w:tcMar>
-              <w:top w:type="dxa" w:w="25"/>
-              <w:left w:type="dxa" w:w="70"/>
-              <w:bottom w:type="dxa" w:w="25"/>
-              <w:right w:type="dxa" w:w="70"/>
-            </w:tcMar>
-          </w:tcPr>
-          <w:p>
-            <w:r>
-              <w:rPr>
-                <w:rFonts w:ascii="Malgun Gothic" w:cs="Malgun Gothic" w:eastAsia="Malgun Gothic" w:hAnsi="Malgun Gothic"/>
-                <w:b w:val="false"/>
-                <w:bCs w:val="false"/>
-                <w:sz w:val="15"/>
-                <w:szCs w:val="15"/>
-              </w:rPr>
-              <w:t xml:space="preserve">Low</w:t>
+            <w:tcW w:type="dxa" w:w="14400"/>
+            <w:gridSpan w:val="7"/>
+            <w:shd w:fill="D9E2EF" w:color="auto" w:val="clear"/>
+            <w:tcMar>
+              <w:top w:type="dxa" w:w="30"/>
+              <w:left w:type="dxa" w:w="70"/>
+              <w:bottom w:type="dxa" w:w="30"/>
+              <w:right w:type="dxa" w:w="70"/>
+            </w:tcMar>
+          </w:tcPr>
+          <w:p>
+            <w:r>
+              <w:rPr>
+                <w:rFonts w:ascii="Malgun Gothic" w:cs="Malgun Gothic" w:eastAsia="Malgun Gothic" w:hAnsi="Malgun Gothic"/>
+                <w:b/>
+                <w:bCs/>
+                <w:sz w:val="16"/>
+                <w:szCs w:val="16"/>
+              </w:rPr>
+              <w:t xml:space="preserve">Native Hawaiian and Pacific Islander (NHPI) subgroups</w:t>
             </w:r>
           </w:p>
         </w:tc>
@@ -2776,7 +2640,7 @@
                 <w:sz w:val="15"/>
                 <w:szCs w:val="15"/>
               </w:rPr>
-              <w:t xml:space="preserve">Asian American (aggregate)</w:t>
+              <w:t xml:space="preserve">Guamanian/Chamorro/Samoan</w:t>
             </w:r>
           </w:p>
         </w:tc>
@@ -2822,7 +2686,7 @@
                 <w:sz w:val="15"/>
                 <w:szCs w:val="15"/>
               </w:rPr>
-              <w:t xml:space="preserve">0.792 [0.784, 0.800]</w:t>
+              <w:t xml:space="preserve">0.723 [0.641, 0.817]</w:t>
             </w:r>
           </w:p>
         </w:tc>
@@ -2869,6 +2733,169 @@
                 <w:szCs w:val="15"/>
               </w:rPr>
               <w:t xml:space="preserve">SEER-national</w:t>
+            </w:r>
+          </w:p>
+        </w:tc>
+        <w:tc>
+          <w:tcPr>
+            <w:tcW w:type="dxa" w:w="1236"/>
+            <w:tcMar>
+              <w:top w:type="dxa" w:w="25"/>
+              <w:left w:type="dxa" w:w="70"/>
+              <w:bottom w:type="dxa" w:w="25"/>
+              <w:right w:type="dxa" w:w="70"/>
+            </w:tcMar>
+          </w:tcPr>
+          <w:p>
+            <w:r>
+              <w:rPr>
+                <w:rFonts w:ascii="Malgun Gothic" w:cs="Malgun Gothic" w:eastAsia="Malgun Gothic" w:hAnsi="Malgun Gothic"/>
+                <w:b w:val="false"/>
+                <w:bCs w:val="false"/>
+                <w:sz w:val="15"/>
+                <w:szCs w:val="15"/>
+              </w:rPr>
+              <w:t xml:space="preserve">Good</w:t>
+            </w:r>
+          </w:p>
+        </w:tc>
+        <w:tc>
+          <w:tcPr>
+            <w:tcW w:type="dxa" w:w="1182"/>
+            <w:tcMar>
+              <w:top w:type="dxa" w:w="25"/>
+              <w:left w:type="dxa" w:w="70"/>
+              <w:bottom w:type="dxa" w:w="25"/>
+              <w:right w:type="dxa" w:w="70"/>
+            </w:tcMar>
+          </w:tcPr>
+          <w:p>
+            <w:r>
+              <w:rPr>
+                <w:rFonts w:ascii="Malgun Gothic" w:cs="Malgun Gothic" w:eastAsia="Malgun Gothic" w:hAnsi="Malgun Gothic"/>
+                <w:b w:val="false"/>
+                <w:bCs w:val="false"/>
+                <w:sz w:val="15"/>
+                <w:szCs w:val="15"/>
+              </w:rPr>
+              <w:t xml:space="preserve">Low</w:t>
+            </w:r>
+          </w:p>
+        </w:tc>
+      </w:tr>
+      <w:tr>
+        <w:tc>
+          <w:tcPr>
+            <w:tcW w:type="dxa" w:w="3116"/>
+            <w:tcMar>
+              <w:top w:type="dxa" w:w="25"/>
+              <w:left w:type="dxa" w:w="70"/>
+              <w:bottom w:type="dxa" w:w="25"/>
+              <w:right w:type="dxa" w:w="70"/>
+            </w:tcMar>
+          </w:tcPr>
+          <w:p>
+            <w:r>
+              <w:rPr>
+                <w:rFonts w:ascii="Malgun Gothic" w:cs="Malgun Gothic" w:eastAsia="Malgun Gothic" w:hAnsi="Malgun Gothic"/>
+                <w:b w:val="false"/>
+                <w:bCs w:val="false"/>
+                <w:sz w:val="15"/>
+                <w:szCs w:val="15"/>
+              </w:rPr>
+              <w:t xml:space="preserve">Native Hawaiian</w:t>
+            </w:r>
+          </w:p>
+        </w:tc>
+        <w:tc>
+          <w:tcPr>
+            <w:tcW w:type="dxa" w:w="1021"/>
+            <w:tcMar>
+              <w:top w:type="dxa" w:w="25"/>
+              <w:left w:type="dxa" w:w="70"/>
+              <w:bottom w:type="dxa" w:w="25"/>
+              <w:right w:type="dxa" w:w="70"/>
+            </w:tcMar>
+          </w:tcPr>
+          <w:p>
+            <w:r>
+              <w:rPr>
+                <w:rFonts w:ascii="Malgun Gothic" w:cs="Malgun Gothic" w:eastAsia="Malgun Gothic" w:hAnsi="Malgun Gothic"/>
+                <w:b w:val="false"/>
+                <w:bCs w:val="false"/>
+                <w:sz w:val="15"/>
+                <w:szCs w:val="15"/>
+              </w:rPr>
+              <w:t xml:space="preserve">IRR</w:t>
+            </w:r>
+          </w:p>
+        </w:tc>
+        <w:tc>
+          <w:tcPr>
+            <w:tcW w:type="dxa" w:w="2901"/>
+            <w:tcMar>
+              <w:top w:type="dxa" w:w="25"/>
+              <w:left w:type="dxa" w:w="70"/>
+              <w:bottom w:type="dxa" w:w="25"/>
+              <w:right w:type="dxa" w:w="70"/>
+            </w:tcMar>
+          </w:tcPr>
+          <w:p>
+            <w:r>
+              <w:rPr>
+                <w:rFonts w:ascii="Malgun Gothic" w:cs="Malgun Gothic" w:eastAsia="Malgun Gothic" w:hAnsi="Malgun Gothic"/>
+                <w:b w:val="false"/>
+                <w:bCs w:val="false"/>
+                <w:sz w:val="15"/>
+                <w:szCs w:val="15"/>
+              </w:rPr>
+              <w:t xml:space="preserve">1.211 [1.123, 1.305]</w:t>
+            </w:r>
+          </w:p>
+        </w:tc>
+        <w:tc>
+          <w:tcPr>
+            <w:tcW w:type="dxa" w:w="2687"/>
+            <w:tcMar>
+              <w:top w:type="dxa" w:w="25"/>
+              <w:left w:type="dxa" w:w="70"/>
+              <w:bottom w:type="dxa" w:w="25"/>
+              <w:right w:type="dxa" w:w="70"/>
+            </w:tcMar>
+          </w:tcPr>
+          <w:p>
+            <w:r>
+              <w:rPr>
+                <w:rFonts w:ascii="Malgun Gothic" w:cs="Malgun Gothic" w:eastAsia="Malgun Gothic" w:hAnsi="Malgun Gothic"/>
+                <w:b w:val="false"/>
+                <w:bCs w:val="false"/>
+                <w:sz w:val="15"/>
+                <w:szCs w:val="15"/>
+              </w:rPr>
+              <w:t xml:space="preserve">Miller 2008 (1998-2002)</w:t>
+            </w:r>
+          </w:p>
+        </w:tc>
+        <w:tc>
+          <w:tcPr>
+            <w:tcW w:type="dxa" w:w="2257"/>
+            <w:tcMar>
+              <w:top w:type="dxa" w:w="25"/>
+              <w:left w:type="dxa" w:w="70"/>
+              <w:bottom w:type="dxa" w:w="25"/>
+              <w:right w:type="dxa" w:w="70"/>
+            </w:tcMar>
+          </w:tcPr>
+          <w:p>
+            <w:r>
+              <w:rPr>
+                <w:rFonts w:ascii="Malgun Gothic" w:cs="Malgun Gothic" w:eastAsia="Malgun Gothic" w:hAnsi="Malgun Gothic"/>
+                <w:b w:val="false"/>
+                <w:bCs w:val="false"/>
+                <w:sz w:val="15"/>
+                <w:szCs w:val="15"/>
+              </w:rPr>
+              <w:t xml:space="preserve">NAACCR/CiNA (~93%)</w:t>
             </w:r>
           </w:p>
         </w:tc>

</xml_diff>

<commit_message>
Figure 2: clarify aggregate is population-weighted (not a pool); fix title terminology
The ▶ aggregate diamond is the directly-reported population-weighted rate
for the umbrella group, not a meta-analytic pool of the subgroups above it.
Because Native Hawaiians dominate the NHPI population, the NHPI aggregate
(1.21) sits near the Native Hawaiian value and conceals the far lower
Guamanian/Chamorro/Samoan rate (0.72) — a caption now states this so the
diamond is not misread as an average of 0.72 and 1.21. Retitle the forest
'Asian American and NHPI' to match the section headers and unified
terminology.

Co-Authored-By: Claude Opus 4.8 <noreply@anthropic.com>
Claude-Session: https://claude.ai/code/session_01CuLT4FKRBtsU22Vwfjj2qn
</commit_message>
<xml_diff>
--- a/meta_agents/search_v2/outputs/Main_Text_Tables_Figures.docx
+++ b/meta_agents/search_v2/outputs/Main_Text_Tables_Figures.docx
@@ -6293,7 +6293,7 @@
       <w:r>
         <w:drawing>
           <wp:inline distT="0" distB="0" distL="0" distR="0">
-            <wp:extent cx="6858000" cy="4476750"/>
+            <wp:extent cx="6858000" cy="4667250"/>
             <wp:effectExtent t="0" r="0" b="0" l="0"/>
             <wp:docPr id="1" name="" descr="" title=""/>
             <wp:cNvGraphicFramePr>
@@ -6318,7 +6318,7 @@
                   <pic:spPr bwMode="auto">
                     <a:xfrm>
                       <a:off x="0" y="0"/>
-                      <a:ext cx="6858000" cy="4476750"/>
+                      <a:ext cx="6858000" cy="4667250"/>
                     </a:xfrm>
                     <a:prstGeom prst="rect">
                       <a:avLst/>
@@ -6335,6 +6335,21 @@
       <w:pPr>
         <w:spacing w:after="80"/>
       </w:pPr>
+    </w:p>
+    <w:p>
+      <w:pPr>
+        <w:spacing w:after="80"/>
+      </w:pPr>
+      <w:r>
+        <w:rPr>
+          <w:rFonts w:ascii="Malgun Gothic" w:cs="Malgun Gothic" w:eastAsia="Malgun Gothic" w:hAnsi="Malgun Gothic"/>
+          <w:i/>
+          <w:iCs/>
+          <w:sz w:val="18"/>
+          <w:szCs w:val="18"/>
+        </w:rPr>
+        <w:t xml:space="preserve">Each ▶ aggregate diamond is the directly-reported, population-weighted incidence for that umbrella group — not a pooled average of the subgroups above it. Because Native Hawaiians are the large majority of the NHPI population, the NHPI aggregate (1.21) sits near the Native Hawaiian value and conceals the much lower Guamanian/Chamorro/Samoan rate (0.72); likewise the Asian American aggregate (0.79) conceals a range from Hmong (0.16) to Japanese (1.04).</w:t>
+      </w:r>
     </w:p>
     <w:p>
       <w:r>

</xml_diff>

<commit_message>
Remove Figure 2 interpretive caption (data-only package)
The population-weighting explanation is interpretation that belongs in the
manuscript Results/Discussion, not in the data-only figure package; drop it.
Keep the retitled 'Asian American and NHPI' forest. The Native Hawaiian
representative (Miller 2008) stays as selected by the one-per-registry-family
coverage rules — not swapped to make the figure look tidier.

Co-Authored-By: Claude Opus 4.8 <noreply@anthropic.com>
Claude-Session: https://claude.ai/code/session_01CuLT4FKRBtsU22Vwfjj2qn
</commit_message>
<xml_diff>
--- a/meta_agents/search_v2/outputs/Main_Text_Tables_Figures.docx
+++ b/meta_agents/search_v2/outputs/Main_Text_Tables_Figures.docx
@@ -6335,21 +6335,6 @@
       <w:pPr>
         <w:spacing w:after="80"/>
       </w:pPr>
-    </w:p>
-    <w:p>
-      <w:pPr>
-        <w:spacing w:after="80"/>
-      </w:pPr>
-      <w:r>
-        <w:rPr>
-          <w:rFonts w:ascii="Malgun Gothic" w:cs="Malgun Gothic" w:eastAsia="Malgun Gothic" w:hAnsi="Malgun Gothic"/>
-          <w:i/>
-          <w:iCs/>
-          <w:sz w:val="18"/>
-          <w:szCs w:val="18"/>
-        </w:rPr>
-        <w:t xml:space="preserve">Each ▶ aggregate diamond is the directly-reported, population-weighted incidence for that umbrella group — not a pooled average of the subgroups above it. Because Native Hawaiians are the large majority of the NHPI population, the NHPI aggregate (1.21) sits near the Native Hawaiian value and conceals the much lower Guamanian/Chamorro/Samoan rate (0.72); likewise the Asian American aggregate (0.79) conceals a range from Hmong (0.16) to Japanese (1.04).</w:t>
-      </w:r>
     </w:p>
     <w:p>
       <w:r>

</xml_diff>

<commit_message>
Mark unstratified-White comparators in the main text
The supplementary now labels comparators faithfully; carry the same honesty into
the main text so no White-comparator estimate reads as NHW:
- make_table1.py: append a dagger to the estimate of any Table 1 row whose
  reference is an unstratified White group (4 rows: TNBC in Chinese/Filipino/
  Native Hawaiian, and male breast cancer in Black men).
- make_maintext.py: Table 1 note explains the dagger (unstratified White may
  raise the IRR slightly; evaluated in Supplementary Table 9c) and points to the
  per-study comparator/standard-population detail; Figure 2 gains a one-line note
  that the Asian Indian/Pakistani estimate is an SIR vs an unstratified White
  reference. All other main-text comparisons are versus NHW.
- Rebuild both documents and refresh Meta_deliverables.zip.

Co-Authored-By: Claude Opus 4.8 <noreply@anthropic.com>
Claude-Session: https://claude.ai/code/session_01CuLT4FKRBtsU22Vwfjj2qn
</commit_message>
<xml_diff>
--- a/meta_agents/search_v2/outputs/Main_Text_Tables_Figures.docx
+++ b/meta_agents/search_v2/outputs/Main_Text_Tables_Figures.docx
@@ -60,7 +60,7 @@
           <w:sz w:val="18"/>
           <w:szCs w:val="18"/>
         </w:rPr>
-        <w:t xml:space="preserve">One representative estimate per group (one estimate per registry family). Effect measure is the incidence rate ratio (IRR) unless noted as a standardized incidence ratio (SIR). Comparisons are versus non-Hispanic White (NHW) women; Black denotes non-Hispanic Black (NHB), and the Asian/Pacific Islander aggregate is labeled AANHPI (Asian American, Native Hawaiian, and Pacific Islander), with the Pacific-Islander subset shown separately as NHPI. RoB = Newcastle-Ottawa rating of the representative study; GRADE = certainty of evidence. Full per-estimate detail is in the Supplementary Materials.</w:t>
+        <w:t xml:space="preserve">One representative estimate per group (one estimate per registry family). Effect measure is the incidence rate ratio (IRR) unless noted as a standardized incidence ratio (SIR). Comparisons are versus non-Hispanic White (NHW) women, except where marked † — the reference in that study was an unstratified White group (not stratified by Hispanic origin), which may raise the IRR slightly; these estimates are examined in the NHW-comparator sensitivity analysis (Supplementary Table 9c). Black denotes non-Hispanic Black (NHB), and the Asian/Pacific Islander aggregate is labeled AANHPI (Asian American, Native Hawaiian, and Pacific Islander), with the Pacific-Islander subset shown separately as NHPI. RoB = Newcastle-Ottawa rating of the representative study; GRADE = certainty of evidence. Full per-estimate detail, including each study's comparator and standard population, is in the Supplementary Materials.</w:t>
       </w:r>
     </w:p>
     <w:tbl>
@@ -4750,7 +4750,7 @@
                 <w:sz w:val="15"/>
                 <w:szCs w:val="15"/>
               </w:rPr>
-              <w:t xml:space="preserve">0.53 [0.39, 0.71]</w:t>
+              <w:t xml:space="preserve">0.53 [0.39, 0.71] †</w:t>
             </w:r>
           </w:p>
         </w:tc>
@@ -5239,7 +5239,7 @@
                 <w:sz w:val="15"/>
                 <w:szCs w:val="15"/>
               </w:rPr>
-              <w:t xml:space="preserve">0.84 [0.8, 0.88]</w:t>
+              <w:t xml:space="preserve">0.84 [0.8, 0.88] †</w:t>
             </w:r>
           </w:p>
         </w:tc>
@@ -5728,7 +5728,7 @@
                 <w:sz w:val="15"/>
                 <w:szCs w:val="15"/>
               </w:rPr>
-              <w:t xml:space="preserve">0.86 [0.79, 0.91]</w:t>
+              <w:t xml:space="preserve">0.86 [0.79, 0.91] †</w:t>
             </w:r>
           </w:p>
         </w:tc>
@@ -6081,7 +6081,7 @@
                 <w:sz w:val="15"/>
                 <w:szCs w:val="15"/>
               </w:rPr>
-              <w:t xml:space="preserve">1.52 [1.44, 1.6]</w:t>
+              <w:t xml:space="preserve">1.52 [1.44, 1.6] †</w:t>
             </w:r>
           </w:p>
         </w:tc>
@@ -6335,6 +6335,21 @@
       <w:pPr>
         <w:spacing w:after="80"/>
       </w:pPr>
+    </w:p>
+    <w:p>
+      <w:pPr>
+        <w:spacing w:after="80"/>
+      </w:pPr>
+      <w:r>
+        <w:rPr>
+          <w:rFonts w:ascii="Malgun Gothic" w:cs="Malgun Gothic" w:eastAsia="Malgun Gothic" w:hAnsi="Malgun Gothic"/>
+          <w:i/>
+          <w:iCs/>
+          <w:sz w:val="18"/>
+          <w:szCs w:val="18"/>
+        </w:rPr>
+        <w:t xml:space="preserve">Comparisons are versus non-Hispanic White women, except the Asian Indian/Pakistani estimate, which is a standardized incidence ratio against an unstratified White reference (Supplementary Table 4).</w:t>
+      </w:r>
     </w:p>
     <w:p>
       <w:r>

</xml_diff>

<commit_message>
Feedback3 Tier 1: retitle to 'Systematic Review with Quantitative Synthesis'; exclude male breast cancer (female scope, 85->80 cells); use Pinheiro's reported NHW-Florida rate 140.4 [137.6,143.2] as Hispanic-origin denominator instead of an estimated one; regenerate tables/figures/supplement; all crosschecks pass
</commit_message>
<xml_diff>
--- a/meta_agents/search_v2/outputs/Main_Text_Tables_Figures.docx
+++ b/meta_agents/search_v2/outputs/Main_Text_Tables_Figures.docx
@@ -29,7 +29,7 @@
           <w:sz w:val="20"/>
           <w:szCs w:val="20"/>
         </w:rPr>
-        <w:t xml:space="preserve">Racial and Ethnic Differences in Breast Cancer Incidence in the United States: A Systematic Review and Meta-Analysis</w:t>
+        <w:t xml:space="preserve">Racial and Ethnic Differences in Breast Cancer Incidence in the United States: A Systematic Review with Quantitative Synthesis</w:t>
       </w:r>
     </w:p>
     <w:p>
@@ -2786,7 +2786,7 @@
                 <w:sz w:val="15"/>
                 <w:szCs w:val="15"/>
               </w:rPr>
-              <w:t xml:space="preserve">0.503 [0.376, 0.673]</w:t>
+              <w:t xml:space="preserve">0.512 [0.382, 0.686]</w:t>
             </w:r>
           </w:p>
         </w:tc>
@@ -2926,7 +2926,7 @@
                 <w:sz w:val="15"/>
                 <w:szCs w:val="15"/>
               </w:rPr>
-              <w:t xml:space="preserve">0.684 [0.619, 0.756]</w:t>
+              <w:t xml:space="preserve">0.697 [0.629, 0.771]</w:t>
             </w:r>
           </w:p>
         </w:tc>
@@ -3066,7 +3066,7 @@
                 <w:sz w:val="15"/>
                 <w:szCs w:val="15"/>
               </w:rPr>
-              <w:t xml:space="preserve">0.755 [0.677, 0.842]</w:t>
+              <w:t xml:space="preserve">0.769 [0.688, 0.860]</w:t>
             </w:r>
           </w:p>
         </w:tc>
@@ -3206,7 +3206,7 @@
                 <w:sz w:val="15"/>
                 <w:szCs w:val="15"/>
               </w:rPr>
-              <w:t xml:space="preserve">0.817 [0.726, 0.920]</w:t>
+              <w:t xml:space="preserve">0.833 [0.738, 0.939]</w:t>
             </w:r>
           </w:p>
         </w:tc>
@@ -5131,173 +5131,6 @@
                 <w:szCs w:val="15"/>
               </w:rPr>
               <w:t xml:space="preserve">Sung 2023 (2015-2019)</w:t>
-            </w:r>
-          </w:p>
-        </w:tc>
-        <w:tc>
-          <w:tcPr>
-            <w:tcW w:type="dxa" w:w="2473"/>
-            <w:tcMar>
-              <w:top w:type="dxa" w:w="25"/>
-              <w:left w:type="dxa" w:w="70"/>
-              <w:bottom w:type="dxa" w:w="25"/>
-              <w:right w:type="dxa" w:w="70"/>
-            </w:tcMar>
-          </w:tcPr>
-          <w:p>
-            <w:r>
-              <w:rPr>
-                <w:rFonts w:ascii="Malgun Gothic" w:cs="Malgun Gothic" w:eastAsia="Malgun Gothic" w:hAnsi="Malgun Gothic"/>
-                <w:b w:val="false"/>
-                <w:bCs w:val="false"/>
-                <w:sz w:val="15"/>
-                <w:szCs w:val="15"/>
-              </w:rPr>
-              <w:t xml:space="preserve">USCS(NPCR+SEER ~99%)</w:t>
-            </w:r>
-          </w:p>
-        </w:tc>
-        <w:tc>
-          <w:tcPr>
-            <w:tcW w:type="dxa" w:w="1429"/>
-            <w:tcMar>
-              <w:top w:type="dxa" w:w="25"/>
-              <w:left w:type="dxa" w:w="70"/>
-              <w:bottom w:type="dxa" w:w="25"/>
-              <w:right w:type="dxa" w:w="70"/>
-            </w:tcMar>
-          </w:tcPr>
-          <w:p>
-            <w:r>
-              <w:rPr>
-                <w:rFonts w:ascii="Malgun Gothic" w:cs="Malgun Gothic" w:eastAsia="Malgun Gothic" w:hAnsi="Malgun Gothic"/>
-                <w:b w:val="false"/>
-                <w:bCs w:val="false"/>
-                <w:sz w:val="15"/>
-                <w:szCs w:val="15"/>
-              </w:rPr>
-              <w:t xml:space="preserve">Low</w:t>
-            </w:r>
-          </w:p>
-        </w:tc>
-      </w:tr>
-      <w:tr>
-        <w:tc>
-          <w:tcPr>
-            <w:tcW w:type="dxa" w:w="14400"/>
-            <w:gridSpan w:val="6"/>
-            <w:shd w:fill="D9E2EF" w:color="auto" w:val="clear"/>
-            <w:tcMar>
-              <w:top w:type="dxa" w:w="30"/>
-              <w:left w:type="dxa" w:w="70"/>
-              <w:bottom w:type="dxa" w:w="30"/>
-              <w:right w:type="dxa" w:w="70"/>
-            </w:tcMar>
-          </w:tcPr>
-          <w:p>
-            <w:r>
-              <w:rPr>
-                <w:rFonts w:ascii="Malgun Gothic" w:cs="Malgun Gothic" w:eastAsia="Malgun Gothic" w:hAnsi="Malgun Gothic"/>
-                <w:b/>
-                <w:bCs/>
-                <w:sz w:val="16"/>
-                <w:szCs w:val="16"/>
-              </w:rPr>
-              <w:t xml:space="preserve">Male breast cancer</w:t>
-            </w:r>
-          </w:p>
-        </w:tc>
-      </w:tr>
-      <w:tr>
-        <w:tc>
-          <w:tcPr>
-            <w:tcW w:type="dxa" w:w="3353"/>
-            <w:tcMar>
-              <w:top w:type="dxa" w:w="25"/>
-              <w:left w:type="dxa" w:w="70"/>
-              <w:bottom w:type="dxa" w:w="25"/>
-              <w:right w:type="dxa" w:w="70"/>
-            </w:tcMar>
-          </w:tcPr>
-          <w:p>
-            <w:r>
-              <w:rPr>
-                <w:rFonts w:ascii="Malgun Gothic" w:cs="Malgun Gothic" w:eastAsia="Malgun Gothic" w:hAnsi="Malgun Gothic"/>
-                <w:b w:val="false"/>
-                <w:bCs w:val="false"/>
-                <w:sz w:val="15"/>
-                <w:szCs w:val="15"/>
-              </w:rPr>
-              <w:t xml:space="preserve">Black (men)</w:t>
-            </w:r>
-          </w:p>
-        </w:tc>
-        <w:tc>
-          <w:tcPr>
-            <w:tcW w:type="dxa" w:w="1099"/>
-            <w:tcMar>
-              <w:top w:type="dxa" w:w="25"/>
-              <w:left w:type="dxa" w:w="70"/>
-              <w:bottom w:type="dxa" w:w="25"/>
-              <w:right w:type="dxa" w:w="70"/>
-            </w:tcMar>
-          </w:tcPr>
-          <w:p>
-            <w:r>
-              <w:rPr>
-                <w:rFonts w:ascii="Malgun Gothic" w:cs="Malgun Gothic" w:eastAsia="Malgun Gothic" w:hAnsi="Malgun Gothic"/>
-                <w:b w:val="false"/>
-                <w:bCs w:val="false"/>
-                <w:sz w:val="15"/>
-                <w:szCs w:val="15"/>
-              </w:rPr>
-              <w:t xml:space="preserve">IRR</w:t>
-            </w:r>
-          </w:p>
-        </w:tc>
-        <w:tc>
-          <w:tcPr>
-            <w:tcW w:type="dxa" w:w="3133"/>
-            <w:tcMar>
-              <w:top w:type="dxa" w:w="25"/>
-              <w:left w:type="dxa" w:w="70"/>
-              <w:bottom w:type="dxa" w:w="25"/>
-              <w:right w:type="dxa" w:w="70"/>
-            </w:tcMar>
-          </w:tcPr>
-          <w:p>
-            <w:r>
-              <w:rPr>
-                <w:rFonts w:ascii="Malgun Gothic" w:cs="Malgun Gothic" w:eastAsia="Malgun Gothic" w:hAnsi="Malgun Gothic"/>
-                <w:b w:val="false"/>
-                <w:bCs w:val="false"/>
-                <w:sz w:val="15"/>
-                <w:szCs w:val="15"/>
-              </w:rPr>
-              <w:t xml:space="preserve">1.52 [1.44, 1.6] †</w:t>
-            </w:r>
-          </w:p>
-        </w:tc>
-        <w:tc>
-          <w:tcPr>
-            <w:tcW w:type="dxa" w:w="2913"/>
-            <w:tcMar>
-              <w:top w:type="dxa" w:w="25"/>
-              <w:left w:type="dxa" w:w="70"/>
-              <w:bottom w:type="dxa" w:w="25"/>
-              <w:right w:type="dxa" w:w="70"/>
-            </w:tcMar>
-          </w:tcPr>
-          <w:p>
-            <w:r>
-              <w:rPr>
-                <w:rFonts w:ascii="Malgun Gothic" w:cs="Malgun Gothic" w:eastAsia="Malgun Gothic" w:hAnsi="Malgun Gothic"/>
-                <w:b w:val="false"/>
-                <w:bCs w:val="false"/>
-                <w:sz w:val="15"/>
-                <w:szCs w:val="15"/>
-              </w:rPr>
-              <w:t xml:space="preserve">Sung 2020 (2011-2015)</w:t>
             </w:r>
           </w:p>
         </w:tc>

</xml_diff>

<commit_message>
Feedback3 Tier 4: restructure Discussion into results/heterogeneity/data-quality/interpretation/limitations flow (less repetition); add Figure 4 group-by-dimension heatmap (real data, diverging around NHW=1.0); move forest value labels to a fixed right-hand column so they no longer collide with markers
</commit_message>
<xml_diff>
--- a/meta_agents/search_v2/outputs/Main_Text_Tables_Figures.docx
+++ b/meta_agents/search_v2/outputs/Main_Text_Tables_Figures.docx
@@ -5393,6 +5393,77 @@
                     <a:xfrm>
                       <a:off x="0" y="0"/>
                       <a:ext cx="6858000" cy="4476750"/>
+                    </a:xfrm>
+                    <a:prstGeom prst="rect">
+                      <a:avLst/>
+                    </a:prstGeom>
+                  </pic:spPr>
+                </pic:pic>
+              </a:graphicData>
+            </a:graphic>
+          </wp:inline>
+        </w:drawing>
+      </w:r>
+    </w:p>
+    <w:p>
+      <w:pPr>
+        <w:spacing w:after="80"/>
+      </w:pPr>
+    </w:p>
+    <w:p>
+      <w:r>
+        <w:br w:type="page"/>
+      </w:r>
+    </w:p>
+    <w:p>
+      <w:pPr>
+        <w:pStyle w:val="Heading1"/>
+        <w:spacing w:after="100" w:before="200"/>
+      </w:pPr>
+      <w:r>
+        <w:rPr>
+          <w:rFonts w:ascii="Malgun Gothic" w:cs="Malgun Gothic" w:eastAsia="Malgun Gothic" w:hAnsi="Malgun Gothic"/>
+          <w:b/>
+          <w:bCs/>
+          <w:sz w:val="24"/>
+          <w:szCs w:val="24"/>
+        </w:rPr>
+        <w:t xml:space="preserve">Figure 4. Incidence rate ratio by racial or ethnic group and analytic dimension (representative estimate vs non-Hispanic White; 1.0 = the NHW rate)</w:t>
+      </w:r>
+    </w:p>
+    <w:p>
+      <w:pPr>
+        <w:jc w:val="center"/>
+      </w:pPr>
+      <w:r>
+        <w:drawing>
+          <wp:inline distT="0" distB="0" distL="0" distR="0">
+            <wp:extent cx="7239000" cy="4086225"/>
+            <wp:effectExtent t="0" r="0" b="0" l="0"/>
+            <wp:docPr id="1" name="" descr="" title=""/>
+            <wp:cNvGraphicFramePr>
+              <a:graphicFrameLocks xmlns:a="http://schemas.openxmlformats.org/drawingml/2006/main" noChangeAspect="1"/>
+            </wp:cNvGraphicFramePr>
+            <a:graphic xmlns:a="http://schemas.openxmlformats.org/drawingml/2006/main">
+              <a:graphicData uri="http://schemas.openxmlformats.org/drawingml/2006/picture">
+                <pic:pic xmlns:pic="http://schemas.openxmlformats.org/drawingml/2006/picture">
+                  <pic:nvPicPr>
+                    <pic:cNvPr id="0" name="" descr=""/>
+                    <pic:cNvPicPr>
+                      <a:picLocks noChangeAspect="1" noChangeArrowheads="1"/>
+                    </pic:cNvPicPr>
+                  </pic:nvPicPr>
+                  <pic:blipFill>
+                    <a:blip r:embed="rId10" cstate="none"/>
+                    <a:srcRect/>
+                    <a:stretch>
+                      <a:fillRect/>
+                    </a:stretch>
+                  </pic:blipFill>
+                  <pic:spPr bwMode="auto">
+                    <a:xfrm>
+                      <a:off x="0" y="0"/>
+                      <a:ext cx="7239000" cy="4086225"/>
                     </a:xfrm>
                     <a:prstGeom prst="rect">
                       <a:avLst/>

</xml_diff>

<commit_message>
Feedback4 item 8 (in progress): de-AI docx styling + rebuild deliverables
Docx builders (maintext, supplementary, manuscript): headings render as plain
bold black paragraphs instead of Word's built-in Heading styles (removes the blue
colour and the style's left-hand bullet); removed the decorative light-blue table
fills (E7EEF6 header, D9E2EF section) so header/section distinction is bold text
with the existing thin rules. Supplementary Table 4: moved the above-table
description into a post-table "Note.", removed "contemporary benchmark", and
replaced "the standard population largely cancels" with an accurate statement
(the ratio does not depend on a study's standard population but does not make
different studies mutually comparable). Rebuilt Main_Text_Tables_Figures.docx,
Supplementary_Materials.docx, and Manuscript_Full.docx.

Co-Authored-By: Claude Opus 4.8 <noreply@anthropic.com>
Claude-Session: https://claude.ai/code/session_01CuLT4FKRBtsU22Vwfjj2qn
</commit_message>
<xml_diff>
--- a/meta_agents/search_v2/outputs/Main_Text_Tables_Figures.docx
+++ b/meta_agents/search_v2/outputs/Main_Text_Tables_Figures.docx
@@ -34,7 +34,6 @@
     </w:p>
     <w:p>
       <w:pPr>
-        <w:pStyle w:val="Heading1"/>
         <w:spacing w:after="100" w:before="200"/>
       </w:pPr>
       <w:r>
@@ -42,6 +41,7 @@
           <w:rFonts w:ascii="Malgun Gothic" w:cs="Malgun Gothic" w:eastAsia="Malgun Gothic" w:hAnsi="Malgun Gothic"/>
           <w:b/>
           <w:bCs/>
+          <w:color w:val="000000"/>
           <w:sz w:val="24"/>
           <w:szCs w:val="24"/>
         </w:rPr>
@@ -90,7 +90,6 @@
         <w:tc>
           <w:tcPr>
             <w:tcW w:type="dxa" w:w="3353"/>
-            <w:shd w:fill="E7EEF6" w:color="auto" w:val="clear"/>
             <w:tcMar>
               <w:top w:type="dxa" w:w="25"/>
               <w:left w:type="dxa" w:w="70"/>
@@ -114,7 +113,6 @@
         <w:tc>
           <w:tcPr>
             <w:tcW w:type="dxa" w:w="1099"/>
-            <w:shd w:fill="E7EEF6" w:color="auto" w:val="clear"/>
             <w:tcMar>
               <w:top w:type="dxa" w:w="25"/>
               <w:left w:type="dxa" w:w="70"/>
@@ -138,7 +136,6 @@
         <w:tc>
           <w:tcPr>
             <w:tcW w:type="dxa" w:w="3133"/>
-            <w:shd w:fill="E7EEF6" w:color="auto" w:val="clear"/>
             <w:tcMar>
               <w:top w:type="dxa" w:w="25"/>
               <w:left w:type="dxa" w:w="70"/>
@@ -162,7 +159,6 @@
         <w:tc>
           <w:tcPr>
             <w:tcW w:type="dxa" w:w="2913"/>
-            <w:shd w:fill="E7EEF6" w:color="auto" w:val="clear"/>
             <w:tcMar>
               <w:top w:type="dxa" w:w="25"/>
               <w:left w:type="dxa" w:w="70"/>
@@ -186,7 +182,6 @@
         <w:tc>
           <w:tcPr>
             <w:tcW w:type="dxa" w:w="2473"/>
-            <w:shd w:fill="E7EEF6" w:color="auto" w:val="clear"/>
             <w:tcMar>
               <w:top w:type="dxa" w:w="25"/>
               <w:left w:type="dxa" w:w="70"/>
@@ -210,7 +205,6 @@
         <w:tc>
           <w:tcPr>
             <w:tcW w:type="dxa" w:w="1429"/>
-            <w:shd w:fill="E7EEF6" w:color="auto" w:val="clear"/>
             <w:tcMar>
               <w:top w:type="dxa" w:w="25"/>
               <w:left w:type="dxa" w:w="70"/>
@@ -237,7 +231,6 @@
           <w:tcPr>
             <w:tcW w:type="dxa" w:w="14400"/>
             <w:gridSpan w:val="6"/>
-            <w:shd w:fill="D9E2EF" w:color="auto" w:val="clear"/>
             <w:tcMar>
               <w:top w:type="dxa" w:w="30"/>
               <w:left w:type="dxa" w:w="70"/>
@@ -279,7 +272,7 @@
                 <w:sz w:val="15"/>
                 <w:szCs w:val="15"/>
               </w:rPr>
-              <w:t xml:space="preserve">American Indian and Alaska Native (AI/AN)</w:t>
+              <w:t xml:space="preserve">Hispanic</w:t>
             </w:r>
           </w:p>
         </w:tc>
@@ -325,7 +318,7 @@
                 <w:sz w:val="15"/>
                 <w:szCs w:val="15"/>
               </w:rPr>
-              <w:t xml:space="preserve">0.560 [0.550, 0.570]</w:t>
+              <w:t xml:space="preserve">0.718 [0.707, 0.731] ‡</w:t>
             </w:r>
           </w:p>
         </w:tc>
@@ -348,7 +341,7 @@
                 <w:sz w:val="15"/>
                 <w:szCs w:val="15"/>
               </w:rPr>
-              <w:t xml:space="preserve">Gopalani 2020 (1999-2015)</w:t>
+              <w:t xml:space="preserve">Ellington 2022 (2018)</w:t>
             </w:r>
           </w:p>
         </w:tc>
@@ -371,7 +364,7 @@
                 <w:sz w:val="15"/>
                 <w:szCs w:val="15"/>
               </w:rPr>
-              <w:t xml:space="preserve">IHS-PRCDA</w:t>
+              <w:t xml:space="preserve">USCS(NPCR+SEER ~99%)</w:t>
             </w:r>
           </w:p>
         </w:tc>
@@ -419,7 +412,7 @@
                 <w:sz w:val="15"/>
                 <w:szCs w:val="15"/>
               </w:rPr>
-              <w:t xml:space="preserve">Hispanic</w:t>
+              <w:t xml:space="preserve">Asian American, Native Hawaiian, and Pacific Islander (AANHPI)</w:t>
             </w:r>
           </w:p>
         </w:tc>
@@ -465,7 +458,7 @@
                 <w:sz w:val="15"/>
                 <w:szCs w:val="15"/>
               </w:rPr>
-              <w:t xml:space="preserve">0.718 [0.707, 0.731]</w:t>
+              <w:t xml:space="preserve">0.769 [0.752, 0.788] ‡</w:t>
             </w:r>
           </w:p>
         </w:tc>
@@ -559,7 +552,7 @@
                 <w:sz w:val="15"/>
                 <w:szCs w:val="15"/>
               </w:rPr>
-              <w:t xml:space="preserve">Asian American, Native Hawaiian, and Pacific Islander (AANHPI)</w:t>
+              <w:t xml:space="preserve">American Indian and Alaska Native (AI/AN)</w:t>
             </w:r>
           </w:p>
         </w:tc>
@@ -605,7 +598,7 @@
                 <w:sz w:val="15"/>
                 <w:szCs w:val="15"/>
               </w:rPr>
-              <w:t xml:space="preserve">0.769 [0.752, 0.788]</w:t>
+              <w:t xml:space="preserve">0.87 (point est.)</w:t>
             </w:r>
           </w:p>
         </w:tc>
@@ -628,7 +621,7 @@
                 <w:sz w:val="15"/>
                 <w:szCs w:val="15"/>
               </w:rPr>
-              <w:t xml:space="preserve">Ellington 2022 (2018)</w:t>
+              <w:t xml:space="preserve">Melkonian 2019 (2010-2015)</w:t>
             </w:r>
           </w:p>
         </w:tc>
@@ -651,7 +644,7 @@
                 <w:sz w:val="15"/>
                 <w:szCs w:val="15"/>
               </w:rPr>
-              <w:t xml:space="preserve">USCS(NPCR+SEER ~99%)</w:t>
+              <w:t xml:space="preserve">IHS-PRCDA</w:t>
             </w:r>
           </w:p>
         </w:tc>
@@ -745,7 +738,7 @@
                 <w:sz w:val="15"/>
                 <w:szCs w:val="15"/>
               </w:rPr>
-              <w:t xml:space="preserve">0.933 [0.920, 0.946]</w:t>
+              <w:t xml:space="preserve">0.933 [0.920, 0.946] ‡</w:t>
             </w:r>
           </w:p>
         </w:tc>
@@ -824,7 +817,6 @@
           <w:tcPr>
             <w:tcW w:type="dxa" w:w="14400"/>
             <w:gridSpan w:val="6"/>
-            <w:shd w:fill="D9E2EF" w:color="auto" w:val="clear"/>
             <w:tcMar>
               <w:top w:type="dxa" w:w="30"/>
               <w:left w:type="dxa" w:w="70"/>
@@ -912,7 +904,7 @@
                 <w:sz w:val="15"/>
                 <w:szCs w:val="15"/>
               </w:rPr>
-              <w:t xml:space="preserve">0.164 [0.120, 0.224]</w:t>
+              <w:t xml:space="preserve">0.164 [0.120, 0.224] ‡</w:t>
             </w:r>
           </w:p>
         </w:tc>
@@ -1052,7 +1044,7 @@
                 <w:sz w:val="15"/>
                 <w:szCs w:val="15"/>
               </w:rPr>
-              <w:t xml:space="preserve">0.264 [0.204, 0.341]</w:t>
+              <w:t xml:space="preserve">0.264 [0.204, 0.341] ‡</w:t>
             </w:r>
           </w:p>
         </w:tc>
@@ -1192,7 +1184,7 @@
                 <w:sz w:val="15"/>
                 <w:szCs w:val="15"/>
               </w:rPr>
-              <w:t xml:space="preserve">0.388 [0.350, 0.430]</w:t>
+              <w:t xml:space="preserve">0.388 [0.350, 0.430] ‡</w:t>
             </w:r>
           </w:p>
         </w:tc>
@@ -1332,7 +1324,7 @@
                 <w:sz w:val="15"/>
                 <w:szCs w:val="15"/>
               </w:rPr>
-              <w:t xml:space="preserve">0.586 [0.566, 0.608]</w:t>
+              <w:t xml:space="preserve">0.586 [0.566, 0.608] ‡</w:t>
             </w:r>
           </w:p>
         </w:tc>
@@ -1472,7 +1464,7 @@
                 <w:sz w:val="15"/>
                 <w:szCs w:val="15"/>
               </w:rPr>
-              <w:t xml:space="preserve">0.677 [0.654, 0.701]</w:t>
+              <w:t xml:space="preserve">0.677 [0.654, 0.701] ‡</w:t>
             </w:r>
           </w:p>
         </w:tc>
@@ -1612,7 +1604,7 @@
                 <w:sz w:val="15"/>
                 <w:szCs w:val="15"/>
               </w:rPr>
-              <w:t xml:space="preserve">0.760 [0.745, 0.775]</w:t>
+              <w:t xml:space="preserve">0.760 [0.745, 0.775] ‡</w:t>
             </w:r>
           </w:p>
         </w:tc>
@@ -1752,7 +1744,7 @@
                 <w:sz w:val="15"/>
                 <w:szCs w:val="15"/>
               </w:rPr>
-              <w:t xml:space="preserve">0.857 [0.839, 0.874]</w:t>
+              <w:t xml:space="preserve">0.857 [0.839, 0.874] ‡</w:t>
             </w:r>
           </w:p>
         </w:tc>
@@ -1892,7 +1884,7 @@
                 <w:sz w:val="15"/>
                 <w:szCs w:val="15"/>
               </w:rPr>
-              <w:t xml:space="preserve">0.958 [0.937, 0.979]</w:t>
+              <w:t xml:space="preserve">0.958 [0.937, 0.979] ‡</w:t>
             </w:r>
           </w:p>
         </w:tc>
@@ -2032,7 +2024,7 @@
                 <w:sz w:val="15"/>
                 <w:szCs w:val="15"/>
               </w:rPr>
-              <w:t xml:space="preserve">1.045 [1.009, 1.083]</w:t>
+              <w:t xml:space="preserve">1.045 [1.009, 1.083] ‡</w:t>
             </w:r>
           </w:p>
         </w:tc>
@@ -2172,7 +2164,7 @@
                 <w:sz w:val="15"/>
                 <w:szCs w:val="15"/>
               </w:rPr>
-              <w:t xml:space="preserve">0.792 [0.784, 0.800]</w:t>
+              <w:t xml:space="preserve">0.792 [0.784, 0.800] ‡</w:t>
             </w:r>
           </w:p>
         </w:tc>
@@ -2251,7 +2243,6 @@
           <w:tcPr>
             <w:tcW w:type="dxa" w:w="14400"/>
             <w:gridSpan w:val="6"/>
-            <w:shd w:fill="D9E2EF" w:color="auto" w:val="clear"/>
             <w:tcMar>
               <w:top w:type="dxa" w:w="30"/>
               <w:left w:type="dxa" w:w="70"/>
@@ -2339,7 +2330,7 @@
                 <w:sz w:val="15"/>
                 <w:szCs w:val="15"/>
               </w:rPr>
-              <w:t xml:space="preserve">0.723 [0.641, 0.817]</w:t>
+              <w:t xml:space="preserve">0.723 [0.641, 0.817] ‡</w:t>
             </w:r>
           </w:p>
         </w:tc>
@@ -2479,7 +2470,7 @@
                 <w:sz w:val="15"/>
                 <w:szCs w:val="15"/>
               </w:rPr>
-              <w:t xml:space="preserve">1.211 [1.123, 1.305]</w:t>
+              <w:t xml:space="preserve">1.211 [1.123, 1.305] ‡</w:t>
             </w:r>
           </w:p>
         </w:tc>
@@ -2619,7 +2610,7 @@
                 <w:sz w:val="15"/>
                 <w:szCs w:val="15"/>
               </w:rPr>
-              <w:t xml:space="preserve">1.212 [1.168, 1.258]</w:t>
+              <w:t xml:space="preserve">1.212 [1.168, 1.258] ‡</w:t>
             </w:r>
           </w:p>
         </w:tc>
@@ -2698,7 +2689,6 @@
           <w:tcPr>
             <w:tcW w:type="dxa" w:w="14400"/>
             <w:gridSpan w:val="6"/>
-            <w:shd w:fill="D9E2EF" w:color="auto" w:val="clear"/>
             <w:tcMar>
               <w:top w:type="dxa" w:w="30"/>
               <w:left w:type="dxa" w:w="70"/>
@@ -2786,7 +2776,7 @@
                 <w:sz w:val="15"/>
                 <w:szCs w:val="15"/>
               </w:rPr>
-              <w:t xml:space="preserve">0.512 [0.382, 0.686]</w:t>
+              <w:t xml:space="preserve">0.512 [0.382, 0.686] ‡</w:t>
             </w:r>
           </w:p>
         </w:tc>
@@ -2926,7 +2916,7 @@
                 <w:sz w:val="15"/>
                 <w:szCs w:val="15"/>
               </w:rPr>
-              <w:t xml:space="preserve">0.697 [0.629, 0.771]</w:t>
+              <w:t xml:space="preserve">0.697 [0.629, 0.771] ‡</w:t>
             </w:r>
           </w:p>
         </w:tc>
@@ -3066,7 +3056,7 @@
                 <w:sz w:val="15"/>
                 <w:szCs w:val="15"/>
               </w:rPr>
-              <w:t xml:space="preserve">0.769 [0.688, 0.860]</w:t>
+              <w:t xml:space="preserve">0.769 [0.688, 0.860] ‡</w:t>
             </w:r>
           </w:p>
         </w:tc>
@@ -3206,7 +3196,7 @@
                 <w:sz w:val="15"/>
                 <w:szCs w:val="15"/>
               </w:rPr>
-              <w:t xml:space="preserve">0.833 [0.738, 0.939]</w:t>
+              <w:t xml:space="preserve">0.833 [0.738, 0.939] ‡</w:t>
             </w:r>
           </w:p>
         </w:tc>
@@ -3283,149 +3273,8 @@
       <w:tr>
         <w:tc>
           <w:tcPr>
-            <w:tcW w:type="dxa" w:w="3353"/>
-            <w:tcMar>
-              <w:top w:type="dxa" w:w="25"/>
-              <w:left w:type="dxa" w:w="70"/>
-              <w:bottom w:type="dxa" w:w="25"/>
-              <w:right w:type="dxa" w:w="70"/>
-            </w:tcMar>
-          </w:tcPr>
-          <w:p>
-            <w:r>
-              <w:rPr>
-                <w:rFonts w:ascii="Malgun Gothic" w:cs="Malgun Gothic" w:eastAsia="Malgun Gothic" w:hAnsi="Malgun Gothic"/>
-                <w:b w:val="false"/>
-                <w:bCs w:val="false"/>
-                <w:sz w:val="15"/>
-                <w:szCs w:val="15"/>
-              </w:rPr>
-              <w:t xml:space="preserve">Hispanic/Latina (aggregate)</w:t>
-            </w:r>
-          </w:p>
-        </w:tc>
-        <w:tc>
-          <w:tcPr>
-            <w:tcW w:type="dxa" w:w="1099"/>
-            <w:tcMar>
-              <w:top w:type="dxa" w:w="25"/>
-              <w:left w:type="dxa" w:w="70"/>
-              <w:bottom w:type="dxa" w:w="25"/>
-              <w:right w:type="dxa" w:w="70"/>
-            </w:tcMar>
-          </w:tcPr>
-          <w:p>
-            <w:r>
-              <w:rPr>
-                <w:rFonts w:ascii="Malgun Gothic" w:cs="Malgun Gothic" w:eastAsia="Malgun Gothic" w:hAnsi="Malgun Gothic"/>
-                <w:b w:val="false"/>
-                <w:bCs w:val="false"/>
-                <w:sz w:val="15"/>
-                <w:szCs w:val="15"/>
-              </w:rPr>
-              <w:t xml:space="preserve">SIR</w:t>
-            </w:r>
-          </w:p>
-        </w:tc>
-        <w:tc>
-          <w:tcPr>
-            <w:tcW w:type="dxa" w:w="3133"/>
-            <w:tcMar>
-              <w:top w:type="dxa" w:w="25"/>
-              <w:left w:type="dxa" w:w="70"/>
-              <w:bottom w:type="dxa" w:w="25"/>
-              <w:right w:type="dxa" w:w="70"/>
-            </w:tcMar>
-          </w:tcPr>
-          <w:p>
-            <w:r>
-              <w:rPr>
-                <w:rFonts w:ascii="Malgun Gothic" w:cs="Malgun Gothic" w:eastAsia="Malgun Gothic" w:hAnsi="Malgun Gothic"/>
-                <w:b w:val="false"/>
-                <w:bCs w:val="false"/>
-                <w:sz w:val="15"/>
-                <w:szCs w:val="15"/>
-              </w:rPr>
-              <w:t xml:space="preserve">0.64 (point est.)</w:t>
-            </w:r>
-          </w:p>
-        </w:tc>
-        <w:tc>
-          <w:tcPr>
-            <w:tcW w:type="dxa" w:w="2913"/>
-            <w:tcMar>
-              <w:top w:type="dxa" w:w="25"/>
-              <w:left w:type="dxa" w:w="70"/>
-              <w:bottom w:type="dxa" w:w="25"/>
-              <w:right w:type="dxa" w:w="70"/>
-            </w:tcMar>
-          </w:tcPr>
-          <w:p>
-            <w:r>
-              <w:rPr>
-                <w:rFonts w:ascii="Malgun Gothic" w:cs="Malgun Gothic" w:eastAsia="Malgun Gothic" w:hAnsi="Malgun Gothic"/>
-                <w:b w:val="false"/>
-                <w:bCs w:val="false"/>
-                <w:sz w:val="15"/>
-                <w:szCs w:val="15"/>
-              </w:rPr>
-              <w:t xml:space="preserve">Carozza 2006 (1995-2000)</w:t>
-            </w:r>
-          </w:p>
-        </w:tc>
-        <w:tc>
-          <w:tcPr>
-            <w:tcW w:type="dxa" w:w="2473"/>
-            <w:tcMar>
-              <w:top w:type="dxa" w:w="25"/>
-              <w:left w:type="dxa" w:w="70"/>
-              <w:bottom w:type="dxa" w:w="25"/>
-              <w:right w:type="dxa" w:w="70"/>
-            </w:tcMar>
-          </w:tcPr>
-          <w:p>
-            <w:r>
-              <w:rPr>
-                <w:rFonts w:ascii="Malgun Gothic" w:cs="Malgun Gothic" w:eastAsia="Malgun Gothic" w:hAnsi="Malgun Gothic"/>
-                <w:b w:val="false"/>
-                <w:bCs w:val="false"/>
-                <w:sz w:val="15"/>
-                <w:szCs w:val="15"/>
-              </w:rPr>
-              <w:t xml:space="preserve">NAACCR/CiNA (~93%)</w:t>
-            </w:r>
-          </w:p>
-        </w:tc>
-        <w:tc>
-          <w:tcPr>
-            <w:tcW w:type="dxa" w:w="1429"/>
-            <w:tcMar>
-              <w:top w:type="dxa" w:w="25"/>
-              <w:left w:type="dxa" w:w="70"/>
-              <w:bottom w:type="dxa" w:w="25"/>
-              <w:right w:type="dxa" w:w="70"/>
-            </w:tcMar>
-          </w:tcPr>
-          <w:p>
-            <w:r>
-              <w:rPr>
-                <w:rFonts w:ascii="Malgun Gothic" w:cs="Malgun Gothic" w:eastAsia="Malgun Gothic" w:hAnsi="Malgun Gothic"/>
-                <w:b w:val="false"/>
-                <w:bCs w:val="false"/>
-                <w:sz w:val="15"/>
-                <w:szCs w:val="15"/>
-              </w:rPr>
-              <w:t xml:space="preserve">Low</w:t>
-            </w:r>
-          </w:p>
-        </w:tc>
-      </w:tr>
-      <w:tr>
-        <w:tc>
-          <w:tcPr>
             <w:tcW w:type="dxa" w:w="14400"/>
             <w:gridSpan w:val="6"/>
-            <w:shd w:fill="D9E2EF" w:color="auto" w:val="clear"/>
             <w:tcMar>
               <w:top w:type="dxa" w:w="30"/>
               <w:left w:type="dxa" w:w="70"/>
@@ -3607,7 +3456,7 @@
                 <w:sz w:val="15"/>
                 <w:szCs w:val="15"/>
               </w:rPr>
-              <w:t xml:space="preserve">AI/AN (Southern Plains)</w:t>
+              <w:t xml:space="preserve">AI/AN (Southwest)</w:t>
             </w:r>
           </w:p>
         </w:tc>
@@ -3653,7 +3502,7 @@
                 <w:sz w:val="15"/>
                 <w:szCs w:val="15"/>
               </w:rPr>
-              <w:t xml:space="preserve">1.25 [1.11, 1.41]</w:t>
+              <w:t xml:space="preserve">0.57 (point est.)</w:t>
             </w:r>
           </w:p>
         </w:tc>
@@ -3676,7 +3525,7 @@
                 <w:sz w:val="15"/>
                 <w:szCs w:val="15"/>
               </w:rPr>
-              <w:t xml:space="preserve">Melkonian 2021 (2012-2016)</w:t>
+              <w:t xml:space="preserve">Melkonian 2019 (2010-2015)</w:t>
             </w:r>
           </w:p>
         </w:tc>
@@ -3747,7 +3596,7 @@
                 <w:sz w:val="15"/>
                 <w:szCs w:val="15"/>
               </w:rPr>
-              <w:t xml:space="preserve">AI/AN (Northern Plains)</w:t>
+              <w:t xml:space="preserve">AI/AN (East)</w:t>
             </w:r>
           </w:p>
         </w:tc>
@@ -3793,7 +3642,7 @@
                 <w:sz w:val="15"/>
                 <w:szCs w:val="15"/>
               </w:rPr>
-              <w:t xml:space="preserve">1.33 [1.26, 1.41]</w:t>
+              <w:t xml:space="preserve">0.61 (point est.)</w:t>
             </w:r>
           </w:p>
         </w:tc>
@@ -3816,7 +3665,7 @@
                 <w:sz w:val="15"/>
                 <w:szCs w:val="15"/>
               </w:rPr>
-              <w:t xml:space="preserve">Melkonian 2021 (2012-2016)</w:t>
+              <w:t xml:space="preserve">Melkonian 2019 (2010-2015)</w:t>
             </w:r>
           </w:p>
         </w:tc>
@@ -3870,9 +3719,568 @@
       <w:tr>
         <w:tc>
           <w:tcPr>
+            <w:tcW w:type="dxa" w:w="3353"/>
+            <w:tcMar>
+              <w:top w:type="dxa" w:w="25"/>
+              <w:left w:type="dxa" w:w="70"/>
+              <w:bottom w:type="dxa" w:w="25"/>
+              <w:right w:type="dxa" w:w="70"/>
+            </w:tcMar>
+          </w:tcPr>
+          <w:p>
+            <w:r>
+              <w:rPr>
+                <w:rFonts w:ascii="Malgun Gothic" w:cs="Malgun Gothic" w:eastAsia="Malgun Gothic" w:hAnsi="Malgun Gothic"/>
+                <w:b w:val="false"/>
+                <w:bCs w:val="false"/>
+                <w:sz w:val="15"/>
+                <w:szCs w:val="15"/>
+              </w:rPr>
+              <w:t xml:space="preserve">AI/AN (Pacific Coast)</w:t>
+            </w:r>
+          </w:p>
+        </w:tc>
+        <w:tc>
+          <w:tcPr>
+            <w:tcW w:type="dxa" w:w="1099"/>
+            <w:tcMar>
+              <w:top w:type="dxa" w:w="25"/>
+              <w:left w:type="dxa" w:w="70"/>
+              <w:bottom w:type="dxa" w:w="25"/>
+              <w:right w:type="dxa" w:w="70"/>
+            </w:tcMar>
+          </w:tcPr>
+          <w:p>
+            <w:r>
+              <w:rPr>
+                <w:rFonts w:ascii="Malgun Gothic" w:cs="Malgun Gothic" w:eastAsia="Malgun Gothic" w:hAnsi="Malgun Gothic"/>
+                <w:b w:val="false"/>
+                <w:bCs w:val="false"/>
+                <w:sz w:val="15"/>
+                <w:szCs w:val="15"/>
+              </w:rPr>
+              <w:t xml:space="preserve">IRR</w:t>
+            </w:r>
+          </w:p>
+        </w:tc>
+        <w:tc>
+          <w:tcPr>
+            <w:tcW w:type="dxa" w:w="3133"/>
+            <w:tcMar>
+              <w:top w:type="dxa" w:w="25"/>
+              <w:left w:type="dxa" w:w="70"/>
+              <w:bottom w:type="dxa" w:w="25"/>
+              <w:right w:type="dxa" w:w="70"/>
+            </w:tcMar>
+          </w:tcPr>
+          <w:p>
+            <w:r>
+              <w:rPr>
+                <w:rFonts w:ascii="Malgun Gothic" w:cs="Malgun Gothic" w:eastAsia="Malgun Gothic" w:hAnsi="Malgun Gothic"/>
+                <w:b w:val="false"/>
+                <w:bCs w:val="false"/>
+                <w:sz w:val="15"/>
+                <w:szCs w:val="15"/>
+              </w:rPr>
+              <w:t xml:space="preserve">0.93 (point est.)</w:t>
+            </w:r>
+          </w:p>
+        </w:tc>
+        <w:tc>
+          <w:tcPr>
+            <w:tcW w:type="dxa" w:w="2913"/>
+            <w:tcMar>
+              <w:top w:type="dxa" w:w="25"/>
+              <w:left w:type="dxa" w:w="70"/>
+              <w:bottom w:type="dxa" w:w="25"/>
+              <w:right w:type="dxa" w:w="70"/>
+            </w:tcMar>
+          </w:tcPr>
+          <w:p>
+            <w:r>
+              <w:rPr>
+                <w:rFonts w:ascii="Malgun Gothic" w:cs="Malgun Gothic" w:eastAsia="Malgun Gothic" w:hAnsi="Malgun Gothic"/>
+                <w:b w:val="false"/>
+                <w:bCs w:val="false"/>
+                <w:sz w:val="15"/>
+                <w:szCs w:val="15"/>
+              </w:rPr>
+              <w:t xml:space="preserve">Melkonian 2019 (2010-2015)</w:t>
+            </w:r>
+          </w:p>
+        </w:tc>
+        <w:tc>
+          <w:tcPr>
+            <w:tcW w:type="dxa" w:w="2473"/>
+            <w:tcMar>
+              <w:top w:type="dxa" w:w="25"/>
+              <w:left w:type="dxa" w:w="70"/>
+              <w:bottom w:type="dxa" w:w="25"/>
+              <w:right w:type="dxa" w:w="70"/>
+            </w:tcMar>
+          </w:tcPr>
+          <w:p>
+            <w:r>
+              <w:rPr>
+                <w:rFonts w:ascii="Malgun Gothic" w:cs="Malgun Gothic" w:eastAsia="Malgun Gothic" w:hAnsi="Malgun Gothic"/>
+                <w:b w:val="false"/>
+                <w:bCs w:val="false"/>
+                <w:sz w:val="15"/>
+                <w:szCs w:val="15"/>
+              </w:rPr>
+              <w:t xml:space="preserve">IHS-PRCDA</w:t>
+            </w:r>
+          </w:p>
+        </w:tc>
+        <w:tc>
+          <w:tcPr>
+            <w:tcW w:type="dxa" w:w="1429"/>
+            <w:tcMar>
+              <w:top w:type="dxa" w:w="25"/>
+              <w:left w:type="dxa" w:w="70"/>
+              <w:bottom w:type="dxa" w:w="25"/>
+              <w:right w:type="dxa" w:w="70"/>
+            </w:tcMar>
+          </w:tcPr>
+          <w:p>
+            <w:r>
+              <w:rPr>
+                <w:rFonts w:ascii="Malgun Gothic" w:cs="Malgun Gothic" w:eastAsia="Malgun Gothic" w:hAnsi="Malgun Gothic"/>
+                <w:b w:val="false"/>
+                <w:bCs w:val="false"/>
+                <w:sz w:val="15"/>
+                <w:szCs w:val="15"/>
+              </w:rPr>
+              <w:t xml:space="preserve">Low</w:t>
+            </w:r>
+          </w:p>
+        </w:tc>
+      </w:tr>
+      <w:tr>
+        <w:tc>
+          <w:tcPr>
+            <w:tcW w:type="dxa" w:w="3353"/>
+            <w:tcMar>
+              <w:top w:type="dxa" w:w="25"/>
+              <w:left w:type="dxa" w:w="70"/>
+              <w:bottom w:type="dxa" w:w="25"/>
+              <w:right w:type="dxa" w:w="70"/>
+            </w:tcMar>
+          </w:tcPr>
+          <w:p>
+            <w:r>
+              <w:rPr>
+                <w:rFonts w:ascii="Malgun Gothic" w:cs="Malgun Gothic" w:eastAsia="Malgun Gothic" w:hAnsi="Malgun Gothic"/>
+                <w:b w:val="false"/>
+                <w:bCs w:val="false"/>
+                <w:sz w:val="15"/>
+                <w:szCs w:val="15"/>
+              </w:rPr>
+              <w:t xml:space="preserve">AI/AN (Northern Plains)</w:t>
+            </w:r>
+          </w:p>
+        </w:tc>
+        <w:tc>
+          <w:tcPr>
+            <w:tcW w:type="dxa" w:w="1099"/>
+            <w:tcMar>
+              <w:top w:type="dxa" w:w="25"/>
+              <w:left w:type="dxa" w:w="70"/>
+              <w:bottom w:type="dxa" w:w="25"/>
+              <w:right w:type="dxa" w:w="70"/>
+            </w:tcMar>
+          </w:tcPr>
+          <w:p>
+            <w:r>
+              <w:rPr>
+                <w:rFonts w:ascii="Malgun Gothic" w:cs="Malgun Gothic" w:eastAsia="Malgun Gothic" w:hAnsi="Malgun Gothic"/>
+                <w:b w:val="false"/>
+                <w:bCs w:val="false"/>
+                <w:sz w:val="15"/>
+                <w:szCs w:val="15"/>
+              </w:rPr>
+              <w:t xml:space="preserve">IRR</w:t>
+            </w:r>
+          </w:p>
+        </w:tc>
+        <w:tc>
+          <w:tcPr>
+            <w:tcW w:type="dxa" w:w="3133"/>
+            <w:tcMar>
+              <w:top w:type="dxa" w:w="25"/>
+              <w:left w:type="dxa" w:w="70"/>
+              <w:bottom w:type="dxa" w:w="25"/>
+              <w:right w:type="dxa" w:w="70"/>
+            </w:tcMar>
+          </w:tcPr>
+          <w:p>
+            <w:r>
+              <w:rPr>
+                <w:rFonts w:ascii="Malgun Gothic" w:cs="Malgun Gothic" w:eastAsia="Malgun Gothic" w:hAnsi="Malgun Gothic"/>
+                <w:b w:val="false"/>
+                <w:bCs w:val="false"/>
+                <w:sz w:val="15"/>
+                <w:szCs w:val="15"/>
+              </w:rPr>
+              <w:t xml:space="preserve">1.05 (point est.)</w:t>
+            </w:r>
+          </w:p>
+        </w:tc>
+        <w:tc>
+          <w:tcPr>
+            <w:tcW w:type="dxa" w:w="2913"/>
+            <w:tcMar>
+              <w:top w:type="dxa" w:w="25"/>
+              <w:left w:type="dxa" w:w="70"/>
+              <w:bottom w:type="dxa" w:w="25"/>
+              <w:right w:type="dxa" w:w="70"/>
+            </w:tcMar>
+          </w:tcPr>
+          <w:p>
+            <w:r>
+              <w:rPr>
+                <w:rFonts w:ascii="Malgun Gothic" w:cs="Malgun Gothic" w:eastAsia="Malgun Gothic" w:hAnsi="Malgun Gothic"/>
+                <w:b w:val="false"/>
+                <w:bCs w:val="false"/>
+                <w:sz w:val="15"/>
+                <w:szCs w:val="15"/>
+              </w:rPr>
+              <w:t xml:space="preserve">Melkonian 2019 (2010-2015)</w:t>
+            </w:r>
+          </w:p>
+        </w:tc>
+        <w:tc>
+          <w:tcPr>
+            <w:tcW w:type="dxa" w:w="2473"/>
+            <w:tcMar>
+              <w:top w:type="dxa" w:w="25"/>
+              <w:left w:type="dxa" w:w="70"/>
+              <w:bottom w:type="dxa" w:w="25"/>
+              <w:right w:type="dxa" w:w="70"/>
+            </w:tcMar>
+          </w:tcPr>
+          <w:p>
+            <w:r>
+              <w:rPr>
+                <w:rFonts w:ascii="Malgun Gothic" w:cs="Malgun Gothic" w:eastAsia="Malgun Gothic" w:hAnsi="Malgun Gothic"/>
+                <w:b w:val="false"/>
+                <w:bCs w:val="false"/>
+                <w:sz w:val="15"/>
+                <w:szCs w:val="15"/>
+              </w:rPr>
+              <w:t xml:space="preserve">IHS-PRCDA</w:t>
+            </w:r>
+          </w:p>
+        </w:tc>
+        <w:tc>
+          <w:tcPr>
+            <w:tcW w:type="dxa" w:w="1429"/>
+            <w:tcMar>
+              <w:top w:type="dxa" w:w="25"/>
+              <w:left w:type="dxa" w:w="70"/>
+              <w:bottom w:type="dxa" w:w="25"/>
+              <w:right w:type="dxa" w:w="70"/>
+            </w:tcMar>
+          </w:tcPr>
+          <w:p>
+            <w:r>
+              <w:rPr>
+                <w:rFonts w:ascii="Malgun Gothic" w:cs="Malgun Gothic" w:eastAsia="Malgun Gothic" w:hAnsi="Malgun Gothic"/>
+                <w:b w:val="false"/>
+                <w:bCs w:val="false"/>
+                <w:sz w:val="15"/>
+                <w:szCs w:val="15"/>
+              </w:rPr>
+              <w:t xml:space="preserve">Low</w:t>
+            </w:r>
+          </w:p>
+        </w:tc>
+      </w:tr>
+      <w:tr>
+        <w:tc>
+          <w:tcPr>
+            <w:tcW w:type="dxa" w:w="3353"/>
+            <w:tcMar>
+              <w:top w:type="dxa" w:w="25"/>
+              <w:left w:type="dxa" w:w="70"/>
+              <w:bottom w:type="dxa" w:w="25"/>
+              <w:right w:type="dxa" w:w="70"/>
+            </w:tcMar>
+          </w:tcPr>
+          <w:p>
+            <w:r>
+              <w:rPr>
+                <w:rFonts w:ascii="Malgun Gothic" w:cs="Malgun Gothic" w:eastAsia="Malgun Gothic" w:hAnsi="Malgun Gothic"/>
+                <w:b w:val="false"/>
+                <w:bCs w:val="false"/>
+                <w:sz w:val="15"/>
+                <w:szCs w:val="15"/>
+              </w:rPr>
+              <w:t xml:space="preserve">Alaska Native</w:t>
+            </w:r>
+          </w:p>
+        </w:tc>
+        <w:tc>
+          <w:tcPr>
+            <w:tcW w:type="dxa" w:w="1099"/>
+            <w:tcMar>
+              <w:top w:type="dxa" w:w="25"/>
+              <w:left w:type="dxa" w:w="70"/>
+              <w:bottom w:type="dxa" w:w="25"/>
+              <w:right w:type="dxa" w:w="70"/>
+            </w:tcMar>
+          </w:tcPr>
+          <w:p>
+            <w:r>
+              <w:rPr>
+                <w:rFonts w:ascii="Malgun Gothic" w:cs="Malgun Gothic" w:eastAsia="Malgun Gothic" w:hAnsi="Malgun Gothic"/>
+                <w:b w:val="false"/>
+                <w:bCs w:val="false"/>
+                <w:sz w:val="15"/>
+                <w:szCs w:val="15"/>
+              </w:rPr>
+              <w:t xml:space="preserve">IRR</w:t>
+            </w:r>
+          </w:p>
+        </w:tc>
+        <w:tc>
+          <w:tcPr>
+            <w:tcW w:type="dxa" w:w="3133"/>
+            <w:tcMar>
+              <w:top w:type="dxa" w:w="25"/>
+              <w:left w:type="dxa" w:w="70"/>
+              <w:bottom w:type="dxa" w:w="25"/>
+              <w:right w:type="dxa" w:w="70"/>
+            </w:tcMar>
+          </w:tcPr>
+          <w:p>
+            <w:r>
+              <w:rPr>
+                <w:rFonts w:ascii="Malgun Gothic" w:cs="Malgun Gothic" w:eastAsia="Malgun Gothic" w:hAnsi="Malgun Gothic"/>
+                <w:b w:val="false"/>
+                <w:bCs w:val="false"/>
+                <w:sz w:val="15"/>
+                <w:szCs w:val="15"/>
+              </w:rPr>
+              <w:t xml:space="preserve">1.09 [0.99, 1.21] †</w:t>
+            </w:r>
+          </w:p>
+        </w:tc>
+        <w:tc>
+          <w:tcPr>
+            <w:tcW w:type="dxa" w:w="2913"/>
+            <w:tcMar>
+              <w:top w:type="dxa" w:w="25"/>
+              <w:left w:type="dxa" w:w="70"/>
+              <w:bottom w:type="dxa" w:w="25"/>
+              <w:right w:type="dxa" w:w="70"/>
+            </w:tcMar>
+          </w:tcPr>
+          <w:p>
+            <w:r>
+              <w:rPr>
+                <w:rFonts w:ascii="Malgun Gothic" w:cs="Malgun Gothic" w:eastAsia="Malgun Gothic" w:hAnsi="Malgun Gothic"/>
+                <w:b w:val="false"/>
+                <w:bCs w:val="false"/>
+                <w:sz w:val="15"/>
+                <w:szCs w:val="15"/>
+              </w:rPr>
+              <w:t xml:space="preserve">Nash 2019 (2009-2014)</w:t>
+            </w:r>
+          </w:p>
+        </w:tc>
+        <w:tc>
+          <w:tcPr>
+            <w:tcW w:type="dxa" w:w="2473"/>
+            <w:tcMar>
+              <w:top w:type="dxa" w:w="25"/>
+              <w:left w:type="dxa" w:w="70"/>
+              <w:bottom w:type="dxa" w:w="25"/>
+              <w:right w:type="dxa" w:w="70"/>
+            </w:tcMar>
+          </w:tcPr>
+          <w:p>
+            <w:r>
+              <w:rPr>
+                <w:rFonts w:ascii="Malgun Gothic" w:cs="Malgun Gothic" w:eastAsia="Malgun Gothic" w:hAnsi="Malgun Gothic"/>
+                <w:b w:val="false"/>
+                <w:bCs w:val="false"/>
+                <w:sz w:val="15"/>
+                <w:szCs w:val="15"/>
+              </w:rPr>
+              <w:t xml:space="preserve">Alaska Native Tumor Registry (IHS-linked)</w:t>
+            </w:r>
+          </w:p>
+        </w:tc>
+        <w:tc>
+          <w:tcPr>
+            <w:tcW w:type="dxa" w:w="1429"/>
+            <w:tcMar>
+              <w:top w:type="dxa" w:w="25"/>
+              <w:left w:type="dxa" w:w="70"/>
+              <w:bottom w:type="dxa" w:w="25"/>
+              <w:right w:type="dxa" w:w="70"/>
+            </w:tcMar>
+          </w:tcPr>
+          <w:p>
+            <w:r>
+              <w:rPr>
+                <w:rFonts w:ascii="Malgun Gothic" w:cs="Malgun Gothic" w:eastAsia="Malgun Gothic" w:hAnsi="Malgun Gothic"/>
+                <w:b w:val="false"/>
+                <w:bCs w:val="false"/>
+                <w:sz w:val="15"/>
+                <w:szCs w:val="15"/>
+              </w:rPr>
+              <w:t xml:space="preserve">Low</w:t>
+            </w:r>
+          </w:p>
+        </w:tc>
+      </w:tr>
+      <w:tr>
+        <w:tc>
+          <w:tcPr>
+            <w:tcW w:type="dxa" w:w="3353"/>
+            <w:tcMar>
+              <w:top w:type="dxa" w:w="25"/>
+              <w:left w:type="dxa" w:w="70"/>
+              <w:bottom w:type="dxa" w:w="25"/>
+              <w:right w:type="dxa" w:w="70"/>
+            </w:tcMar>
+          </w:tcPr>
+          <w:p>
+            <w:r>
+              <w:rPr>
+                <w:rFonts w:ascii="Malgun Gothic" w:cs="Malgun Gothic" w:eastAsia="Malgun Gothic" w:hAnsi="Malgun Gothic"/>
+                <w:b w:val="false"/>
+                <w:bCs w:val="false"/>
+                <w:sz w:val="15"/>
+                <w:szCs w:val="15"/>
+              </w:rPr>
+              <w:t xml:space="preserve">AI/AN (Southern Plains)</w:t>
+            </w:r>
+          </w:p>
+        </w:tc>
+        <w:tc>
+          <w:tcPr>
+            <w:tcW w:type="dxa" w:w="1099"/>
+            <w:tcMar>
+              <w:top w:type="dxa" w:w="25"/>
+              <w:left w:type="dxa" w:w="70"/>
+              <w:bottom w:type="dxa" w:w="25"/>
+              <w:right w:type="dxa" w:w="70"/>
+            </w:tcMar>
+          </w:tcPr>
+          <w:p>
+            <w:r>
+              <w:rPr>
+                <w:rFonts w:ascii="Malgun Gothic" w:cs="Malgun Gothic" w:eastAsia="Malgun Gothic" w:hAnsi="Malgun Gothic"/>
+                <w:b w:val="false"/>
+                <w:bCs w:val="false"/>
+                <w:sz w:val="15"/>
+                <w:szCs w:val="15"/>
+              </w:rPr>
+              <w:t xml:space="preserve">IRR</w:t>
+            </w:r>
+          </w:p>
+        </w:tc>
+        <w:tc>
+          <w:tcPr>
+            <w:tcW w:type="dxa" w:w="3133"/>
+            <w:tcMar>
+              <w:top w:type="dxa" w:w="25"/>
+              <w:left w:type="dxa" w:w="70"/>
+              <w:bottom w:type="dxa" w:w="25"/>
+              <w:right w:type="dxa" w:w="70"/>
+            </w:tcMar>
+          </w:tcPr>
+          <w:p>
+            <w:r>
+              <w:rPr>
+                <w:rFonts w:ascii="Malgun Gothic" w:cs="Malgun Gothic" w:eastAsia="Malgun Gothic" w:hAnsi="Malgun Gothic"/>
+                <w:b w:val="false"/>
+                <w:bCs w:val="false"/>
+                <w:sz w:val="15"/>
+                <w:szCs w:val="15"/>
+              </w:rPr>
+              <w:t xml:space="preserve">1.33 [1.26, 1.41]</w:t>
+            </w:r>
+          </w:p>
+        </w:tc>
+        <w:tc>
+          <w:tcPr>
+            <w:tcW w:type="dxa" w:w="2913"/>
+            <w:tcMar>
+              <w:top w:type="dxa" w:w="25"/>
+              <w:left w:type="dxa" w:w="70"/>
+              <w:bottom w:type="dxa" w:w="25"/>
+              <w:right w:type="dxa" w:w="70"/>
+            </w:tcMar>
+          </w:tcPr>
+          <w:p>
+            <w:r>
+              <w:rPr>
+                <w:rFonts w:ascii="Malgun Gothic" w:cs="Malgun Gothic" w:eastAsia="Malgun Gothic" w:hAnsi="Malgun Gothic"/>
+                <w:b w:val="false"/>
+                <w:bCs w:val="false"/>
+                <w:sz w:val="15"/>
+                <w:szCs w:val="15"/>
+              </w:rPr>
+              <w:t xml:space="preserve">Melkonian 2021 (2012-2016)</w:t>
+            </w:r>
+          </w:p>
+        </w:tc>
+        <w:tc>
+          <w:tcPr>
+            <w:tcW w:type="dxa" w:w="2473"/>
+            <w:tcMar>
+              <w:top w:type="dxa" w:w="25"/>
+              <w:left w:type="dxa" w:w="70"/>
+              <w:bottom w:type="dxa" w:w="25"/>
+              <w:right w:type="dxa" w:w="70"/>
+            </w:tcMar>
+          </w:tcPr>
+          <w:p>
+            <w:r>
+              <w:rPr>
+                <w:rFonts w:ascii="Malgun Gothic" w:cs="Malgun Gothic" w:eastAsia="Malgun Gothic" w:hAnsi="Malgun Gothic"/>
+                <w:b w:val="false"/>
+                <w:bCs w:val="false"/>
+                <w:sz w:val="15"/>
+                <w:szCs w:val="15"/>
+              </w:rPr>
+              <w:t xml:space="preserve">IHS-PRCDA</w:t>
+            </w:r>
+          </w:p>
+        </w:tc>
+        <w:tc>
+          <w:tcPr>
+            <w:tcW w:type="dxa" w:w="1429"/>
+            <w:tcMar>
+              <w:top w:type="dxa" w:w="25"/>
+              <w:left w:type="dxa" w:w="70"/>
+              <w:bottom w:type="dxa" w:w="25"/>
+              <w:right w:type="dxa" w:w="70"/>
+            </w:tcMar>
+          </w:tcPr>
+          <w:p>
+            <w:r>
+              <w:rPr>
+                <w:rFonts w:ascii="Malgun Gothic" w:cs="Malgun Gothic" w:eastAsia="Malgun Gothic" w:hAnsi="Malgun Gothic"/>
+                <w:b w:val="false"/>
+                <w:bCs w:val="false"/>
+                <w:sz w:val="15"/>
+                <w:szCs w:val="15"/>
+              </w:rPr>
+              <w:t xml:space="preserve">Low</w:t>
+            </w:r>
+          </w:p>
+        </w:tc>
+      </w:tr>
+      <w:tr>
+        <w:tc>
+          <w:tcPr>
             <w:tcW w:type="dxa" w:w="14400"/>
             <w:gridSpan w:val="6"/>
-            <w:shd w:fill="D9E2EF" w:color="auto" w:val="clear"/>
             <w:tcMar>
               <w:top w:type="dxa" w:w="30"/>
               <w:left w:type="dxa" w:w="70"/>
@@ -4039,7 +4447,6 @@
           <w:tcPr>
             <w:tcW w:type="dxa" w:w="14400"/>
             <w:gridSpan w:val="6"/>
-            <w:shd w:fill="D9E2EF" w:color="auto" w:val="clear"/>
             <w:tcMar>
               <w:top w:type="dxa" w:w="30"/>
               <w:left w:type="dxa" w:w="70"/>
@@ -4127,7 +4534,7 @@
                 <w:sz w:val="15"/>
                 <w:szCs w:val="15"/>
               </w:rPr>
-              <w:t xml:space="preserve">0.53 [0.39, 0.71] †</w:t>
+              <w:t xml:space="preserve">0.53 [0.31, 0.93] † ‡</w:t>
             </w:r>
           </w:p>
         </w:tc>
@@ -4547,7 +4954,7 @@
                 <w:sz w:val="15"/>
                 <w:szCs w:val="15"/>
               </w:rPr>
-              <w:t xml:space="preserve">0.84 [0.8, 0.88] †</w:t>
+              <w:t xml:space="preserve">0.84 [0.60, 1.18] † ‡</w:t>
             </w:r>
           </w:p>
         </w:tc>
@@ -4967,7 +5374,147 @@
                 <w:sz w:val="15"/>
                 <w:szCs w:val="15"/>
               </w:rPr>
-              <w:t xml:space="preserve">0.86 [0.79, 0.91] †</w:t>
+              <w:t xml:space="preserve">0.86 [0.60, 1.22] † ‡</w:t>
+            </w:r>
+          </w:p>
+        </w:tc>
+        <w:tc>
+          <w:tcPr>
+            <w:tcW w:type="dxa" w:w="2913"/>
+            <w:tcMar>
+              <w:top w:type="dxa" w:w="25"/>
+              <w:left w:type="dxa" w:w="70"/>
+              <w:bottom w:type="dxa" w:w="25"/>
+              <w:right w:type="dxa" w:w="70"/>
+            </w:tcMar>
+          </w:tcPr>
+          <w:p>
+            <w:r>
+              <w:rPr>
+                <w:rFonts w:ascii="Malgun Gothic" w:cs="Malgun Gothic" w:eastAsia="Malgun Gothic" w:hAnsi="Malgun Gothic"/>
+                <w:b w:val="false"/>
+                <w:bCs w:val="false"/>
+                <w:sz w:val="15"/>
+                <w:szCs w:val="15"/>
+              </w:rPr>
+              <w:t xml:space="preserve">Loo 2019 (2000-2016)</w:t>
+            </w:r>
+          </w:p>
+        </w:tc>
+        <w:tc>
+          <w:tcPr>
+            <w:tcW w:type="dxa" w:w="2473"/>
+            <w:tcMar>
+              <w:top w:type="dxa" w:w="25"/>
+              <w:left w:type="dxa" w:w="70"/>
+              <w:bottom w:type="dxa" w:w="25"/>
+              <w:right w:type="dxa" w:w="70"/>
+            </w:tcMar>
+          </w:tcPr>
+          <w:p>
+            <w:r>
+              <w:rPr>
+                <w:rFonts w:ascii="Malgun Gothic" w:cs="Malgun Gothic" w:eastAsia="Malgun Gothic" w:hAnsi="Malgun Gothic"/>
+                <w:b w:val="false"/>
+                <w:bCs w:val="false"/>
+                <w:sz w:val="15"/>
+                <w:szCs w:val="15"/>
+              </w:rPr>
+              <w:t xml:space="preserve">Hawaii Tumor Registry (SEER)</w:t>
+            </w:r>
+          </w:p>
+        </w:tc>
+        <w:tc>
+          <w:tcPr>
+            <w:tcW w:type="dxa" w:w="1429"/>
+            <w:tcMar>
+              <w:top w:type="dxa" w:w="25"/>
+              <w:left w:type="dxa" w:w="70"/>
+              <w:bottom w:type="dxa" w:w="25"/>
+              <w:right w:type="dxa" w:w="70"/>
+            </w:tcMar>
+          </w:tcPr>
+          <w:p>
+            <w:r>
+              <w:rPr>
+                <w:rFonts w:ascii="Malgun Gothic" w:cs="Malgun Gothic" w:eastAsia="Malgun Gothic" w:hAnsi="Malgun Gothic"/>
+                <w:b w:val="false"/>
+                <w:bCs w:val="false"/>
+                <w:sz w:val="15"/>
+                <w:szCs w:val="15"/>
+              </w:rPr>
+              <w:t xml:space="preserve">Low</w:t>
+            </w:r>
+          </w:p>
+        </w:tc>
+      </w:tr>
+      <w:tr>
+        <w:tc>
+          <w:tcPr>
+            <w:tcW w:type="dxa" w:w="3353"/>
+            <w:tcMar>
+              <w:top w:type="dxa" w:w="25"/>
+              <w:left w:type="dxa" w:w="70"/>
+              <w:bottom w:type="dxa" w:w="25"/>
+              <w:right w:type="dxa" w:w="70"/>
+            </w:tcMar>
+          </w:tcPr>
+          <w:p>
+            <w:r>
+              <w:rPr>
+                <w:rFonts w:ascii="Malgun Gothic" w:cs="Malgun Gothic" w:eastAsia="Malgun Gothic" w:hAnsi="Malgun Gothic"/>
+                <w:b w:val="false"/>
+                <w:bCs w:val="false"/>
+                <w:sz w:val="15"/>
+                <w:szCs w:val="15"/>
+              </w:rPr>
+              <w:t xml:space="preserve">Japanese</w:t>
+            </w:r>
+          </w:p>
+        </w:tc>
+        <w:tc>
+          <w:tcPr>
+            <w:tcW w:type="dxa" w:w="1099"/>
+            <w:tcMar>
+              <w:top w:type="dxa" w:w="25"/>
+              <w:left w:type="dxa" w:w="70"/>
+              <w:bottom w:type="dxa" w:w="25"/>
+              <w:right w:type="dxa" w:w="70"/>
+            </w:tcMar>
+          </w:tcPr>
+          <w:p>
+            <w:r>
+              <w:rPr>
+                <w:rFonts w:ascii="Malgun Gothic" w:cs="Malgun Gothic" w:eastAsia="Malgun Gothic" w:hAnsi="Malgun Gothic"/>
+                <w:b w:val="false"/>
+                <w:bCs w:val="false"/>
+                <w:sz w:val="15"/>
+                <w:szCs w:val="15"/>
+              </w:rPr>
+              <w:t xml:space="preserve">IRR</w:t>
+            </w:r>
+          </w:p>
+        </w:tc>
+        <w:tc>
+          <w:tcPr>
+            <w:tcW w:type="dxa" w:w="3133"/>
+            <w:tcMar>
+              <w:top w:type="dxa" w:w="25"/>
+              <w:left w:type="dxa" w:w="70"/>
+              <w:bottom w:type="dxa" w:w="25"/>
+              <w:right w:type="dxa" w:w="70"/>
+            </w:tcMar>
+          </w:tcPr>
+          <w:p>
+            <w:r>
+              <w:rPr>
+                <w:rFonts w:ascii="Malgun Gothic" w:cs="Malgun Gothic" w:eastAsia="Malgun Gothic" w:hAnsi="Malgun Gothic"/>
+                <w:b w:val="false"/>
+                <w:bCs w:val="false"/>
+                <w:sz w:val="15"/>
+                <w:szCs w:val="15"/>
+              </w:rPr>
+              <w:t xml:space="preserve">1.08 [0.79, 1.46] † ‡</w:t>
             </w:r>
           </w:p>
         </w:tc>
@@ -5204,7 +5751,6 @@
     </w:p>
     <w:p>
       <w:pPr>
-        <w:pStyle w:val="Heading1"/>
         <w:spacing w:after="100" w:before="200"/>
       </w:pPr>
       <w:r>
@@ -5212,6 +5758,7 @@
           <w:rFonts w:ascii="Malgun Gothic" w:cs="Malgun Gothic" w:eastAsia="Malgun Gothic" w:hAnsi="Malgun Gothic"/>
           <w:b/>
           <w:bCs/>
+          <w:color w:val="000000"/>
           <w:sz w:val="24"/>
           <w:szCs w:val="24"/>
         </w:rPr>
@@ -5275,7 +5822,6 @@
     </w:p>
     <w:p>
       <w:pPr>
-        <w:pStyle w:val="Heading1"/>
         <w:spacing w:after="100" w:before="200"/>
       </w:pPr>
       <w:r>
@@ -5283,6 +5829,7 @@
           <w:rFonts w:ascii="Malgun Gothic" w:cs="Malgun Gothic" w:eastAsia="Malgun Gothic" w:hAnsi="Malgun Gothic"/>
           <w:b/>
           <w:bCs/>
+          <w:color w:val="000000"/>
           <w:sz w:val="24"/>
           <w:szCs w:val="24"/>
         </w:rPr>
@@ -5346,7 +5893,6 @@
     </w:p>
     <w:p>
       <w:pPr>
-        <w:pStyle w:val="Heading1"/>
         <w:spacing w:after="100" w:before="200"/>
       </w:pPr>
       <w:r>
@@ -5354,6 +5900,7 @@
           <w:rFonts w:ascii="Malgun Gothic" w:cs="Malgun Gothic" w:eastAsia="Malgun Gothic" w:hAnsi="Malgun Gothic"/>
           <w:b/>
           <w:bCs/>
+          <w:color w:val="000000"/>
           <w:sz w:val="24"/>
           <w:szCs w:val="24"/>
         </w:rPr>

</xml_diff>

<commit_message>
Feedback4 item 8: move above-table descriptions to Notes; fix 'contemporary benchmark'
- Main-text Table 1: description moved below the table as a trimmed Note
  (analysis method, comparator, symbols †/‡, abbreviations only); drop the
  'contemporary benchmark' phrasing and add the ‡ computed-CI explanation.
- Supplementary Tables 1, 2, 5: above-table blurbs relocated to a below-table
  Note; Methods-duplicating text reduced.
- Supplementary Table 6a/6c: sub-captions trimmed to the restriction and cell
  counts, with the interpretive clauses left to Results/Discussion.
- Regenerated manifests, rebuilt all three docx, crosscheck A–G all pass.

Co-Authored-By: Claude Opus 4.8 <noreply@anthropic.com>
Claude-Session: https://claude.ai/code/session_01CuLT4FKRBtsU22Vwfjj2qn
</commit_message>
<xml_diff>
--- a/meta_agents/search_v2/outputs/Main_Text_Tables_Figures.docx
+++ b/meta_agents/search_v2/outputs/Main_Text_Tables_Figures.docx
@@ -48,21 +48,6 @@
         <w:t xml:space="preserve">Table 1. Incidence rate ratios of invasive breast cancer among U.S. racial and ethnic groups relative to non-Hispanic White women, by analytic dimension</w:t>
       </w:r>
     </w:p>
-    <w:p>
-      <w:pPr>
-        <w:spacing w:after="80"/>
-      </w:pPr>
-      <w:r>
-        <w:rPr>
-          <w:rFonts w:ascii="Malgun Gothic" w:cs="Malgun Gothic" w:eastAsia="Malgun Gothic" w:hAnsi="Malgun Gothic"/>
-          <w:i/>
-          <w:iCs/>
-          <w:sz w:val="18"/>
-          <w:szCs w:val="18"/>
-        </w:rPr>
-        <w:t xml:space="preserve">Each value is a representative population-based estimate (a contemporary benchmark) for the group — the most recent, broadest-coverage registry estimate with an appropriate population definition and standardization — not a meta-analytic pooled estimate; one estimate is shown per registry family. Effect measure is the incidence rate ratio (IRR) unless noted as a standardized incidence ratio (SIR). Comparisons are versus non-Hispanic White (NHW) women, except where marked † — the reference in that study was an unstratified White group (not stratified by Hispanic origin), which may raise the IRR slightly; these estimates are examined in the NHW-comparator sensitivity analysis (Supplementary Table 6c). Black denotes non-Hispanic Black (NHB), and the Asian/Pacific Islander aggregate is labeled AANHPI (Asian American, Native Hawaiian, and Pacific Islander), with the Pacific-Islander subset shown separately as NHPI. RoB = risk-of-bias rating of the representative study. Full per-estimate detail, including each study's comparator and standard population, is in the Supplementary Materials.</w:t>
-      </w:r>
-    </w:p>
     <w:tbl>
       <w:tblPr>
         <w:tblW w:type="dxa" w:w="14400"/>
@@ -5733,6 +5718,21 @@
       <w:pPr>
         <w:spacing w:after="80"/>
       </w:pPr>
+    </w:p>
+    <w:p>
+      <w:pPr>
+        <w:spacing w:after="80"/>
+      </w:pPr>
+      <w:r>
+        <w:rPr>
+          <w:rFonts w:ascii="Malgun Gothic" w:cs="Malgun Gothic" w:eastAsia="Malgun Gothic" w:hAnsi="Malgun Gothic"/>
+          <w:i/>
+          <w:iCs/>
+          <w:sz w:val="18"/>
+          <w:szCs w:val="18"/>
+        </w:rPr>
+        <w:t xml:space="preserve">Note. Each cell shows one representative population-based estimate — the most recent, broadest-coverage registry estimate per registry family — not a pooled estimate; the selection rule and its robustness are given in the Methods and Supplementary Table 6. The effect measure is the incidence rate ratio (IRR) unless marked as a standardized incidence ratio (SIR); comparisons are versus non-Hispanic White (NHW) women. † the study's reference was an unstratified White group (not stratified by Hispanic origin), examined in the NHW-comparator sensitivity analysis (Supplementary Table 6c). ‡ the 95% confidence interval was computed by the reviewers from published rates rather than reported in the source. NHB, non-Hispanic Black; AANHPI, Asian American, Native Hawaiian, and Pacific Islander (NHPI, the Pacific Islander subset, shown separately); RoB, risk-of-bias rating of the representative study. Full per-estimate detail is in the Supplementary Materials.</w:t>
+      </w:r>
     </w:p>
     <w:p>
       <w:r>

</xml_diff>